<commit_message>
Until Arrays functions and map and filer etc.
</commit_message>
<xml_diff>
--- a/Interview prep/JavaScript Notes.docx
+++ b/Interview prep/JavaScript Notes.docx
@@ -596,6 +596,7 @@
     </w:p>
     <w:p>
       <w:pPr>
+        <w:jc w:val="center"/>
         <w:rPr>
           <w:b/>
           <w:bCs/>
@@ -1807,6 +1808,7 @@
     </w:p>
     <w:p>
       <w:pPr>
+        <w:jc w:val="center"/>
         <w:rPr>
           <w:b/>
           <w:bCs/>
@@ -3423,6 +3425,7 @@
     </w:p>
     <w:p>
       <w:pPr>
+        <w:jc w:val="center"/>
         <w:rPr>
           <w:b/>
           <w:bCs/>
@@ -3677,6 +3680,7 @@
     </w:p>
     <w:p>
       <w:pPr>
+        <w:jc w:val="center"/>
         <w:rPr>
           <w:b/>
           <w:bCs/>
@@ -4960,6 +4964,7 @@
       </w:pPr>
       <w:r>
         <w:rPr>
+          <w:noProof/>
           <w:sz w:val="24"/>
           <w:szCs w:val="24"/>
         </w:rPr>
@@ -5021,6 +5026,7 @@
       </w:r>
       <w:r>
         <w:rPr>
+          <w:noProof/>
           <w:sz w:val="24"/>
           <w:szCs w:val="24"/>
         </w:rPr>
@@ -5261,6 +5267,7 @@
       </w:pPr>
       <w:r>
         <w:rPr>
+          <w:noProof/>
           <w:sz w:val="24"/>
           <w:szCs w:val="24"/>
         </w:rPr>
@@ -5323,6 +5330,7 @@
       </w:r>
       <w:r>
         <w:rPr>
+          <w:noProof/>
           <w:sz w:val="24"/>
           <w:szCs w:val="24"/>
         </w:rPr>
@@ -6747,6 +6755,7 @@
       </w:pPr>
       <w:r>
         <w:rPr>
+          <w:noProof/>
           <w:sz w:val="24"/>
           <w:szCs w:val="24"/>
         </w:rPr>
@@ -8076,46 +8085,19 @@
           <w:sz w:val="24"/>
           <w:szCs w:val="24"/>
         </w:rPr>
-        <w:t>condition?</w:t>
-      </w:r>
-      <w:r>
-        <w:rPr>
-          <w:sz w:val="24"/>
-          <w:szCs w:val="24"/>
-        </w:rPr>
-        <w:t xml:space="preserve"> </w:t>
-      </w:r>
-      <w:r>
-        <w:rPr>
-          <w:sz w:val="24"/>
-          <w:szCs w:val="24"/>
-        </w:rPr>
-        <w:t>trueValue:</w:t>
-      </w:r>
-      <w:r>
-        <w:rPr>
-          <w:sz w:val="24"/>
-          <w:szCs w:val="24"/>
-        </w:rPr>
-        <w:t xml:space="preserve"> </w:t>
-      </w:r>
-      <w:r>
-        <w:rPr>
-          <w:sz w:val="24"/>
-          <w:szCs w:val="24"/>
-        </w:rPr>
-        <w:t>falseValue</w:t>
-      </w:r>
-    </w:p>
-    <w:p>
-      <w:pPr>
-        <w:rPr>
-          <w:sz w:val="24"/>
-          <w:szCs w:val="24"/>
-        </w:rPr>
-      </w:pPr>
-      <w:r>
-        <w:rPr>
+        <w:t>condition? trueValue: falseValue</w:t>
+      </w:r>
+    </w:p>
+    <w:p>
+      <w:pPr>
+        <w:rPr>
+          <w:sz w:val="24"/>
+          <w:szCs w:val="24"/>
+        </w:rPr>
+      </w:pPr>
+      <w:r>
+        <w:rPr>
+          <w:noProof/>
           <w:sz w:val="24"/>
           <w:szCs w:val="24"/>
         </w:rPr>
@@ -8194,21 +8176,7 @@
           <w:sz w:val="24"/>
           <w:szCs w:val="24"/>
         </w:rPr>
-        <w:t xml:space="preserve">(Strictly </w:t>
-      </w:r>
-      <w:r>
-        <w:rPr>
-          <w:sz w:val="24"/>
-          <w:szCs w:val="24"/>
-        </w:rPr>
-        <w:t>equals to</w:t>
-      </w:r>
-      <w:r>
-        <w:rPr>
-          <w:sz w:val="24"/>
-          <w:szCs w:val="24"/>
-        </w:rPr>
-        <w:t xml:space="preserve">) </w:t>
+        <w:t xml:space="preserve">(Strictly equals to) </w:t>
       </w:r>
       <w:r>
         <w:rPr>
@@ -8425,6 +8393,7 @@
         <w:rPr>
           <w:b/>
           <w:bCs/>
+          <w:noProof/>
           <w:sz w:val="24"/>
           <w:szCs w:val="24"/>
         </w:rPr>
@@ -8488,6 +8457,7 @@
         <w:rPr>
           <w:b/>
           <w:bCs/>
+          <w:noProof/>
           <w:sz w:val="24"/>
           <w:szCs w:val="24"/>
         </w:rPr>
@@ -8551,6 +8521,7 @@
         <w:rPr>
           <w:b/>
           <w:bCs/>
+          <w:noProof/>
           <w:sz w:val="24"/>
           <w:szCs w:val="24"/>
         </w:rPr>
@@ -8741,6 +8712,7 @@
       </w:pPr>
       <w:r>
         <w:rPr>
+          <w:noProof/>
           <w:sz w:val="24"/>
           <w:szCs w:val="24"/>
         </w:rPr>
@@ -10121,6 +10093,7 @@
       </w:pPr>
       <w:r>
         <w:rPr>
+          <w:noProof/>
           <w:sz w:val="24"/>
           <w:szCs w:val="24"/>
         </w:rPr>
@@ -10351,16 +10324,7 @@
           <w:sz w:val="24"/>
           <w:szCs w:val="24"/>
         </w:rPr>
-        <w:t>When to Use Arrow Functions</w:t>
-      </w:r>
-      <w:r>
-        <w:rPr>
-          <w:b/>
-          <w:bCs/>
-          <w:sz w:val="24"/>
-          <w:szCs w:val="24"/>
-        </w:rPr>
-        <w:t>?</w:t>
+        <w:t>When to Use Arrow Functions?</w:t>
       </w:r>
     </w:p>
     <w:p>
@@ -10474,16 +10438,7 @@
           <w:sz w:val="24"/>
           <w:szCs w:val="24"/>
         </w:rPr>
-        <w:t>When NOT to Use Arrow Functions</w:t>
-      </w:r>
-      <w:r>
-        <w:rPr>
-          <w:b/>
-          <w:bCs/>
-          <w:sz w:val="24"/>
-          <w:szCs w:val="24"/>
-        </w:rPr>
-        <w:t>?</w:t>
+        <w:t>When NOT to Use Arrow Functions?</w:t>
       </w:r>
     </w:p>
     <w:p>
@@ -10649,12 +10604,6 @@
           <w:szCs w:val="24"/>
         </w:rPr>
         <w:br/>
-      </w:r>
-      <w:r>
-        <w:rPr>
-          <w:sz w:val="24"/>
-          <w:szCs w:val="24"/>
-        </w:rPr>
         <w:t>const functionName = () =&gt; {};</w:t>
       </w:r>
     </w:p>
@@ -10820,20 +10769,7 @@
           <w:szCs w:val="24"/>
         </w:rPr>
         <w:br/>
-      </w:r>
-      <w:r>
-        <w:rPr>
-          <w:sz w:val="24"/>
-          <w:szCs w:val="24"/>
-        </w:rPr>
-        <w:t>console.log (multiply (</w:t>
-      </w:r>
-      <w:r>
-        <w:rPr>
-          <w:sz w:val="24"/>
-          <w:szCs w:val="24"/>
-        </w:rPr>
-        <w:t>5, 4));</w:t>
+        <w:t>console.log (multiply (5, 4));</w:t>
       </w:r>
     </w:p>
     <w:p>
@@ -10980,21 +10916,7 @@
           <w:sz w:val="24"/>
           <w:szCs w:val="24"/>
         </w:rPr>
-        <w:t xml:space="preserve">    </w:t>
-      </w:r>
-      <w:r>
-        <w:rPr>
-          <w:sz w:val="24"/>
-          <w:szCs w:val="24"/>
-        </w:rPr>
-        <w:t>console.log (</w:t>
-      </w:r>
-      <w:r>
-        <w:rPr>
-          <w:sz w:val="24"/>
-          <w:szCs w:val="24"/>
-        </w:rPr>
-        <w:t>"Hello " + name);</w:t>
+        <w:t xml:space="preserve">    console.log ("Hello " + name);</w:t>
       </w:r>
     </w:p>
     <w:p>
@@ -11026,14 +10948,7 @@
           <w:sz w:val="24"/>
           <w:szCs w:val="24"/>
         </w:rPr>
-        <w:t>greet (</w:t>
-      </w:r>
-      <w:r>
-        <w:rPr>
-          <w:sz w:val="24"/>
-          <w:szCs w:val="24"/>
-        </w:rPr>
-        <w:t>);</w:t>
+        <w:t>greet ();</w:t>
       </w:r>
     </w:p>
     <w:p>
@@ -11207,6 +11122,7 @@
     </w:p>
     <w:p>
       <w:pPr>
+        <w:jc w:val="center"/>
         <w:rPr>
           <w:b/>
           <w:bCs/>
@@ -11683,14 +11599,7 @@
                 <w:sz w:val="24"/>
                 <w:szCs w:val="24"/>
               </w:rPr>
-              <w:t>forEach (</w:t>
-            </w:r>
-            <w:r>
-              <w:rPr>
-                <w:sz w:val="24"/>
-                <w:szCs w:val="24"/>
-              </w:rPr>
-              <w:t>)</w:t>
+              <w:t>forEach ()</w:t>
             </w:r>
           </w:p>
         </w:tc>
@@ -11761,7 +11670,14 @@
           <w:sz w:val="24"/>
           <w:szCs w:val="24"/>
         </w:rPr>
-        <w:t>Most commonly used loop.</w:t>
+        <w:t xml:space="preserve">Most commonly used loop. Syntax </w:t>
+      </w:r>
+      <w:r>
+        <w:rPr>
+          <w:sz w:val="24"/>
+          <w:szCs w:val="24"/>
+        </w:rPr>
+        <w:t>–</w:t>
       </w:r>
       <w:r>
         <w:rPr>
@@ -11775,60 +11691,19 @@
           <w:sz w:val="24"/>
           <w:szCs w:val="24"/>
         </w:rPr>
-        <w:t>Syntax</w:t>
-      </w:r>
-      <w:r>
-        <w:rPr>
-          <w:sz w:val="24"/>
-          <w:szCs w:val="24"/>
-        </w:rPr>
-        <w:t xml:space="preserve"> </w:t>
-      </w:r>
-      <w:r>
-        <w:rPr>
-          <w:sz w:val="24"/>
-          <w:szCs w:val="24"/>
-        </w:rPr>
-        <w:t>–</w:t>
-      </w:r>
-      <w:r>
-        <w:rPr>
-          <w:sz w:val="24"/>
-          <w:szCs w:val="24"/>
-        </w:rPr>
-        <w:t xml:space="preserve"> </w:t>
-      </w:r>
-      <w:r>
-        <w:rPr>
-          <w:sz w:val="24"/>
-          <w:szCs w:val="24"/>
-        </w:rPr>
-        <w:t>for</w:t>
-      </w:r>
-      <w:r>
-        <w:rPr>
-          <w:sz w:val="24"/>
-          <w:szCs w:val="24"/>
-        </w:rPr>
-        <w:t xml:space="preserve"> </w:t>
-      </w:r>
-      <w:r>
-        <w:rPr>
-          <w:sz w:val="24"/>
-          <w:szCs w:val="24"/>
-        </w:rPr>
-        <w:t>(initialization; condition; increment/decrement) {}</w:t>
-      </w:r>
-    </w:p>
-    <w:p>
-      <w:pPr>
-        <w:rPr>
-          <w:sz w:val="24"/>
-          <w:szCs w:val="24"/>
-        </w:rPr>
-      </w:pPr>
-      <w:r>
-        <w:rPr>
+        <w:t>for (initialization; condition; increment/decrement) {}</w:t>
+      </w:r>
+    </w:p>
+    <w:p>
+      <w:pPr>
+        <w:rPr>
+          <w:sz w:val="24"/>
+          <w:szCs w:val="24"/>
+        </w:rPr>
+      </w:pPr>
+      <w:r>
+        <w:rPr>
+          <w:noProof/>
           <w:sz w:val="24"/>
           <w:szCs w:val="24"/>
         </w:rPr>
@@ -11895,6 +11770,7 @@
       </w:r>
       <w:r>
         <w:rPr>
+          <w:noProof/>
           <w:sz w:val="24"/>
           <w:szCs w:val="24"/>
         </w:rPr>
@@ -12183,58 +12059,23 @@
           <w:sz w:val="24"/>
           <w:szCs w:val="24"/>
         </w:rPr>
-        <w:t>array.</w:t>
-      </w:r>
-      <w:r>
+        <w:t>array. forEach ((value, index) =&gt; {});</w:t>
+      </w:r>
+    </w:p>
+    <w:p>
+      <w:pPr>
         <w:rPr>
           <w:b/>
           <w:bCs/>
           <w:sz w:val="24"/>
           <w:szCs w:val="24"/>
         </w:rPr>
-        <w:t xml:space="preserve"> </w:t>
-      </w:r>
+      </w:pPr>
       <w:r>
         <w:rPr>
           <w:b/>
           <w:bCs/>
-          <w:sz w:val="24"/>
-          <w:szCs w:val="24"/>
-        </w:rPr>
-        <w:t>forEach</w:t>
-      </w:r>
-      <w:r>
-        <w:rPr>
-          <w:b/>
-          <w:bCs/>
-          <w:sz w:val="24"/>
-          <w:szCs w:val="24"/>
-        </w:rPr>
-        <w:t xml:space="preserve"> </w:t>
-      </w:r>
-      <w:r>
-        <w:rPr>
-          <w:b/>
-          <w:bCs/>
-          <w:sz w:val="24"/>
-          <w:szCs w:val="24"/>
-        </w:rPr>
-        <w:t>((value, index) =&gt; {});</w:t>
-      </w:r>
-    </w:p>
-    <w:p>
-      <w:pPr>
-        <w:rPr>
-          <w:b/>
-          <w:bCs/>
-          <w:sz w:val="24"/>
-          <w:szCs w:val="24"/>
-        </w:rPr>
-      </w:pPr>
-      <w:r>
-        <w:rPr>
-          <w:b/>
-          <w:bCs/>
+          <w:noProof/>
           <w:sz w:val="24"/>
           <w:szCs w:val="24"/>
         </w:rPr>
@@ -12318,11 +12159,12 @@
         <w:rPr>
           <w:b/>
           <w:bCs/>
+          <w:noProof/>
           <w:sz w:val="24"/>
           <w:szCs w:val="24"/>
         </w:rPr>
         <w:drawing>
-          <wp:anchor distT="0" distB="0" distL="114300" distR="114300" simplePos="0" relativeHeight="251669504" behindDoc="1" locked="0" layoutInCell="1" allowOverlap="1" wp14:anchorId="550DC1DB" wp14:editId="723FED73">
+          <wp:anchor distT="0" distB="0" distL="114300" distR="114300" simplePos="0" relativeHeight="251669504" behindDoc="1" locked="0" layoutInCell="1" allowOverlap="1" wp14:anchorId="550DC1DB" wp14:editId="17434AFE">
             <wp:simplePos x="0" y="0"/>
             <wp:positionH relativeFrom="column">
               <wp:posOffset>4500563</wp:posOffset>
@@ -12471,6 +12313,7 @@
     </w:p>
     <w:p>
       <w:pPr>
+        <w:jc w:val="center"/>
         <w:rPr>
           <w:b/>
           <w:bCs/>
@@ -12609,49 +12452,14 @@
           <w:sz w:val="24"/>
           <w:szCs w:val="24"/>
         </w:rPr>
-        <w:t>m</w:t>
-      </w:r>
-      <w:r>
-        <w:rPr>
-          <w:sz w:val="24"/>
-          <w:szCs w:val="24"/>
-        </w:rPr>
-        <w:t>ap</w:t>
-      </w:r>
-      <w:r>
-        <w:rPr>
-          <w:sz w:val="24"/>
-          <w:szCs w:val="24"/>
-        </w:rPr>
-        <w:t xml:space="preserve"> </w:t>
-      </w:r>
-      <w:r>
-        <w:rPr>
-          <w:sz w:val="24"/>
-          <w:szCs w:val="24"/>
-        </w:rPr>
-        <w:t>()</w:t>
-      </w:r>
-      <w:r>
-        <w:rPr>
-          <w:sz w:val="24"/>
-          <w:szCs w:val="24"/>
-        </w:rPr>
-        <w:t xml:space="preserve"> -&gt; </w:t>
-      </w:r>
-      <w:r>
-        <w:rPr>
-          <w:sz w:val="24"/>
-          <w:szCs w:val="24"/>
-        </w:rPr>
-        <w:t>Modify/Transform</w:t>
-      </w:r>
-      <w:r>
-        <w:rPr>
-          <w:sz w:val="24"/>
-          <w:szCs w:val="24"/>
-        </w:rPr>
-        <w:t xml:space="preserve"> </w:t>
+        <w:t xml:space="preserve">map () -&gt; </w:t>
+      </w:r>
+      <w:r>
+        <w:rPr>
+          <w:sz w:val="24"/>
+          <w:szCs w:val="24"/>
+        </w:rPr>
+        <w:t xml:space="preserve">Modify/Transform </w:t>
       </w:r>
     </w:p>
     <w:p>
@@ -12671,35 +12479,7 @@
           <w:sz w:val="24"/>
           <w:szCs w:val="24"/>
         </w:rPr>
-        <w:t>filter</w:t>
-      </w:r>
-      <w:r>
-        <w:rPr>
-          <w:sz w:val="24"/>
-          <w:szCs w:val="24"/>
-        </w:rPr>
-        <w:t xml:space="preserve"> </w:t>
-      </w:r>
-      <w:r>
-        <w:rPr>
-          <w:sz w:val="24"/>
-          <w:szCs w:val="24"/>
-        </w:rPr>
-        <w:t>()</w:t>
-      </w:r>
-      <w:r>
-        <w:rPr>
-          <w:sz w:val="24"/>
-          <w:szCs w:val="24"/>
-        </w:rPr>
-        <w:t xml:space="preserve"> -&gt; </w:t>
-      </w:r>
-      <w:r>
-        <w:rPr>
-          <w:sz w:val="24"/>
-          <w:szCs w:val="24"/>
-        </w:rPr>
-        <w:t>Select/Filter</w:t>
+        <w:t>filter () -&gt; Select/Filter</w:t>
       </w:r>
     </w:p>
     <w:p>
@@ -13111,11 +12891,12 @@
       </w:pPr>
       <w:r>
         <w:rPr>
+          <w:noProof/>
           <w:sz w:val="24"/>
           <w:szCs w:val="24"/>
         </w:rPr>
         <w:drawing>
-          <wp:anchor distT="0" distB="0" distL="114300" distR="114300" simplePos="0" relativeHeight="251671552" behindDoc="1" locked="0" layoutInCell="1" allowOverlap="1" wp14:anchorId="280F6B0D" wp14:editId="36241A77">
+          <wp:anchor distT="0" distB="0" distL="114300" distR="114300" simplePos="0" relativeHeight="251671552" behindDoc="1" locked="0" layoutInCell="1" allowOverlap="1" wp14:anchorId="280F6B0D" wp14:editId="0ED833AE">
             <wp:simplePos x="0" y="0"/>
             <wp:positionH relativeFrom="margin">
               <wp:posOffset>4129088</wp:posOffset>
@@ -13172,11 +12953,12 @@
       </w:r>
       <w:r>
         <w:rPr>
+          <w:noProof/>
           <w:sz w:val="24"/>
           <w:szCs w:val="24"/>
         </w:rPr>
         <w:drawing>
-          <wp:anchor distT="0" distB="0" distL="114300" distR="114300" simplePos="0" relativeHeight="251670528" behindDoc="0" locked="0" layoutInCell="1" allowOverlap="1" wp14:anchorId="399410B9" wp14:editId="256F33D4">
+          <wp:anchor distT="0" distB="0" distL="114300" distR="114300" simplePos="0" relativeHeight="251670528" behindDoc="0" locked="0" layoutInCell="1" allowOverlap="1" wp14:anchorId="399410B9" wp14:editId="75E28A15">
             <wp:simplePos x="0" y="0"/>
             <wp:positionH relativeFrom="margin">
               <wp:posOffset>-9525</wp:posOffset>
@@ -13321,43 +13103,7 @@
           <w:szCs w:val="24"/>
         </w:rPr>
         <w:lastRenderedPageBreak/>
-        <w:t>Difference Between forEach</w:t>
-      </w:r>
-      <w:r>
-        <w:rPr>
-          <w:b/>
-          <w:bCs/>
-          <w:sz w:val="24"/>
-          <w:szCs w:val="24"/>
-        </w:rPr>
-        <w:t xml:space="preserve"> </w:t>
-      </w:r>
-      <w:r>
-        <w:rPr>
-          <w:b/>
-          <w:bCs/>
-          <w:sz w:val="24"/>
-          <w:szCs w:val="24"/>
-        </w:rPr>
-        <w:t>() and map</w:t>
-      </w:r>
-      <w:r>
-        <w:rPr>
-          <w:b/>
-          <w:bCs/>
-          <w:sz w:val="24"/>
-          <w:szCs w:val="24"/>
-        </w:rPr>
-        <w:t xml:space="preserve"> </w:t>
-      </w:r>
-      <w:r>
-        <w:rPr>
-          <w:b/>
-          <w:bCs/>
-          <w:sz w:val="24"/>
-          <w:szCs w:val="24"/>
-        </w:rPr>
-        <w:t>() in JavaScript</w:t>
+        <w:t>Difference Between forEach () and map () in JavaScript</w:t>
       </w:r>
     </w:p>
     <w:p>
@@ -13773,12 +13519,19 @@
     <w:p>
       <w:pPr>
         <w:rPr>
+          <w:sz w:val="24"/>
+          <w:szCs w:val="24"/>
+        </w:rPr>
+      </w:pPr>
+      <w:r>
+        <w:rPr>
           <w:b/>
           <w:bCs/>
           <w:sz w:val="24"/>
           <w:szCs w:val="24"/>
         </w:rPr>
-      </w:pPr>
+        <w:t>Includes</w:t>
+      </w:r>
       <w:r>
         <w:rPr>
           <w:b/>
@@ -13786,7 +13539,7 @@
           <w:sz w:val="24"/>
           <w:szCs w:val="24"/>
         </w:rPr>
-        <w:t>I</w:t>
+        <w:t xml:space="preserve"> </w:t>
       </w:r>
       <w:r>
         <w:rPr>
@@ -13795,7 +13548,7 @@
           <w:sz w:val="24"/>
           <w:szCs w:val="24"/>
         </w:rPr>
-        <w:t>ncludes</w:t>
+        <w:t>()</w:t>
       </w:r>
       <w:r>
         <w:rPr>
@@ -13804,23 +13557,784 @@
           <w:sz w:val="24"/>
           <w:szCs w:val="24"/>
         </w:rPr>
-        <w:t xml:space="preserve"> </w:t>
-      </w:r>
-      <w:r>
+        <w:t xml:space="preserve"> - </w:t>
+      </w:r>
+      <w:r>
+        <w:rPr>
+          <w:sz w:val="24"/>
+          <w:szCs w:val="24"/>
+        </w:rPr>
+        <w:t>Used to check whether a value exists inside an array.</w:t>
+      </w:r>
+    </w:p>
+    <w:p>
+      <w:pPr>
+        <w:jc w:val="center"/>
         <w:rPr>
           <w:b/>
           <w:bCs/>
           <w:sz w:val="24"/>
           <w:szCs w:val="24"/>
-        </w:rPr>
-        <w:t>()</w:t>
-      </w:r>
+          <w:u w:val="single"/>
+        </w:rPr>
+      </w:pPr>
       <w:r>
         <w:rPr>
           <w:b/>
           <w:bCs/>
           <w:sz w:val="24"/>
           <w:szCs w:val="24"/>
+          <w:u w:val="single"/>
+        </w:rPr>
+        <w:t>DOM (Document Object Model) in JavaScript:</w:t>
+      </w:r>
+    </w:p>
+    <w:p>
+      <w:pPr>
+        <w:rPr>
+          <w:sz w:val="24"/>
+          <w:szCs w:val="24"/>
+        </w:rPr>
+      </w:pPr>
+      <w:r>
+        <w:rPr>
+          <w:sz w:val="24"/>
+          <w:szCs w:val="24"/>
+        </w:rPr>
+        <w:t>DOM stands for Document Object Model. It is a programming interface that allows JavaScript to access, modify, and manipulate HTML elements dynamically.</w:t>
+      </w:r>
+    </w:p>
+    <w:p>
+      <w:pPr>
+        <w:rPr>
+          <w:sz w:val="24"/>
+          <w:szCs w:val="24"/>
+        </w:rPr>
+      </w:pPr>
+      <w:r>
+        <w:rPr>
+          <w:sz w:val="24"/>
+          <w:szCs w:val="24"/>
+        </w:rPr>
+        <w:t>Without DOM:</w:t>
+      </w:r>
+      <w:r>
+        <w:rPr>
+          <w:sz w:val="24"/>
+          <w:szCs w:val="24"/>
+        </w:rPr>
+        <w:tab/>
+      </w:r>
+      <w:r>
+        <w:rPr>
+          <w:sz w:val="24"/>
+          <w:szCs w:val="24"/>
+        </w:rPr>
+        <w:tab/>
+      </w:r>
+      <w:r>
+        <w:rPr>
+          <w:sz w:val="24"/>
+          <w:szCs w:val="24"/>
+        </w:rPr>
+        <w:tab/>
+      </w:r>
+      <w:r>
+        <w:rPr>
+          <w:sz w:val="24"/>
+          <w:szCs w:val="24"/>
+        </w:rPr>
+        <w:tab/>
+      </w:r>
+      <w:r>
+        <w:rPr>
+          <w:sz w:val="24"/>
+          <w:szCs w:val="24"/>
+        </w:rPr>
+        <w:tab/>
+      </w:r>
+      <w:r>
+        <w:rPr>
+          <w:sz w:val="24"/>
+          <w:szCs w:val="24"/>
+        </w:rPr>
+        <w:tab/>
+      </w:r>
+      <w:r>
+        <w:rPr>
+          <w:sz w:val="24"/>
+          <w:szCs w:val="24"/>
+        </w:rPr>
+        <w:tab/>
+      </w:r>
+      <w:r>
+        <w:rPr>
+          <w:sz w:val="24"/>
+          <w:szCs w:val="24"/>
+        </w:rPr>
+        <w:t>With DOM:</w:t>
+      </w:r>
+    </w:p>
+    <w:p>
+      <w:pPr>
+        <w:pStyle w:val="ListParagraph"/>
+        <w:numPr>
+          <w:ilvl w:val="0"/>
+          <w:numId w:val="11"/>
+        </w:numPr>
+        <w:rPr>
+          <w:sz w:val="24"/>
+          <w:szCs w:val="24"/>
+        </w:rPr>
+      </w:pPr>
+      <w:r>
+        <w:rPr>
+          <w:sz w:val="24"/>
+          <w:szCs w:val="24"/>
+        </w:rPr>
+        <w:t>HTML remains static.</w:t>
+      </w:r>
+      <w:r>
+        <w:rPr>
+          <w:sz w:val="24"/>
+          <w:szCs w:val="24"/>
+        </w:rPr>
+        <w:tab/>
+      </w:r>
+      <w:r>
+        <w:rPr>
+          <w:sz w:val="24"/>
+          <w:szCs w:val="24"/>
+        </w:rPr>
+        <w:tab/>
+      </w:r>
+      <w:r>
+        <w:rPr>
+          <w:sz w:val="24"/>
+          <w:szCs w:val="24"/>
+        </w:rPr>
+        <w:tab/>
+      </w:r>
+      <w:r>
+        <w:rPr>
+          <w:sz w:val="24"/>
+          <w:szCs w:val="24"/>
+        </w:rPr>
+        <w:tab/>
+      </w:r>
+      <w:r>
+        <w:rPr>
+          <w:sz w:val="24"/>
+          <w:szCs w:val="24"/>
+        </w:rPr>
+        <w:tab/>
+      </w:r>
+      <w:r>
+        <w:rPr>
+          <w:sz w:val="24"/>
+          <w:szCs w:val="24"/>
+        </w:rPr>
+        <w:t>Change text</w:t>
+      </w:r>
+    </w:p>
+    <w:p>
+      <w:pPr>
+        <w:pStyle w:val="ListParagraph"/>
+        <w:numPr>
+          <w:ilvl w:val="0"/>
+          <w:numId w:val="11"/>
+        </w:numPr>
+        <w:rPr>
+          <w:sz w:val="24"/>
+          <w:szCs w:val="24"/>
+        </w:rPr>
+      </w:pPr>
+      <w:r>
+        <w:rPr>
+          <w:sz w:val="24"/>
+          <w:szCs w:val="24"/>
+        </w:rPr>
+        <w:t>JavaScript cannot interact with HTML</w:t>
+      </w:r>
+      <w:r>
+        <w:rPr>
+          <w:sz w:val="24"/>
+          <w:szCs w:val="24"/>
+        </w:rPr>
+        <w:tab/>
+      </w:r>
+      <w:r>
+        <w:rPr>
+          <w:sz w:val="24"/>
+          <w:szCs w:val="24"/>
+        </w:rPr>
+        <w:tab/>
+      </w:r>
+      <w:r>
+        <w:rPr>
+          <w:sz w:val="24"/>
+          <w:szCs w:val="24"/>
+        </w:rPr>
+        <w:t>Change colours</w:t>
+      </w:r>
+    </w:p>
+    <w:p>
+      <w:pPr>
+        <w:pStyle w:val="ListParagraph"/>
+        <w:numPr>
+          <w:ilvl w:val="0"/>
+          <w:numId w:val="11"/>
+        </w:numPr>
+        <w:rPr>
+          <w:sz w:val="24"/>
+          <w:szCs w:val="24"/>
+        </w:rPr>
+      </w:pPr>
+      <w:r>
+        <w:rPr>
+          <w:sz w:val="24"/>
+          <w:szCs w:val="24"/>
+        </w:rPr>
+        <w:t>No button clicks</w:t>
+      </w:r>
+      <w:r>
+        <w:rPr>
+          <w:sz w:val="24"/>
+          <w:szCs w:val="24"/>
+        </w:rPr>
+        <w:tab/>
+      </w:r>
+      <w:r>
+        <w:rPr>
+          <w:sz w:val="24"/>
+          <w:szCs w:val="24"/>
+        </w:rPr>
+        <w:tab/>
+      </w:r>
+      <w:r>
+        <w:rPr>
+          <w:sz w:val="24"/>
+          <w:szCs w:val="24"/>
+        </w:rPr>
+        <w:tab/>
+      </w:r>
+      <w:r>
+        <w:rPr>
+          <w:sz w:val="24"/>
+          <w:szCs w:val="24"/>
+        </w:rPr>
+        <w:tab/>
+      </w:r>
+      <w:r>
+        <w:rPr>
+          <w:sz w:val="24"/>
+          <w:szCs w:val="24"/>
+        </w:rPr>
+        <w:tab/>
+      </w:r>
+      <w:r>
+        <w:rPr>
+          <w:sz w:val="24"/>
+          <w:szCs w:val="24"/>
+        </w:rPr>
+        <w:t>Hide/show elements</w:t>
+      </w:r>
+    </w:p>
+    <w:p>
+      <w:pPr>
+        <w:pStyle w:val="ListParagraph"/>
+        <w:numPr>
+          <w:ilvl w:val="0"/>
+          <w:numId w:val="11"/>
+        </w:numPr>
+        <w:rPr>
+          <w:sz w:val="24"/>
+          <w:szCs w:val="24"/>
+        </w:rPr>
+      </w:pPr>
+      <w:r>
+        <w:rPr>
+          <w:sz w:val="24"/>
+          <w:szCs w:val="24"/>
+        </w:rPr>
+        <w:t>No form handling</w:t>
+      </w:r>
+      <w:r>
+        <w:rPr>
+          <w:sz w:val="24"/>
+          <w:szCs w:val="24"/>
+        </w:rPr>
+        <w:tab/>
+      </w:r>
+      <w:r>
+        <w:rPr>
+          <w:sz w:val="24"/>
+          <w:szCs w:val="24"/>
+        </w:rPr>
+        <w:tab/>
+      </w:r>
+      <w:r>
+        <w:rPr>
+          <w:sz w:val="24"/>
+          <w:szCs w:val="24"/>
+        </w:rPr>
+        <w:tab/>
+      </w:r>
+      <w:r>
+        <w:rPr>
+          <w:sz w:val="24"/>
+          <w:szCs w:val="24"/>
+        </w:rPr>
+        <w:tab/>
+      </w:r>
+      <w:r>
+        <w:rPr>
+          <w:sz w:val="24"/>
+          <w:szCs w:val="24"/>
+        </w:rPr>
+        <w:tab/>
+      </w:r>
+      <w:r>
+        <w:rPr>
+          <w:sz w:val="24"/>
+          <w:szCs w:val="24"/>
+        </w:rPr>
+        <w:t>Handle button clicks</w:t>
+      </w:r>
+    </w:p>
+    <w:p>
+      <w:pPr>
+        <w:pStyle w:val="ListParagraph"/>
+        <w:numPr>
+          <w:ilvl w:val="0"/>
+          <w:numId w:val="11"/>
+        </w:numPr>
+        <w:rPr>
+          <w:sz w:val="24"/>
+          <w:szCs w:val="24"/>
+        </w:rPr>
+      </w:pPr>
+      <w:r>
+        <w:rPr>
+          <w:noProof/>
+          <w:sz w:val="24"/>
+          <w:szCs w:val="24"/>
+        </w:rPr>
+        <w:drawing>
+          <wp:anchor distT="0" distB="0" distL="114300" distR="114300" simplePos="0" relativeHeight="251672576" behindDoc="1" locked="0" layoutInCell="1" allowOverlap="1" wp14:anchorId="78592943" wp14:editId="2D7C9051">
+            <wp:simplePos x="0" y="0"/>
+            <wp:positionH relativeFrom="margin">
+              <wp:align>left</wp:align>
+            </wp:positionH>
+            <wp:positionV relativeFrom="paragraph">
+              <wp:posOffset>302260</wp:posOffset>
+            </wp:positionV>
+            <wp:extent cx="3399155" cy="2747645"/>
+            <wp:effectExtent l="0" t="0" r="0" b="0"/>
+            <wp:wrapThrough wrapText="bothSides">
+              <wp:wrapPolygon edited="0">
+                <wp:start x="0" y="0"/>
+                <wp:lineTo x="0" y="21415"/>
+                <wp:lineTo x="21426" y="21415"/>
+                <wp:lineTo x="21426" y="0"/>
+                <wp:lineTo x="0" y="0"/>
+              </wp:wrapPolygon>
+            </wp:wrapThrough>
+            <wp:docPr id="570732295" name="Picture 1"/>
+            <wp:cNvGraphicFramePr>
+              <a:graphicFrameLocks xmlns:a="http://schemas.openxmlformats.org/drawingml/2006/main" noChangeAspect="1"/>
+            </wp:cNvGraphicFramePr>
+            <a:graphic xmlns:a="http://schemas.openxmlformats.org/drawingml/2006/main">
+              <a:graphicData uri="http://schemas.openxmlformats.org/drawingml/2006/picture">
+                <pic:pic xmlns:pic="http://schemas.openxmlformats.org/drawingml/2006/picture">
+                  <pic:nvPicPr>
+                    <pic:cNvPr id="570732295" name=""/>
+                    <pic:cNvPicPr/>
+                  </pic:nvPicPr>
+                  <pic:blipFill>
+                    <a:blip r:embed="rId32">
+                      <a:extLst>
+                        <a:ext uri="{28A0092B-C50C-407E-A947-70E740481C1C}">
+                          <a14:useLocalDpi xmlns:a14="http://schemas.microsoft.com/office/drawing/2010/main" val="0"/>
+                        </a:ext>
+                      </a:extLst>
+                    </a:blip>
+                    <a:stretch>
+                      <a:fillRect/>
+                    </a:stretch>
+                  </pic:blipFill>
+                  <pic:spPr>
+                    <a:xfrm>
+                      <a:off x="0" y="0"/>
+                      <a:ext cx="3424409" cy="2768378"/>
+                    </a:xfrm>
+                    <a:prstGeom prst="rect">
+                      <a:avLst/>
+                    </a:prstGeom>
+                  </pic:spPr>
+                </pic:pic>
+              </a:graphicData>
+            </a:graphic>
+            <wp14:sizeRelH relativeFrom="page">
+              <wp14:pctWidth>0</wp14:pctWidth>
+            </wp14:sizeRelH>
+            <wp14:sizeRelV relativeFrom="page">
+              <wp14:pctHeight>0</wp14:pctHeight>
+            </wp14:sizeRelV>
+          </wp:anchor>
+        </w:drawing>
+      </w:r>
+      <w:r>
+        <w:rPr>
+          <w:sz w:val="24"/>
+          <w:szCs w:val="24"/>
+        </w:rPr>
+        <w:t>No dynamic UI updates</w:t>
+      </w:r>
+      <w:r>
+        <w:rPr>
+          <w:sz w:val="24"/>
+          <w:szCs w:val="24"/>
+        </w:rPr>
+        <w:tab/>
+      </w:r>
+      <w:r>
+        <w:rPr>
+          <w:sz w:val="24"/>
+          <w:szCs w:val="24"/>
+        </w:rPr>
+        <w:tab/>
+      </w:r>
+      <w:r>
+        <w:rPr>
+          <w:sz w:val="24"/>
+          <w:szCs w:val="24"/>
+        </w:rPr>
+        <w:tab/>
+      </w:r>
+      <w:r>
+        <w:rPr>
+          <w:sz w:val="24"/>
+          <w:szCs w:val="24"/>
+        </w:rPr>
+        <w:tab/>
+      </w:r>
+      <w:r>
+        <w:rPr>
+          <w:sz w:val="24"/>
+          <w:szCs w:val="24"/>
+        </w:rPr>
+        <w:t>Validate forms</w:t>
+      </w:r>
+    </w:p>
+    <w:p>
+      <w:pPr>
+        <w:rPr>
+          <w:sz w:val="24"/>
+          <w:szCs w:val="24"/>
+        </w:rPr>
+      </w:pPr>
+      <w:r>
+        <w:rPr>
+          <w:noProof/>
+          <w:sz w:val="24"/>
+          <w:szCs w:val="24"/>
+        </w:rPr>
+        <w:drawing>
+          <wp:anchor distT="0" distB="0" distL="114300" distR="114300" simplePos="0" relativeHeight="251673600" behindDoc="0" locked="0" layoutInCell="1" allowOverlap="1" wp14:anchorId="2126A3B9" wp14:editId="4E081822">
+            <wp:simplePos x="0" y="0"/>
+            <wp:positionH relativeFrom="column">
+              <wp:posOffset>3505200</wp:posOffset>
+            </wp:positionH>
+            <wp:positionV relativeFrom="paragraph">
+              <wp:posOffset>552450</wp:posOffset>
+            </wp:positionV>
+            <wp:extent cx="3014345" cy="1737360"/>
+            <wp:effectExtent l="0" t="0" r="0" b="0"/>
+            <wp:wrapThrough wrapText="bothSides">
+              <wp:wrapPolygon edited="0">
+                <wp:start x="0" y="0"/>
+                <wp:lineTo x="0" y="21316"/>
+                <wp:lineTo x="21432" y="21316"/>
+                <wp:lineTo x="21432" y="0"/>
+                <wp:lineTo x="0" y="0"/>
+              </wp:wrapPolygon>
+            </wp:wrapThrough>
+            <wp:docPr id="375239751" name="Picture 1"/>
+            <wp:cNvGraphicFramePr>
+              <a:graphicFrameLocks xmlns:a="http://schemas.openxmlformats.org/drawingml/2006/main" noChangeAspect="1"/>
+            </wp:cNvGraphicFramePr>
+            <a:graphic xmlns:a="http://schemas.openxmlformats.org/drawingml/2006/main">
+              <a:graphicData uri="http://schemas.openxmlformats.org/drawingml/2006/picture">
+                <pic:pic xmlns:pic="http://schemas.openxmlformats.org/drawingml/2006/picture">
+                  <pic:nvPicPr>
+                    <pic:cNvPr id="375239751" name=""/>
+                    <pic:cNvPicPr/>
+                  </pic:nvPicPr>
+                  <pic:blipFill>
+                    <a:blip r:embed="rId33">
+                      <a:extLst>
+                        <a:ext uri="{28A0092B-C50C-407E-A947-70E740481C1C}">
+                          <a14:useLocalDpi xmlns:a14="http://schemas.microsoft.com/office/drawing/2010/main" val="0"/>
+                        </a:ext>
+                      </a:extLst>
+                    </a:blip>
+                    <a:stretch>
+                      <a:fillRect/>
+                    </a:stretch>
+                  </pic:blipFill>
+                  <pic:spPr>
+                    <a:xfrm>
+                      <a:off x="0" y="0"/>
+                      <a:ext cx="3014345" cy="1737360"/>
+                    </a:xfrm>
+                    <a:prstGeom prst="rect">
+                      <a:avLst/>
+                    </a:prstGeom>
+                  </pic:spPr>
+                </pic:pic>
+              </a:graphicData>
+            </a:graphic>
+            <wp14:sizeRelH relativeFrom="page">
+              <wp14:pctWidth>0</wp14:pctWidth>
+            </wp14:sizeRelH>
+            <wp14:sizeRelV relativeFrom="page">
+              <wp14:pctHeight>0</wp14:pctHeight>
+            </wp14:sizeRelV>
+          </wp:anchor>
+        </w:drawing>
+      </w:r>
+      <w:r>
+        <w:rPr>
+          <w:sz w:val="24"/>
+          <w:szCs w:val="24"/>
+        </w:rPr>
+        <w:tab/>
+      </w:r>
+      <w:r>
+        <w:rPr>
+          <w:sz w:val="24"/>
+          <w:szCs w:val="24"/>
+        </w:rPr>
+        <w:tab/>
+      </w:r>
+      <w:r>
+        <w:rPr>
+          <w:sz w:val="24"/>
+          <w:szCs w:val="24"/>
+        </w:rPr>
+        <w:tab/>
+      </w:r>
+      <w:r>
+        <w:rPr>
+          <w:sz w:val="24"/>
+          <w:szCs w:val="24"/>
+        </w:rPr>
+        <w:tab/>
+      </w:r>
+      <w:r>
+        <w:rPr>
+          <w:sz w:val="24"/>
+          <w:szCs w:val="24"/>
+        </w:rPr>
+        <w:tab/>
+      </w:r>
+      <w:r>
+        <w:rPr>
+          <w:sz w:val="24"/>
+          <w:szCs w:val="24"/>
+        </w:rPr>
+        <w:tab/>
+      </w:r>
+      <w:r>
+        <w:rPr>
+          <w:sz w:val="24"/>
+          <w:szCs w:val="24"/>
+        </w:rPr>
+        <w:tab/>
+      </w:r>
+      <w:r>
+        <w:rPr>
+          <w:sz w:val="24"/>
+          <w:szCs w:val="24"/>
+        </w:rPr>
+        <w:tab/>
+      </w:r>
+    </w:p>
+    <w:p>
+      <w:pPr>
+        <w:rPr>
+          <w:sz w:val="24"/>
+          <w:szCs w:val="24"/>
+        </w:rPr>
+      </w:pPr>
+    </w:p>
+    <w:p>
+      <w:pPr>
+        <w:rPr>
+          <w:sz w:val="24"/>
+          <w:szCs w:val="24"/>
+        </w:rPr>
+      </w:pPr>
+    </w:p>
+    <w:p>
+      <w:pPr>
+        <w:rPr>
+          <w:sz w:val="24"/>
+          <w:szCs w:val="24"/>
+        </w:rPr>
+      </w:pPr>
+      <w:r>
+        <w:rPr>
+          <w:sz w:val="24"/>
+          <w:szCs w:val="24"/>
+        </w:rPr>
+        <w:t>Why DOM is Important?</w:t>
+      </w:r>
+    </w:p>
+    <w:p>
+      <w:pPr>
+        <w:pStyle w:val="ListParagraph"/>
+        <w:numPr>
+          <w:ilvl w:val="0"/>
+          <w:numId w:val="11"/>
+        </w:numPr>
+        <w:pBdr>
+          <w:top w:val="single" w:sz="4" w:space="1" w:color="auto"/>
+          <w:left w:val="single" w:sz="4" w:space="4" w:color="auto"/>
+          <w:bottom w:val="single" w:sz="4" w:space="1" w:color="auto"/>
+          <w:right w:val="single" w:sz="4" w:space="4" w:color="auto"/>
+          <w:between w:val="single" w:sz="4" w:space="1" w:color="auto"/>
+          <w:bar w:val="single" w:sz="4" w:color="auto"/>
+        </w:pBdr>
+        <w:rPr>
+          <w:sz w:val="24"/>
+          <w:szCs w:val="24"/>
+        </w:rPr>
+      </w:pPr>
+      <w:r>
+        <w:rPr>
+          <w:sz w:val="24"/>
+          <w:szCs w:val="24"/>
+        </w:rPr>
+        <w:t>Access HTML</w:t>
+      </w:r>
+      <w:r>
+        <w:rPr>
+          <w:sz w:val="24"/>
+          <w:szCs w:val="24"/>
+        </w:rPr>
+        <w:t xml:space="preserve"> – </w:t>
+      </w:r>
+      <w:r>
+        <w:rPr>
+          <w:sz w:val="24"/>
+          <w:szCs w:val="24"/>
+        </w:rPr>
+        <w:t>getElementById</w:t>
+      </w:r>
+      <w:r>
+        <w:rPr>
+          <w:sz w:val="24"/>
+          <w:szCs w:val="24"/>
+        </w:rPr>
+        <w:t xml:space="preserve"> </w:t>
+      </w:r>
+      <w:r>
+        <w:rPr>
+          <w:sz w:val="24"/>
+          <w:szCs w:val="24"/>
+        </w:rPr>
+        <w:t>()</w:t>
+      </w:r>
+    </w:p>
+    <w:p>
+      <w:pPr>
+        <w:pStyle w:val="ListParagraph"/>
+        <w:numPr>
+          <w:ilvl w:val="0"/>
+          <w:numId w:val="11"/>
+        </w:numPr>
+        <w:pBdr>
+          <w:top w:val="single" w:sz="4" w:space="1" w:color="auto"/>
+          <w:left w:val="single" w:sz="4" w:space="4" w:color="auto"/>
+          <w:bottom w:val="single" w:sz="4" w:space="1" w:color="auto"/>
+          <w:right w:val="single" w:sz="4" w:space="4" w:color="auto"/>
+          <w:between w:val="single" w:sz="4" w:space="1" w:color="auto"/>
+          <w:bar w:val="single" w:sz="4" w:color="auto"/>
+        </w:pBdr>
+        <w:rPr>
+          <w:sz w:val="24"/>
+          <w:szCs w:val="24"/>
+        </w:rPr>
+      </w:pPr>
+      <w:r>
+        <w:rPr>
+          <w:sz w:val="24"/>
+          <w:szCs w:val="24"/>
+        </w:rPr>
+        <w:t>Modify Content</w:t>
+      </w:r>
+      <w:r>
+        <w:rPr>
+          <w:sz w:val="24"/>
+          <w:szCs w:val="24"/>
+        </w:rPr>
+        <w:t xml:space="preserve"> </w:t>
+      </w:r>
+      <w:r>
+        <w:rPr>
+          <w:sz w:val="24"/>
+          <w:szCs w:val="24"/>
+        </w:rPr>
+        <w:t>–</w:t>
+      </w:r>
+      <w:r>
+        <w:rPr>
+          <w:sz w:val="24"/>
+          <w:szCs w:val="24"/>
+        </w:rPr>
+        <w:t xml:space="preserve"> </w:t>
+      </w:r>
+      <w:r>
+        <w:rPr>
+          <w:sz w:val="24"/>
+          <w:szCs w:val="24"/>
+        </w:rPr>
+        <w:t>innerText</w:t>
+      </w:r>
+    </w:p>
+    <w:p>
+      <w:pPr>
+        <w:pStyle w:val="ListParagraph"/>
+        <w:numPr>
+          <w:ilvl w:val="0"/>
+          <w:numId w:val="11"/>
+        </w:numPr>
+        <w:pBdr>
+          <w:top w:val="single" w:sz="4" w:space="1" w:color="auto"/>
+          <w:left w:val="single" w:sz="4" w:space="4" w:color="auto"/>
+          <w:bottom w:val="single" w:sz="4" w:space="1" w:color="auto"/>
+          <w:right w:val="single" w:sz="4" w:space="4" w:color="auto"/>
+          <w:between w:val="single" w:sz="4" w:space="1" w:color="auto"/>
+          <w:bar w:val="single" w:sz="4" w:color="auto"/>
+        </w:pBdr>
+        <w:rPr>
+          <w:sz w:val="24"/>
+          <w:szCs w:val="24"/>
+        </w:rPr>
+      </w:pPr>
+      <w:r>
+        <w:rPr>
+          <w:sz w:val="24"/>
+          <w:szCs w:val="24"/>
+        </w:rPr>
+        <w:t>Change Styles</w:t>
+      </w:r>
+      <w:r>
+        <w:rPr>
+          <w:sz w:val="24"/>
+          <w:szCs w:val="24"/>
         </w:rPr>
         <w:t xml:space="preserve"> - </w:t>
       </w:r>
@@ -13829,8 +14343,1671 @@
           <w:sz w:val="24"/>
           <w:szCs w:val="24"/>
         </w:rPr>
-        <w:t>Used to check whether a value exists inside an array.</w:t>
-      </w:r>
+        <w:t>style.</w:t>
+      </w:r>
+      <w:r>
+        <w:rPr>
+          <w:sz w:val="24"/>
+          <w:szCs w:val="24"/>
+        </w:rPr>
+        <w:t xml:space="preserve"> </w:t>
+      </w:r>
+      <w:r>
+        <w:rPr>
+          <w:sz w:val="24"/>
+          <w:szCs w:val="24"/>
+        </w:rPr>
+        <w:t>color</w:t>
+      </w:r>
+    </w:p>
+    <w:p>
+      <w:pPr>
+        <w:pStyle w:val="ListParagraph"/>
+        <w:numPr>
+          <w:ilvl w:val="0"/>
+          <w:numId w:val="11"/>
+        </w:numPr>
+        <w:pBdr>
+          <w:top w:val="single" w:sz="4" w:space="1" w:color="auto"/>
+          <w:left w:val="single" w:sz="4" w:space="4" w:color="auto"/>
+          <w:bottom w:val="single" w:sz="4" w:space="1" w:color="auto"/>
+          <w:right w:val="single" w:sz="4" w:space="4" w:color="auto"/>
+          <w:between w:val="single" w:sz="4" w:space="1" w:color="auto"/>
+          <w:bar w:val="single" w:sz="4" w:color="auto"/>
+        </w:pBdr>
+        <w:rPr>
+          <w:sz w:val="24"/>
+          <w:szCs w:val="24"/>
+        </w:rPr>
+      </w:pPr>
+      <w:r>
+        <w:rPr>
+          <w:sz w:val="24"/>
+          <w:szCs w:val="24"/>
+        </w:rPr>
+        <w:t>Handle Events</w:t>
+      </w:r>
+      <w:r>
+        <w:rPr>
+          <w:sz w:val="24"/>
+          <w:szCs w:val="24"/>
+        </w:rPr>
+        <w:t xml:space="preserve"> – </w:t>
+      </w:r>
+      <w:r>
+        <w:rPr>
+          <w:sz w:val="24"/>
+          <w:szCs w:val="24"/>
+        </w:rPr>
+        <w:t>onclick</w:t>
+      </w:r>
+    </w:p>
+    <w:p>
+      <w:pPr>
+        <w:pStyle w:val="ListParagraph"/>
+        <w:numPr>
+          <w:ilvl w:val="0"/>
+          <w:numId w:val="11"/>
+        </w:numPr>
+        <w:pBdr>
+          <w:top w:val="single" w:sz="4" w:space="1" w:color="auto"/>
+          <w:left w:val="single" w:sz="4" w:space="4" w:color="auto"/>
+          <w:bottom w:val="single" w:sz="4" w:space="1" w:color="auto"/>
+          <w:right w:val="single" w:sz="4" w:space="4" w:color="auto"/>
+          <w:between w:val="single" w:sz="4" w:space="1" w:color="auto"/>
+          <w:bar w:val="single" w:sz="4" w:color="auto"/>
+        </w:pBdr>
+        <w:rPr>
+          <w:sz w:val="24"/>
+          <w:szCs w:val="24"/>
+        </w:rPr>
+      </w:pPr>
+      <w:r>
+        <w:rPr>
+          <w:sz w:val="24"/>
+          <w:szCs w:val="24"/>
+        </w:rPr>
+        <w:t>Create Elements</w:t>
+      </w:r>
+      <w:r>
+        <w:rPr>
+          <w:sz w:val="24"/>
+          <w:szCs w:val="24"/>
+        </w:rPr>
+        <w:t xml:space="preserve"> – </w:t>
+      </w:r>
+      <w:r>
+        <w:rPr>
+          <w:sz w:val="24"/>
+          <w:szCs w:val="24"/>
+        </w:rPr>
+        <w:t>createElement</w:t>
+      </w:r>
+      <w:r>
+        <w:rPr>
+          <w:sz w:val="24"/>
+          <w:szCs w:val="24"/>
+        </w:rPr>
+        <w:t xml:space="preserve"> </w:t>
+      </w:r>
+      <w:r>
+        <w:rPr>
+          <w:sz w:val="24"/>
+          <w:szCs w:val="24"/>
+        </w:rPr>
+        <w:t>()</w:t>
+      </w:r>
+      <w:r>
+        <w:rPr>
+          <w:sz w:val="24"/>
+          <w:szCs w:val="24"/>
+        </w:rPr>
+        <w:t xml:space="preserve"> </w:t>
+      </w:r>
+    </w:p>
+    <w:p>
+      <w:pPr>
+        <w:rPr>
+          <w:b/>
+          <w:bCs/>
+          <w:sz w:val="24"/>
+          <w:szCs w:val="24"/>
+          <w:u w:val="single"/>
+        </w:rPr>
+      </w:pPr>
+      <w:r>
+        <w:rPr>
+          <w:noProof/>
+          <w:sz w:val="24"/>
+          <w:szCs w:val="24"/>
+        </w:rPr>
+        <w:lastRenderedPageBreak/>
+        <w:drawing>
+          <wp:anchor distT="0" distB="0" distL="114300" distR="114300" simplePos="0" relativeHeight="251674624" behindDoc="0" locked="0" layoutInCell="1" allowOverlap="1" wp14:anchorId="20CFE695" wp14:editId="63374161">
+            <wp:simplePos x="0" y="0"/>
+            <wp:positionH relativeFrom="margin">
+              <wp:align>left</wp:align>
+            </wp:positionH>
+            <wp:positionV relativeFrom="paragraph">
+              <wp:posOffset>299720</wp:posOffset>
+            </wp:positionV>
+            <wp:extent cx="2918460" cy="2038350"/>
+            <wp:effectExtent l="0" t="0" r="0" b="0"/>
+            <wp:wrapThrough wrapText="bothSides">
+              <wp:wrapPolygon edited="0">
+                <wp:start x="0" y="0"/>
+                <wp:lineTo x="0" y="21398"/>
+                <wp:lineTo x="21431" y="21398"/>
+                <wp:lineTo x="21431" y="0"/>
+                <wp:lineTo x="0" y="0"/>
+              </wp:wrapPolygon>
+            </wp:wrapThrough>
+            <wp:docPr id="1805700189" name="Picture 1"/>
+            <wp:cNvGraphicFramePr>
+              <a:graphicFrameLocks xmlns:a="http://schemas.openxmlformats.org/drawingml/2006/main" noChangeAspect="1"/>
+            </wp:cNvGraphicFramePr>
+            <a:graphic xmlns:a="http://schemas.openxmlformats.org/drawingml/2006/main">
+              <a:graphicData uri="http://schemas.openxmlformats.org/drawingml/2006/picture">
+                <pic:pic xmlns:pic="http://schemas.openxmlformats.org/drawingml/2006/picture">
+                  <pic:nvPicPr>
+                    <pic:cNvPr id="1805700189" name=""/>
+                    <pic:cNvPicPr/>
+                  </pic:nvPicPr>
+                  <pic:blipFill>
+                    <a:blip r:embed="rId34" cstate="print">
+                      <a:extLst>
+                        <a:ext uri="{28A0092B-C50C-407E-A947-70E740481C1C}">
+                          <a14:useLocalDpi xmlns:a14="http://schemas.microsoft.com/office/drawing/2010/main" val="0"/>
+                        </a:ext>
+                      </a:extLst>
+                    </a:blip>
+                    <a:stretch>
+                      <a:fillRect/>
+                    </a:stretch>
+                  </pic:blipFill>
+                  <pic:spPr>
+                    <a:xfrm>
+                      <a:off x="0" y="0"/>
+                      <a:ext cx="2940009" cy="2053136"/>
+                    </a:xfrm>
+                    <a:prstGeom prst="rect">
+                      <a:avLst/>
+                    </a:prstGeom>
+                  </pic:spPr>
+                </pic:pic>
+              </a:graphicData>
+            </a:graphic>
+            <wp14:sizeRelH relativeFrom="page">
+              <wp14:pctWidth>0</wp14:pctWidth>
+            </wp14:sizeRelH>
+            <wp14:sizeRelV relativeFrom="page">
+              <wp14:pctHeight>0</wp14:pctHeight>
+            </wp14:sizeRelV>
+          </wp:anchor>
+        </w:drawing>
+      </w:r>
+      <w:r>
+        <w:rPr>
+          <w:b/>
+          <w:bCs/>
+          <w:sz w:val="24"/>
+          <w:szCs w:val="24"/>
+          <w:u w:val="single"/>
+        </w:rPr>
+        <w:t>DOM Tree Structure</w:t>
+      </w:r>
+      <w:r>
+        <w:rPr>
+          <w:b/>
+          <w:bCs/>
+          <w:sz w:val="24"/>
+          <w:szCs w:val="24"/>
+          <w:u w:val="single"/>
+        </w:rPr>
+        <w:t xml:space="preserve"> and Events</w:t>
+      </w:r>
+      <w:r>
+        <w:rPr>
+          <w:b/>
+          <w:bCs/>
+          <w:sz w:val="24"/>
+          <w:szCs w:val="24"/>
+          <w:u w:val="single"/>
+        </w:rPr>
+        <w:t>:</w:t>
+      </w:r>
+    </w:p>
+    <w:p>
+      <w:pPr>
+        <w:rPr>
+          <w:sz w:val="24"/>
+          <w:szCs w:val="24"/>
+        </w:rPr>
+      </w:pPr>
+      <w:r>
+        <w:rPr>
+          <w:noProof/>
+          <w:sz w:val="24"/>
+          <w:szCs w:val="24"/>
+        </w:rPr>
+        <w:drawing>
+          <wp:inline distT="0" distB="0" distL="0" distR="0" wp14:anchorId="3C948A9D" wp14:editId="7A43226A">
+            <wp:extent cx="2838450" cy="1628771"/>
+            <wp:effectExtent l="0" t="0" r="0" b="0"/>
+            <wp:docPr id="1753735862" name="Picture 1"/>
+            <wp:cNvGraphicFramePr>
+              <a:graphicFrameLocks xmlns:a="http://schemas.openxmlformats.org/drawingml/2006/main" noChangeAspect="1"/>
+            </wp:cNvGraphicFramePr>
+            <a:graphic xmlns:a="http://schemas.openxmlformats.org/drawingml/2006/main">
+              <a:graphicData uri="http://schemas.openxmlformats.org/drawingml/2006/picture">
+                <pic:pic xmlns:pic="http://schemas.openxmlformats.org/drawingml/2006/picture">
+                  <pic:nvPicPr>
+                    <pic:cNvPr id="1753735862" name=""/>
+                    <pic:cNvPicPr/>
+                  </pic:nvPicPr>
+                  <pic:blipFill>
+                    <a:blip r:embed="rId35"/>
+                    <a:stretch>
+                      <a:fillRect/>
+                    </a:stretch>
+                  </pic:blipFill>
+                  <pic:spPr>
+                    <a:xfrm>
+                      <a:off x="0" y="0"/>
+                      <a:ext cx="2882221" cy="1653888"/>
+                    </a:xfrm>
+                    <a:prstGeom prst="rect">
+                      <a:avLst/>
+                    </a:prstGeom>
+                  </pic:spPr>
+                </pic:pic>
+              </a:graphicData>
+            </a:graphic>
+          </wp:inline>
+        </w:drawing>
+      </w:r>
+    </w:p>
+    <w:p>
+      <w:pPr>
+        <w:rPr>
+          <w:b/>
+          <w:bCs/>
+          <w:sz w:val="24"/>
+          <w:szCs w:val="24"/>
+          <w:u w:val="single"/>
+        </w:rPr>
+      </w:pPr>
+    </w:p>
+    <w:p>
+      <w:pPr>
+        <w:rPr>
+          <w:b/>
+          <w:bCs/>
+          <w:sz w:val="24"/>
+          <w:szCs w:val="24"/>
+          <w:u w:val="single"/>
+        </w:rPr>
+      </w:pPr>
+      <w:r>
+        <w:rPr>
+          <w:b/>
+          <w:bCs/>
+          <w:sz w:val="24"/>
+          <w:szCs w:val="24"/>
+          <w:u w:val="single"/>
+        </w:rPr>
+        <w:t>Important DOM Selectors:</w:t>
+      </w:r>
+    </w:p>
+    <w:p>
+      <w:pPr>
+        <w:pStyle w:val="ListParagraph"/>
+        <w:numPr>
+          <w:ilvl w:val="1"/>
+          <w:numId w:val="4"/>
+        </w:numPr>
+        <w:rPr>
+          <w:sz w:val="24"/>
+          <w:szCs w:val="24"/>
+        </w:rPr>
+      </w:pPr>
+      <w:r>
+        <w:rPr>
+          <w:sz w:val="24"/>
+          <w:szCs w:val="24"/>
+        </w:rPr>
+        <w:t>getElementById</w:t>
+      </w:r>
+      <w:r>
+        <w:rPr>
+          <w:sz w:val="24"/>
+          <w:szCs w:val="24"/>
+        </w:rPr>
+        <w:t xml:space="preserve"> </w:t>
+      </w:r>
+      <w:r>
+        <w:rPr>
+          <w:sz w:val="24"/>
+          <w:szCs w:val="24"/>
+        </w:rPr>
+        <w:t>()</w:t>
+      </w:r>
+      <w:r>
+        <w:rPr>
+          <w:sz w:val="24"/>
+          <w:szCs w:val="24"/>
+        </w:rPr>
+        <w:t xml:space="preserve"> - </w:t>
+      </w:r>
+      <w:r>
+        <w:rPr>
+          <w:sz w:val="24"/>
+          <w:szCs w:val="24"/>
+        </w:rPr>
+        <w:t>Select element using ID.</w:t>
+      </w:r>
+    </w:p>
+    <w:p>
+      <w:pPr>
+        <w:pStyle w:val="ListParagraph"/>
+        <w:ind w:left="1440"/>
+        <w:rPr>
+          <w:sz w:val="24"/>
+          <w:szCs w:val="24"/>
+        </w:rPr>
+      </w:pPr>
+      <w:r>
+        <w:rPr>
+          <w:sz w:val="24"/>
+          <w:szCs w:val="24"/>
+        </w:rPr>
+        <w:t>document. getElementById("heading")</w:t>
+      </w:r>
+    </w:p>
+    <w:p>
+      <w:pPr>
+        <w:pStyle w:val="ListParagraph"/>
+        <w:numPr>
+          <w:ilvl w:val="1"/>
+          <w:numId w:val="4"/>
+        </w:numPr>
+        <w:rPr>
+          <w:sz w:val="24"/>
+          <w:szCs w:val="24"/>
+        </w:rPr>
+      </w:pPr>
+      <w:r>
+        <w:rPr>
+          <w:sz w:val="24"/>
+          <w:szCs w:val="24"/>
+        </w:rPr>
+        <w:t>getElementsByClassName</w:t>
+      </w:r>
+      <w:r>
+        <w:rPr>
+          <w:sz w:val="24"/>
+          <w:szCs w:val="24"/>
+        </w:rPr>
+        <w:t xml:space="preserve"> </w:t>
+      </w:r>
+      <w:r>
+        <w:rPr>
+          <w:sz w:val="24"/>
+          <w:szCs w:val="24"/>
+        </w:rPr>
+        <w:t>()</w:t>
+      </w:r>
+      <w:r>
+        <w:rPr>
+          <w:sz w:val="24"/>
+          <w:szCs w:val="24"/>
+        </w:rPr>
+        <w:t xml:space="preserve"> - </w:t>
+      </w:r>
+      <w:r>
+        <w:rPr>
+          <w:sz w:val="24"/>
+          <w:szCs w:val="24"/>
+        </w:rPr>
+        <w:t>Select elements using class.</w:t>
+      </w:r>
+    </w:p>
+    <w:p>
+      <w:pPr>
+        <w:pStyle w:val="ListParagraph"/>
+        <w:ind w:left="1440"/>
+        <w:rPr>
+          <w:sz w:val="24"/>
+          <w:szCs w:val="24"/>
+        </w:rPr>
+      </w:pPr>
+      <w:r>
+        <w:rPr>
+          <w:sz w:val="24"/>
+          <w:szCs w:val="24"/>
+        </w:rPr>
+        <w:t>document. getElementsByClassName</w:t>
+      </w:r>
+      <w:r>
+        <w:rPr>
+          <w:sz w:val="24"/>
+          <w:szCs w:val="24"/>
+        </w:rPr>
+        <w:t xml:space="preserve"> </w:t>
+      </w:r>
+      <w:r>
+        <w:rPr>
+          <w:sz w:val="24"/>
+          <w:szCs w:val="24"/>
+        </w:rPr>
+        <w:t>("box")</w:t>
+      </w:r>
+    </w:p>
+    <w:p>
+      <w:pPr>
+        <w:pStyle w:val="ListParagraph"/>
+        <w:numPr>
+          <w:ilvl w:val="1"/>
+          <w:numId w:val="4"/>
+        </w:numPr>
+        <w:rPr>
+          <w:sz w:val="24"/>
+          <w:szCs w:val="24"/>
+        </w:rPr>
+      </w:pPr>
+      <w:r>
+        <w:rPr>
+          <w:sz w:val="24"/>
+          <w:szCs w:val="24"/>
+        </w:rPr>
+        <w:t>getElementsByTagName</w:t>
+      </w:r>
+      <w:r>
+        <w:rPr>
+          <w:sz w:val="24"/>
+          <w:szCs w:val="24"/>
+        </w:rPr>
+        <w:t xml:space="preserve"> </w:t>
+      </w:r>
+      <w:r>
+        <w:rPr>
+          <w:sz w:val="24"/>
+          <w:szCs w:val="24"/>
+        </w:rPr>
+        <w:t>()</w:t>
+      </w:r>
+      <w:r>
+        <w:rPr>
+          <w:sz w:val="24"/>
+          <w:szCs w:val="24"/>
+        </w:rPr>
+        <w:t xml:space="preserve"> - </w:t>
+      </w:r>
+      <w:r>
+        <w:rPr>
+          <w:sz w:val="24"/>
+          <w:szCs w:val="24"/>
+        </w:rPr>
+        <w:t>Select using tag name.</w:t>
+      </w:r>
+    </w:p>
+    <w:p>
+      <w:pPr>
+        <w:pStyle w:val="ListParagraph"/>
+        <w:ind w:left="1440"/>
+        <w:rPr>
+          <w:sz w:val="24"/>
+          <w:szCs w:val="24"/>
+        </w:rPr>
+      </w:pPr>
+      <w:r>
+        <w:rPr>
+          <w:sz w:val="24"/>
+          <w:szCs w:val="24"/>
+        </w:rPr>
+        <w:t>document. getElementsByTagName</w:t>
+      </w:r>
+      <w:r>
+        <w:rPr>
+          <w:sz w:val="24"/>
+          <w:szCs w:val="24"/>
+        </w:rPr>
+        <w:t xml:space="preserve"> </w:t>
+      </w:r>
+      <w:r>
+        <w:rPr>
+          <w:sz w:val="24"/>
+          <w:szCs w:val="24"/>
+        </w:rPr>
+        <w:t>("h1")</w:t>
+      </w:r>
+    </w:p>
+    <w:p>
+      <w:pPr>
+        <w:pStyle w:val="ListParagraph"/>
+        <w:numPr>
+          <w:ilvl w:val="1"/>
+          <w:numId w:val="4"/>
+        </w:numPr>
+        <w:rPr>
+          <w:sz w:val="24"/>
+          <w:szCs w:val="24"/>
+        </w:rPr>
+      </w:pPr>
+      <w:r>
+        <w:rPr>
+          <w:sz w:val="24"/>
+          <w:szCs w:val="24"/>
+        </w:rPr>
+        <w:t>querySelector</w:t>
+      </w:r>
+      <w:r>
+        <w:rPr>
+          <w:sz w:val="24"/>
+          <w:szCs w:val="24"/>
+        </w:rPr>
+        <w:t xml:space="preserve"> </w:t>
+      </w:r>
+      <w:r>
+        <w:rPr>
+          <w:sz w:val="24"/>
+          <w:szCs w:val="24"/>
+        </w:rPr>
+        <w:t>()</w:t>
+      </w:r>
+      <w:r>
+        <w:rPr>
+          <w:sz w:val="24"/>
+          <w:szCs w:val="24"/>
+        </w:rPr>
+        <w:t xml:space="preserve"> - </w:t>
+      </w:r>
+      <w:r>
+        <w:rPr>
+          <w:sz w:val="24"/>
+          <w:szCs w:val="24"/>
+        </w:rPr>
+        <w:t>Select first matching element.</w:t>
+      </w:r>
+    </w:p>
+    <w:p>
+      <w:pPr>
+        <w:pStyle w:val="ListParagraph"/>
+        <w:ind w:left="1440"/>
+        <w:rPr>
+          <w:sz w:val="24"/>
+          <w:szCs w:val="24"/>
+        </w:rPr>
+      </w:pPr>
+      <w:r>
+        <w:rPr>
+          <w:sz w:val="24"/>
+          <w:szCs w:val="24"/>
+        </w:rPr>
+        <w:t>document.</w:t>
+      </w:r>
+      <w:r>
+        <w:rPr>
+          <w:sz w:val="24"/>
+          <w:szCs w:val="24"/>
+        </w:rPr>
+        <w:t xml:space="preserve"> </w:t>
+      </w:r>
+      <w:r>
+        <w:rPr>
+          <w:sz w:val="24"/>
+          <w:szCs w:val="24"/>
+        </w:rPr>
+        <w:t>querySelector</w:t>
+      </w:r>
+      <w:r>
+        <w:rPr>
+          <w:sz w:val="24"/>
+          <w:szCs w:val="24"/>
+        </w:rPr>
+        <w:t xml:space="preserve"> </w:t>
+      </w:r>
+      <w:r>
+        <w:rPr>
+          <w:sz w:val="24"/>
+          <w:szCs w:val="24"/>
+        </w:rPr>
+        <w:t>(</w:t>
+      </w:r>
+      <w:r>
+        <w:rPr>
+          <w:sz w:val="24"/>
+          <w:szCs w:val="24"/>
+        </w:rPr>
+        <w:t>“. box</w:t>
+      </w:r>
+      <w:r>
+        <w:rPr>
+          <w:sz w:val="24"/>
+          <w:szCs w:val="24"/>
+        </w:rPr>
+        <w:t>")</w:t>
+      </w:r>
+    </w:p>
+    <w:p>
+      <w:pPr>
+        <w:pStyle w:val="ListParagraph"/>
+        <w:numPr>
+          <w:ilvl w:val="1"/>
+          <w:numId w:val="4"/>
+        </w:numPr>
+        <w:rPr>
+          <w:sz w:val="24"/>
+          <w:szCs w:val="24"/>
+        </w:rPr>
+      </w:pPr>
+      <w:r>
+        <w:rPr>
+          <w:sz w:val="24"/>
+          <w:szCs w:val="24"/>
+        </w:rPr>
+        <w:t>querySelectorAll</w:t>
+      </w:r>
+      <w:r>
+        <w:rPr>
+          <w:sz w:val="24"/>
+          <w:szCs w:val="24"/>
+        </w:rPr>
+        <w:t xml:space="preserve"> </w:t>
+      </w:r>
+      <w:r>
+        <w:rPr>
+          <w:sz w:val="24"/>
+          <w:szCs w:val="24"/>
+        </w:rPr>
+        <w:t>()</w:t>
+      </w:r>
+      <w:r>
+        <w:rPr>
+          <w:sz w:val="24"/>
+          <w:szCs w:val="24"/>
+        </w:rPr>
+        <w:t xml:space="preserve"> - </w:t>
+      </w:r>
+      <w:r>
+        <w:rPr>
+          <w:sz w:val="24"/>
+          <w:szCs w:val="24"/>
+        </w:rPr>
+        <w:t>Select all matching elements.</w:t>
+      </w:r>
+    </w:p>
+    <w:p>
+      <w:pPr>
+        <w:pStyle w:val="ListParagraph"/>
+        <w:ind w:left="1440"/>
+        <w:rPr>
+          <w:sz w:val="24"/>
+          <w:szCs w:val="24"/>
+        </w:rPr>
+      </w:pPr>
+      <w:r>
+        <w:rPr>
+          <w:sz w:val="24"/>
+          <w:szCs w:val="24"/>
+        </w:rPr>
+        <w:t>document. QuerySelectorAll (“. box")</w:t>
+      </w:r>
+    </w:p>
+    <w:p>
+      <w:pPr>
+        <w:rPr>
+          <w:b/>
+          <w:bCs/>
+          <w:sz w:val="24"/>
+          <w:szCs w:val="24"/>
+        </w:rPr>
+      </w:pPr>
+      <w:r>
+        <w:rPr>
+          <w:b/>
+          <w:bCs/>
+          <w:sz w:val="24"/>
+          <w:szCs w:val="24"/>
+        </w:rPr>
+        <w:t>MOST IMPORTANT DOM Properties</w:t>
+      </w:r>
+      <w:r>
+        <w:rPr>
+          <w:b/>
+          <w:bCs/>
+          <w:sz w:val="24"/>
+          <w:szCs w:val="24"/>
+        </w:rPr>
+        <w:t>:</w:t>
+      </w:r>
+    </w:p>
+    <w:tbl>
+      <w:tblPr>
+        <w:tblW w:w="10694" w:type="dxa"/>
+        <w:tblCellSpacing w:w="15" w:type="dxa"/>
+        <w:tblBorders>
+          <w:top w:val="single" w:sz="4" w:space="0" w:color="auto"/>
+          <w:left w:val="single" w:sz="4" w:space="0" w:color="auto"/>
+          <w:bottom w:val="single" w:sz="4" w:space="0" w:color="auto"/>
+          <w:right w:val="single" w:sz="4" w:space="0" w:color="auto"/>
+          <w:insideH w:val="single" w:sz="4" w:space="0" w:color="auto"/>
+          <w:insideV w:val="single" w:sz="4" w:space="0" w:color="auto"/>
+        </w:tblBorders>
+        <w:tblCellMar>
+          <w:top w:w="15" w:type="dxa"/>
+          <w:left w:w="15" w:type="dxa"/>
+          <w:bottom w:w="15" w:type="dxa"/>
+          <w:right w:w="15" w:type="dxa"/>
+        </w:tblCellMar>
+        <w:tblLook w:val="04A0" w:firstRow="1" w:lastRow="0" w:firstColumn="1" w:lastColumn="0" w:noHBand="0" w:noVBand="1"/>
+      </w:tblPr>
+      <w:tblGrid>
+        <w:gridCol w:w="1608"/>
+        <w:gridCol w:w="1966"/>
+        <w:gridCol w:w="7120"/>
+      </w:tblGrid>
+      <w:tr>
+        <w:trPr>
+          <w:trHeight w:val="312"/>
+          <w:tblHeader/>
+          <w:tblCellSpacing w:w="15" w:type="dxa"/>
+        </w:trPr>
+        <w:tc>
+          <w:tcPr>
+            <w:tcW w:w="0" w:type="auto"/>
+            <w:vAlign w:val="center"/>
+            <w:hideMark/>
+          </w:tcPr>
+          <w:p>
+            <w:pPr>
+              <w:jc w:val="center"/>
+              <w:rPr>
+                <w:b/>
+                <w:bCs/>
+                <w:sz w:val="24"/>
+                <w:szCs w:val="24"/>
+              </w:rPr>
+            </w:pPr>
+            <w:r>
+              <w:rPr>
+                <w:b/>
+                <w:bCs/>
+                <w:sz w:val="24"/>
+                <w:szCs w:val="24"/>
+              </w:rPr>
+              <w:t>Property</w:t>
+            </w:r>
+          </w:p>
+        </w:tc>
+        <w:tc>
+          <w:tcPr>
+            <w:tcW w:w="0" w:type="auto"/>
+            <w:vAlign w:val="center"/>
+            <w:hideMark/>
+          </w:tcPr>
+          <w:p>
+            <w:pPr>
+              <w:jc w:val="center"/>
+              <w:rPr>
+                <w:b/>
+                <w:bCs/>
+                <w:sz w:val="24"/>
+                <w:szCs w:val="24"/>
+              </w:rPr>
+            </w:pPr>
+            <w:r>
+              <w:rPr>
+                <w:b/>
+                <w:bCs/>
+                <w:sz w:val="24"/>
+                <w:szCs w:val="24"/>
+              </w:rPr>
+              <w:t>Purpose</w:t>
+            </w:r>
+          </w:p>
+        </w:tc>
+        <w:tc>
+          <w:tcPr>
+            <w:tcW w:w="0" w:type="auto"/>
+          </w:tcPr>
+          <w:p>
+            <w:pPr>
+              <w:jc w:val="center"/>
+              <w:rPr>
+                <w:b/>
+                <w:bCs/>
+                <w:sz w:val="24"/>
+                <w:szCs w:val="24"/>
+              </w:rPr>
+            </w:pPr>
+            <w:r>
+              <w:rPr>
+                <w:b/>
+                <w:bCs/>
+                <w:sz w:val="24"/>
+                <w:szCs w:val="24"/>
+              </w:rPr>
+              <w:t>Example</w:t>
+            </w:r>
+          </w:p>
+        </w:tc>
+      </w:tr>
+      <w:tr>
+        <w:trPr>
+          <w:trHeight w:val="323"/>
+          <w:tblCellSpacing w:w="15" w:type="dxa"/>
+        </w:trPr>
+        <w:tc>
+          <w:tcPr>
+            <w:tcW w:w="0" w:type="auto"/>
+            <w:vAlign w:val="center"/>
+            <w:hideMark/>
+          </w:tcPr>
+          <w:p>
+            <w:pPr>
+              <w:jc w:val="center"/>
+              <w:rPr>
+                <w:sz w:val="24"/>
+                <w:szCs w:val="24"/>
+              </w:rPr>
+            </w:pPr>
+            <w:r>
+              <w:rPr>
+                <w:sz w:val="24"/>
+                <w:szCs w:val="24"/>
+              </w:rPr>
+              <w:t>innerText</w:t>
+            </w:r>
+          </w:p>
+        </w:tc>
+        <w:tc>
+          <w:tcPr>
+            <w:tcW w:w="0" w:type="auto"/>
+            <w:vAlign w:val="center"/>
+            <w:hideMark/>
+          </w:tcPr>
+          <w:p>
+            <w:pPr>
+              <w:jc w:val="center"/>
+              <w:rPr>
+                <w:sz w:val="24"/>
+                <w:szCs w:val="24"/>
+              </w:rPr>
+            </w:pPr>
+            <w:r>
+              <w:rPr>
+                <w:sz w:val="24"/>
+                <w:szCs w:val="24"/>
+              </w:rPr>
+              <w:t>Change text</w:t>
+            </w:r>
+          </w:p>
+        </w:tc>
+        <w:tc>
+          <w:tcPr>
+            <w:tcW w:w="0" w:type="auto"/>
+          </w:tcPr>
+          <w:p>
+            <w:pPr>
+              <w:rPr>
+                <w:sz w:val="24"/>
+                <w:szCs w:val="24"/>
+              </w:rPr>
+            </w:pPr>
+            <w:r>
+              <w:rPr>
+                <w:sz w:val="24"/>
+                <w:szCs w:val="24"/>
+              </w:rPr>
+              <w:t>heading. InnerText = "New Text";</w:t>
+            </w:r>
+          </w:p>
+        </w:tc>
+      </w:tr>
+      <w:tr>
+        <w:trPr>
+          <w:trHeight w:val="318"/>
+          <w:tblCellSpacing w:w="15" w:type="dxa"/>
+        </w:trPr>
+        <w:tc>
+          <w:tcPr>
+            <w:tcW w:w="0" w:type="auto"/>
+            <w:vAlign w:val="center"/>
+            <w:hideMark/>
+          </w:tcPr>
+          <w:p>
+            <w:pPr>
+              <w:jc w:val="center"/>
+              <w:rPr>
+                <w:sz w:val="24"/>
+                <w:szCs w:val="24"/>
+              </w:rPr>
+            </w:pPr>
+            <w:r>
+              <w:rPr>
+                <w:sz w:val="24"/>
+                <w:szCs w:val="24"/>
+              </w:rPr>
+              <w:t>innerHTML</w:t>
+            </w:r>
+          </w:p>
+        </w:tc>
+        <w:tc>
+          <w:tcPr>
+            <w:tcW w:w="0" w:type="auto"/>
+            <w:vAlign w:val="center"/>
+            <w:hideMark/>
+          </w:tcPr>
+          <w:p>
+            <w:pPr>
+              <w:jc w:val="center"/>
+              <w:rPr>
+                <w:sz w:val="24"/>
+                <w:szCs w:val="24"/>
+              </w:rPr>
+            </w:pPr>
+            <w:r>
+              <w:rPr>
+                <w:sz w:val="24"/>
+                <w:szCs w:val="24"/>
+              </w:rPr>
+              <w:t>Change HTML</w:t>
+            </w:r>
+          </w:p>
+        </w:tc>
+        <w:tc>
+          <w:tcPr>
+            <w:tcW w:w="0" w:type="auto"/>
+          </w:tcPr>
+          <w:p>
+            <w:pPr>
+              <w:rPr>
+                <w:sz w:val="24"/>
+                <w:szCs w:val="24"/>
+              </w:rPr>
+            </w:pPr>
+            <w:r>
+              <w:rPr>
+                <w:sz w:val="24"/>
+                <w:szCs w:val="24"/>
+              </w:rPr>
+              <w:t>heading. InnerHTML = "&lt;i&gt;Hello&lt;/i&gt;";</w:t>
+            </w:r>
+          </w:p>
+        </w:tc>
+      </w:tr>
+      <w:tr>
+        <w:trPr>
+          <w:trHeight w:val="318"/>
+          <w:tblCellSpacing w:w="15" w:type="dxa"/>
+        </w:trPr>
+        <w:tc>
+          <w:tcPr>
+            <w:tcW w:w="0" w:type="auto"/>
+            <w:vAlign w:val="center"/>
+            <w:hideMark/>
+          </w:tcPr>
+          <w:p>
+            <w:pPr>
+              <w:jc w:val="center"/>
+              <w:rPr>
+                <w:sz w:val="24"/>
+                <w:szCs w:val="24"/>
+              </w:rPr>
+            </w:pPr>
+            <w:r>
+              <w:rPr>
+                <w:sz w:val="24"/>
+                <w:szCs w:val="24"/>
+              </w:rPr>
+              <w:t>style</w:t>
+            </w:r>
+          </w:p>
+        </w:tc>
+        <w:tc>
+          <w:tcPr>
+            <w:tcW w:w="0" w:type="auto"/>
+            <w:vAlign w:val="center"/>
+            <w:hideMark/>
+          </w:tcPr>
+          <w:p>
+            <w:pPr>
+              <w:jc w:val="center"/>
+              <w:rPr>
+                <w:sz w:val="24"/>
+                <w:szCs w:val="24"/>
+              </w:rPr>
+            </w:pPr>
+            <w:r>
+              <w:rPr>
+                <w:sz w:val="24"/>
+                <w:szCs w:val="24"/>
+              </w:rPr>
+              <w:t>Change CSS</w:t>
+            </w:r>
+          </w:p>
+        </w:tc>
+        <w:tc>
+          <w:tcPr>
+            <w:tcW w:w="0" w:type="auto"/>
+          </w:tcPr>
+          <w:p>
+            <w:pPr>
+              <w:rPr>
+                <w:sz w:val="24"/>
+                <w:szCs w:val="24"/>
+              </w:rPr>
+            </w:pPr>
+            <w:r>
+              <w:rPr>
+                <w:sz w:val="24"/>
+                <w:szCs w:val="24"/>
+              </w:rPr>
+              <w:t>heading. style. color = "red";</w:t>
+            </w:r>
+          </w:p>
+        </w:tc>
+      </w:tr>
+      <w:tr>
+        <w:trPr>
+          <w:trHeight w:val="312"/>
+          <w:tblCellSpacing w:w="15" w:type="dxa"/>
+        </w:trPr>
+        <w:tc>
+          <w:tcPr>
+            <w:tcW w:w="0" w:type="auto"/>
+            <w:vAlign w:val="center"/>
+            <w:hideMark/>
+          </w:tcPr>
+          <w:p>
+            <w:pPr>
+              <w:jc w:val="center"/>
+              <w:rPr>
+                <w:sz w:val="24"/>
+                <w:szCs w:val="24"/>
+              </w:rPr>
+            </w:pPr>
+            <w:r>
+              <w:rPr>
+                <w:sz w:val="24"/>
+                <w:szCs w:val="24"/>
+              </w:rPr>
+              <w:t>value</w:t>
+            </w:r>
+          </w:p>
+        </w:tc>
+        <w:tc>
+          <w:tcPr>
+            <w:tcW w:w="0" w:type="auto"/>
+            <w:vAlign w:val="center"/>
+            <w:hideMark/>
+          </w:tcPr>
+          <w:p>
+            <w:pPr>
+              <w:jc w:val="center"/>
+              <w:rPr>
+                <w:sz w:val="24"/>
+                <w:szCs w:val="24"/>
+              </w:rPr>
+            </w:pPr>
+            <w:r>
+              <w:rPr>
+                <w:sz w:val="24"/>
+                <w:szCs w:val="24"/>
+              </w:rPr>
+              <w:t>Input values</w:t>
+            </w:r>
+          </w:p>
+        </w:tc>
+        <w:tc>
+          <w:tcPr>
+            <w:tcW w:w="0" w:type="auto"/>
+          </w:tcPr>
+          <w:p>
+            <w:pPr>
+              <w:rPr>
+                <w:sz w:val="24"/>
+                <w:szCs w:val="24"/>
+              </w:rPr>
+            </w:pPr>
+            <w:r>
+              <w:rPr>
+                <w:sz w:val="24"/>
+                <w:szCs w:val="24"/>
+              </w:rPr>
+              <w:t>let input = document. getElementById("username");</w:t>
+            </w:r>
+            <w:r>
+              <w:rPr>
+                <w:sz w:val="24"/>
+                <w:szCs w:val="24"/>
+              </w:rPr>
+              <w:br/>
+            </w:r>
+            <w:r>
+              <w:rPr>
+                <w:sz w:val="24"/>
+                <w:szCs w:val="24"/>
+              </w:rPr>
+              <w:t>console.log(input.value);</w:t>
+            </w:r>
+          </w:p>
+        </w:tc>
+      </w:tr>
+    </w:tbl>
+    <w:p>
+      <w:pPr>
+        <w:rPr>
+          <w:b/>
+          <w:bCs/>
+          <w:sz w:val="24"/>
+          <w:szCs w:val="24"/>
+        </w:rPr>
+      </w:pPr>
+    </w:p>
+    <w:p>
+      <w:pPr>
+        <w:rPr>
+          <w:b/>
+          <w:bCs/>
+          <w:sz w:val="24"/>
+          <w:szCs w:val="24"/>
+        </w:rPr>
+      </w:pPr>
+      <w:r>
+        <w:rPr>
+          <w:b/>
+          <w:bCs/>
+          <w:sz w:val="24"/>
+          <w:szCs w:val="24"/>
+        </w:rPr>
+        <w:t>Difference Between HTML and DOM</w:t>
+      </w:r>
+      <w:r>
+        <w:rPr>
+          <w:b/>
+          <w:bCs/>
+          <w:sz w:val="24"/>
+          <w:szCs w:val="24"/>
+        </w:rPr>
+        <w:t>:</w:t>
+      </w:r>
+    </w:p>
+    <w:tbl>
+      <w:tblPr>
+        <w:tblW w:w="5731" w:type="dxa"/>
+        <w:tblCellSpacing w:w="15" w:type="dxa"/>
+        <w:tblBorders>
+          <w:top w:val="single" w:sz="4" w:space="0" w:color="auto"/>
+          <w:left w:val="single" w:sz="4" w:space="0" w:color="auto"/>
+          <w:bottom w:val="single" w:sz="4" w:space="0" w:color="auto"/>
+          <w:right w:val="single" w:sz="4" w:space="0" w:color="auto"/>
+          <w:insideH w:val="single" w:sz="4" w:space="0" w:color="auto"/>
+          <w:insideV w:val="single" w:sz="4" w:space="0" w:color="auto"/>
+        </w:tblBorders>
+        <w:tblCellMar>
+          <w:top w:w="15" w:type="dxa"/>
+          <w:left w:w="15" w:type="dxa"/>
+          <w:bottom w:w="15" w:type="dxa"/>
+          <w:right w:w="15" w:type="dxa"/>
+        </w:tblCellMar>
+        <w:tblLook w:val="04A0" w:firstRow="1" w:lastRow="0" w:firstColumn="1" w:lastColumn="0" w:noHBand="0" w:noVBand="1"/>
+      </w:tblPr>
+      <w:tblGrid>
+        <w:gridCol w:w="2352"/>
+        <w:gridCol w:w="3379"/>
+      </w:tblGrid>
+      <w:tr>
+        <w:trPr>
+          <w:trHeight w:val="480"/>
+          <w:tblHeader/>
+          <w:tblCellSpacing w:w="15" w:type="dxa"/>
+        </w:trPr>
+        <w:tc>
+          <w:tcPr>
+            <w:tcW w:w="0" w:type="auto"/>
+            <w:vAlign w:val="center"/>
+            <w:hideMark/>
+          </w:tcPr>
+          <w:p>
+            <w:pPr>
+              <w:rPr>
+                <w:b/>
+                <w:bCs/>
+                <w:sz w:val="24"/>
+                <w:szCs w:val="24"/>
+              </w:rPr>
+            </w:pPr>
+            <w:r>
+              <w:rPr>
+                <w:b/>
+                <w:bCs/>
+                <w:sz w:val="24"/>
+                <w:szCs w:val="24"/>
+              </w:rPr>
+              <w:t>HTML</w:t>
+            </w:r>
+          </w:p>
+        </w:tc>
+        <w:tc>
+          <w:tcPr>
+            <w:tcW w:w="0" w:type="auto"/>
+            <w:vAlign w:val="center"/>
+            <w:hideMark/>
+          </w:tcPr>
+          <w:p>
+            <w:pPr>
+              <w:rPr>
+                <w:b/>
+                <w:bCs/>
+                <w:sz w:val="24"/>
+                <w:szCs w:val="24"/>
+              </w:rPr>
+            </w:pPr>
+            <w:r>
+              <w:rPr>
+                <w:b/>
+                <w:bCs/>
+                <w:sz w:val="24"/>
+                <w:szCs w:val="24"/>
+              </w:rPr>
+              <w:t>DOM</w:t>
+            </w:r>
+          </w:p>
+        </w:tc>
+      </w:tr>
+      <w:tr>
+        <w:trPr>
+          <w:trHeight w:val="496"/>
+          <w:tblCellSpacing w:w="15" w:type="dxa"/>
+        </w:trPr>
+        <w:tc>
+          <w:tcPr>
+            <w:tcW w:w="0" w:type="auto"/>
+            <w:vAlign w:val="center"/>
+            <w:hideMark/>
+          </w:tcPr>
+          <w:p>
+            <w:pPr>
+              <w:rPr>
+                <w:sz w:val="24"/>
+                <w:szCs w:val="24"/>
+              </w:rPr>
+            </w:pPr>
+            <w:r>
+              <w:rPr>
+                <w:sz w:val="24"/>
+                <w:szCs w:val="24"/>
+              </w:rPr>
+              <w:t>Static markup</w:t>
+            </w:r>
+          </w:p>
+        </w:tc>
+        <w:tc>
+          <w:tcPr>
+            <w:tcW w:w="0" w:type="auto"/>
+            <w:vAlign w:val="center"/>
+            <w:hideMark/>
+          </w:tcPr>
+          <w:p>
+            <w:pPr>
+              <w:rPr>
+                <w:sz w:val="24"/>
+                <w:szCs w:val="24"/>
+              </w:rPr>
+            </w:pPr>
+            <w:r>
+              <w:rPr>
+                <w:sz w:val="24"/>
+                <w:szCs w:val="24"/>
+              </w:rPr>
+              <w:t>Dynamic object representation</w:t>
+            </w:r>
+          </w:p>
+        </w:tc>
+      </w:tr>
+      <w:tr>
+        <w:trPr>
+          <w:trHeight w:val="488"/>
+          <w:tblCellSpacing w:w="15" w:type="dxa"/>
+        </w:trPr>
+        <w:tc>
+          <w:tcPr>
+            <w:tcW w:w="0" w:type="auto"/>
+            <w:vAlign w:val="center"/>
+            <w:hideMark/>
+          </w:tcPr>
+          <w:p>
+            <w:pPr>
+              <w:rPr>
+                <w:sz w:val="24"/>
+                <w:szCs w:val="24"/>
+              </w:rPr>
+            </w:pPr>
+            <w:r>
+              <w:rPr>
+                <w:sz w:val="24"/>
+                <w:szCs w:val="24"/>
+              </w:rPr>
+              <w:t>Written by developer</w:t>
+            </w:r>
+          </w:p>
+        </w:tc>
+        <w:tc>
+          <w:tcPr>
+            <w:tcW w:w="0" w:type="auto"/>
+            <w:vAlign w:val="center"/>
+            <w:hideMark/>
+          </w:tcPr>
+          <w:p>
+            <w:pPr>
+              <w:rPr>
+                <w:sz w:val="24"/>
+                <w:szCs w:val="24"/>
+              </w:rPr>
+            </w:pPr>
+            <w:r>
+              <w:rPr>
+                <w:sz w:val="24"/>
+                <w:szCs w:val="24"/>
+              </w:rPr>
+              <w:t>Created by browser</w:t>
+            </w:r>
+          </w:p>
+        </w:tc>
+      </w:tr>
+      <w:tr>
+        <w:trPr>
+          <w:trHeight w:val="480"/>
+          <w:tblCellSpacing w:w="15" w:type="dxa"/>
+        </w:trPr>
+        <w:tc>
+          <w:tcPr>
+            <w:tcW w:w="0" w:type="auto"/>
+            <w:vAlign w:val="center"/>
+            <w:hideMark/>
+          </w:tcPr>
+          <w:p>
+            <w:pPr>
+              <w:rPr>
+                <w:sz w:val="24"/>
+                <w:szCs w:val="24"/>
+              </w:rPr>
+            </w:pPr>
+            <w:r>
+              <w:rPr>
+                <w:sz w:val="24"/>
+                <w:szCs w:val="24"/>
+              </w:rPr>
+              <w:t>Cannot change itself</w:t>
+            </w:r>
+          </w:p>
+        </w:tc>
+        <w:tc>
+          <w:tcPr>
+            <w:tcW w:w="0" w:type="auto"/>
+            <w:vAlign w:val="center"/>
+            <w:hideMark/>
+          </w:tcPr>
+          <w:p>
+            <w:pPr>
+              <w:rPr>
+                <w:sz w:val="24"/>
+                <w:szCs w:val="24"/>
+              </w:rPr>
+            </w:pPr>
+            <w:r>
+              <w:rPr>
+                <w:sz w:val="24"/>
+                <w:szCs w:val="24"/>
+              </w:rPr>
+              <w:t>JavaScript can modify</w:t>
+            </w:r>
+          </w:p>
+        </w:tc>
+      </w:tr>
+    </w:tbl>
+    <w:p>
+      <w:pPr>
+        <w:rPr>
+          <w:sz w:val="24"/>
+          <w:szCs w:val="24"/>
+        </w:rPr>
+      </w:pPr>
+      <w:r>
+        <w:rPr>
+          <w:sz w:val="24"/>
+          <w:szCs w:val="24"/>
+        </w:rPr>
+        <w:t>DOM stands for Document Object Model. It is a tree-like representation of HTML elements created by the browser. JavaScript uses the DOM to dynamically access, update, and manipulate webpage content, styles, and events.</w:t>
+      </w:r>
+    </w:p>
+    <w:p>
+      <w:pPr>
+        <w:rPr>
+          <w:b/>
+          <w:bCs/>
+          <w:sz w:val="24"/>
+          <w:szCs w:val="24"/>
+        </w:rPr>
+      </w:pPr>
+      <w:r>
+        <w:rPr>
+          <w:b/>
+          <w:bCs/>
+          <w:sz w:val="24"/>
+          <w:szCs w:val="24"/>
+        </w:rPr>
+        <w:lastRenderedPageBreak/>
+        <w:t>Super Important Interview Topics Under DOM</w:t>
+      </w:r>
+    </w:p>
+    <w:p>
+      <w:pPr>
+        <w:rPr>
+          <w:sz w:val="24"/>
+          <w:szCs w:val="24"/>
+        </w:rPr>
+      </w:pPr>
+      <w:r>
+        <w:rPr>
+          <w:sz w:val="24"/>
+          <w:szCs w:val="24"/>
+        </w:rPr>
+        <w:t>Event Listeners</w:t>
+      </w:r>
+      <w:r>
+        <w:rPr>
+          <w:sz w:val="24"/>
+          <w:szCs w:val="24"/>
+        </w:rPr>
+        <w:t xml:space="preserve">, </w:t>
+      </w:r>
+      <w:r>
+        <w:rPr>
+          <w:sz w:val="24"/>
+          <w:szCs w:val="24"/>
+        </w:rPr>
+        <w:t>Forms Handling</w:t>
+      </w:r>
+      <w:r>
+        <w:rPr>
+          <w:sz w:val="24"/>
+          <w:szCs w:val="24"/>
+        </w:rPr>
+        <w:t xml:space="preserve">, </w:t>
+      </w:r>
+      <w:r>
+        <w:rPr>
+          <w:sz w:val="24"/>
+          <w:szCs w:val="24"/>
+        </w:rPr>
+        <w:t>createElement ()</w:t>
+      </w:r>
+      <w:r>
+        <w:rPr>
+          <w:sz w:val="24"/>
+          <w:szCs w:val="24"/>
+        </w:rPr>
+        <w:t xml:space="preserve">, </w:t>
+      </w:r>
+      <w:r>
+        <w:rPr>
+          <w:sz w:val="24"/>
+          <w:szCs w:val="24"/>
+        </w:rPr>
+        <w:t>appendChild ()</w:t>
+      </w:r>
+      <w:r>
+        <w:rPr>
+          <w:sz w:val="24"/>
+          <w:szCs w:val="24"/>
+        </w:rPr>
+        <w:t xml:space="preserve">, </w:t>
+      </w:r>
+      <w:r>
+        <w:rPr>
+          <w:sz w:val="24"/>
+          <w:szCs w:val="24"/>
+        </w:rPr>
+        <w:t>remove ()</w:t>
+      </w:r>
+      <w:r>
+        <w:rPr>
+          <w:sz w:val="24"/>
+          <w:szCs w:val="24"/>
+        </w:rPr>
+        <w:t xml:space="preserve">, </w:t>
+      </w:r>
+      <w:r>
+        <w:rPr>
+          <w:sz w:val="24"/>
+          <w:szCs w:val="24"/>
+        </w:rPr>
+        <w:t>classList</w:t>
+      </w:r>
+      <w:r>
+        <w:rPr>
+          <w:sz w:val="24"/>
+          <w:szCs w:val="24"/>
+        </w:rPr>
+        <w:t xml:space="preserve">, </w:t>
+      </w:r>
+      <w:r>
+        <w:rPr>
+          <w:sz w:val="24"/>
+          <w:szCs w:val="24"/>
+        </w:rPr>
+        <w:t>setAttribute ()</w:t>
+      </w:r>
+      <w:r>
+        <w:rPr>
+          <w:sz w:val="24"/>
+          <w:szCs w:val="24"/>
+        </w:rPr>
+        <w:t xml:space="preserve">, </w:t>
+      </w:r>
+      <w:r>
+        <w:rPr>
+          <w:sz w:val="24"/>
+          <w:szCs w:val="24"/>
+        </w:rPr>
+        <w:t>localStorage</w:t>
+      </w:r>
+      <w:r>
+        <w:rPr>
+          <w:sz w:val="24"/>
+          <w:szCs w:val="24"/>
+        </w:rPr>
+        <w:t xml:space="preserve">, </w:t>
+      </w:r>
+      <w:r>
+        <w:rPr>
+          <w:sz w:val="24"/>
+          <w:szCs w:val="24"/>
+        </w:rPr>
+        <w:t>Event Bubbling</w:t>
+      </w:r>
+      <w:r>
+        <w:rPr>
+          <w:sz w:val="24"/>
+          <w:szCs w:val="24"/>
+        </w:rPr>
+        <w:t xml:space="preserve">, </w:t>
+      </w:r>
+      <w:r>
+        <w:rPr>
+          <w:sz w:val="24"/>
+          <w:szCs w:val="24"/>
+        </w:rPr>
+        <w:t>Event Delega</w:t>
+      </w:r>
+      <w:r>
+        <w:rPr>
+          <w:sz w:val="24"/>
+          <w:szCs w:val="24"/>
+        </w:rPr>
+        <w:t>te.</w:t>
+      </w:r>
+    </w:p>
+    <w:p>
+      <w:pPr>
+        <w:jc w:val="center"/>
+        <w:rPr>
+          <w:b/>
+          <w:bCs/>
+          <w:sz w:val="24"/>
+          <w:szCs w:val="24"/>
+          <w:u w:val="single"/>
+        </w:rPr>
+      </w:pPr>
+      <w:r>
+        <w:rPr>
+          <w:b/>
+          <w:bCs/>
+          <w:sz w:val="24"/>
+          <w:szCs w:val="24"/>
+          <w:u w:val="single"/>
+        </w:rPr>
+        <w:t>Creating Elements</w:t>
+      </w:r>
+      <w:r>
+        <w:rPr>
+          <w:b/>
+          <w:bCs/>
+          <w:sz w:val="24"/>
+          <w:szCs w:val="24"/>
+          <w:u w:val="single"/>
+        </w:rPr>
+        <w:t>:</w:t>
+      </w:r>
+    </w:p>
+    <w:p>
+      <w:pPr>
+        <w:rPr>
+          <w:sz w:val="24"/>
+          <w:szCs w:val="24"/>
+        </w:rPr>
+      </w:pPr>
+    </w:p>
+    <w:p>
+      <w:pPr>
+        <w:pStyle w:val="ListParagraph"/>
+        <w:ind w:left="1440"/>
+        <w:rPr>
+          <w:sz w:val="24"/>
+          <w:szCs w:val="24"/>
+        </w:rPr>
+      </w:pPr>
+    </w:p>
+    <w:p>
+      <w:pPr>
+        <w:rPr>
+          <w:sz w:val="24"/>
+          <w:szCs w:val="24"/>
+        </w:rPr>
+      </w:pPr>
     </w:p>
     <w:p>
       <w:pPr>
@@ -13967,7 +16144,7 @@
   <w:abstractNum w:abstractNumId="1" w15:restartNumberingAfterBreak="0">
     <w:nsid w:val="1E293DBF"/>
     <w:multiLevelType w:val="multilevel"/>
-    <w:tmpl w:val="2B2EE922"/>
+    <w:tmpl w:val="FB082F7C"/>
     <w:lvl w:ilvl="0">
       <w:start w:val="1"/>
       <w:numFmt w:val="bullet"/>
@@ -14689,7 +16866,7 @@
   <w:abstractNum w:abstractNumId="7" w15:restartNumberingAfterBreak="0">
     <w:nsid w:val="45910445"/>
     <w:multiLevelType w:val="multilevel"/>
-    <w:tmpl w:val="1966B4B6"/>
+    <w:tmpl w:val="92AA1602"/>
     <w:lvl w:ilvl="0">
       <w:start w:val="1"/>
       <w:numFmt w:val="bullet"/>
@@ -14706,20 +16883,16 @@
         <w:sz w:val="20"/>
       </w:rPr>
     </w:lvl>
-    <w:lvl w:ilvl="1" w:tentative="1">
+    <w:lvl w:ilvl="1">
       <w:start w:val="1"/>
-      <w:numFmt w:val="bullet"/>
-      <w:lvlText w:val="o"/>
+      <w:numFmt w:val="decimal"/>
+      <w:lvlText w:val="%2."/>
       <w:lvlJc w:val="left"/>
       <w:pPr>
-        <w:tabs>
-          <w:tab w:val="num" w:pos="1440"/>
-        </w:tabs>
         <w:ind w:left="1440" w:hanging="360"/>
       </w:pPr>
       <w:rPr>
-        <w:rFonts w:ascii="Courier New" w:hAnsi="Courier New" w:hint="default"/>
-        <w:sz w:val="20"/>
+        <w:rFonts w:hint="default"/>
       </w:rPr>
     </w:lvl>
     <w:lvl w:ilvl="2" w:tentative="1">
@@ -15974,6 +18147,7 @@
   <w:style w:type="character" w:default="1" w:styleId="DefaultParagraphFont">
     <w:name w:val="Default Paragraph Font"/>
     <w:uiPriority w:val="1"/>
+    <w:semiHidden/>
     <w:unhideWhenUsed/>
   </w:style>
   <w:style w:type="table" w:default="1" w:styleId="TableNormal">

</xml_diff>

<commit_message>
Creating Elements topic done
</commit_message>
<xml_diff>
--- a/Interview prep/JavaScript Notes.docx
+++ b/Interview prep/JavaScript Notes.docx
@@ -8,8 +8,8 @@
         <w:rPr>
           <w:b/>
           <w:bCs/>
-          <w:sz w:val="32"/>
-          <w:szCs w:val="32"/>
+          <w:sz w:val="36"/>
+          <w:szCs w:val="36"/>
           <w:u w:val="single"/>
           <w:lang w:val="en-US"/>
         </w:rPr>
@@ -18,8 +18,8 @@
         <w:rPr>
           <w:b/>
           <w:bCs/>
-          <w:sz w:val="32"/>
-          <w:szCs w:val="32"/>
+          <w:sz w:val="36"/>
+          <w:szCs w:val="36"/>
           <w:u w:val="single"/>
           <w:lang w:val="en-US"/>
         </w:rPr>
@@ -528,7 +528,15 @@
           <w:sz w:val="24"/>
           <w:szCs w:val="24"/>
         </w:rPr>
-        <w:t>JavaScript code runs on the V8 engine. The event loop handles execution in a single thread. If a task is synchronous, it executes immediately. If it is asynchronous, it is delegated to worker threads using libuv. Once completed, the result is placed in the task queue, and the event loop processes it when the call stack is free</w:t>
+        <w:t xml:space="preserve">JavaScript code runs on the V8 engine. The event loop handles execution in a single thread. If a task is synchronous, it executes immediately. If it is asynchronous, it is delegated to worker threads using libuv. </w:t>
+      </w:r>
+      <w:r>
+        <w:rPr>
+          <w:sz w:val="24"/>
+          <w:szCs w:val="24"/>
+        </w:rPr>
+        <w:lastRenderedPageBreak/>
+        <w:t>Once completed, the result is placed in the task queue, and the event loop processes it when the call stack is free</w:t>
       </w:r>
       <w:r>
         <w:rPr>
@@ -550,7 +558,6 @@
           <w:sz w:val="24"/>
           <w:szCs w:val="24"/>
         </w:rPr>
-        <w:lastRenderedPageBreak/>
         <w:t>Do I handle it or delegate it?</w:t>
       </w:r>
     </w:p>
@@ -600,8 +607,8 @@
         <w:rPr>
           <w:b/>
           <w:bCs/>
-          <w:sz w:val="24"/>
-          <w:szCs w:val="24"/>
+          <w:sz w:val="28"/>
+          <w:szCs w:val="28"/>
           <w:u w:val="single"/>
         </w:rPr>
       </w:pPr>
@@ -609,8 +616,8 @@
         <w:rPr>
           <w:b/>
           <w:bCs/>
-          <w:sz w:val="24"/>
-          <w:szCs w:val="24"/>
+          <w:sz w:val="28"/>
+          <w:szCs w:val="28"/>
           <w:u w:val="single"/>
         </w:rPr>
         <w:t>Browser features:</w:t>
@@ -1387,6 +1394,7 @@
           <w:sz w:val="24"/>
           <w:szCs w:val="24"/>
         </w:rPr>
+        <w:lastRenderedPageBreak/>
         <w:t>Where it is used</w:t>
       </w:r>
     </w:p>
@@ -1407,7 +1415,6 @@
           <w:sz w:val="24"/>
           <w:szCs w:val="24"/>
         </w:rPr>
-        <w:lastRenderedPageBreak/>
         <w:t>Basic input collection (learning/demo)</w:t>
       </w:r>
     </w:p>
@@ -1812,8 +1819,8 @@
         <w:rPr>
           <w:b/>
           <w:bCs/>
-          <w:sz w:val="24"/>
-          <w:szCs w:val="24"/>
+          <w:sz w:val="28"/>
+          <w:szCs w:val="28"/>
           <w:u w:val="single"/>
         </w:rPr>
       </w:pPr>
@@ -1821,21 +1828,11 @@
         <w:rPr>
           <w:b/>
           <w:bCs/>
-          <w:sz w:val="24"/>
-          <w:szCs w:val="24"/>
+          <w:sz w:val="28"/>
+          <w:szCs w:val="28"/>
           <w:u w:val="single"/>
         </w:rPr>
-        <w:t>Variables</w:t>
-      </w:r>
-      <w:r>
-        <w:rPr>
-          <w:b/>
-          <w:bCs/>
-          <w:sz w:val="24"/>
-          <w:szCs w:val="24"/>
-          <w:u w:val="single"/>
-        </w:rPr>
-        <w:t>:</w:t>
+        <w:t>Variables:</w:t>
       </w:r>
     </w:p>
     <w:p>
@@ -2449,6 +2446,7 @@
           <w:sz w:val="24"/>
           <w:szCs w:val="24"/>
         </w:rPr>
+        <w:lastRenderedPageBreak/>
         <w:t>What are Primitive Values?</w:t>
       </w:r>
     </w:p>
@@ -2479,7 +2477,6 @@
           <w:sz w:val="24"/>
           <w:szCs w:val="24"/>
         </w:rPr>
-        <w:lastRenderedPageBreak/>
         <w:t>All Primitive Types in JavaScript</w:t>
       </w:r>
     </w:p>
@@ -2820,6 +2817,7 @@
           <w:sz w:val="24"/>
           <w:szCs w:val="24"/>
         </w:rPr>
+        <w:lastRenderedPageBreak/>
         <w:t>Stored in heap</w:t>
       </w:r>
     </w:p>
@@ -2878,7 +2876,6 @@
           <w:sz w:val="24"/>
           <w:szCs w:val="24"/>
         </w:rPr>
-        <w:lastRenderedPageBreak/>
         <w:drawing>
           <wp:inline distT="0" distB="0" distL="0" distR="0" wp14:anchorId="0A20C4C9" wp14:editId="262A0B98">
             <wp:extent cx="6157494" cy="2598645"/>
@@ -3684,8 +3681,8 @@
         <w:rPr>
           <w:b/>
           <w:bCs/>
-          <w:sz w:val="24"/>
-          <w:szCs w:val="24"/>
+          <w:sz w:val="28"/>
+          <w:szCs w:val="28"/>
           <w:u w:val="single"/>
         </w:rPr>
       </w:pPr>
@@ -3693,8 +3690,8 @@
         <w:rPr>
           <w:b/>
           <w:bCs/>
-          <w:sz w:val="24"/>
-          <w:szCs w:val="24"/>
+          <w:sz w:val="28"/>
+          <w:szCs w:val="28"/>
           <w:u w:val="single"/>
         </w:rPr>
         <w:t>Data types in JavaScript:</w:t>
@@ -11126,8 +11123,8 @@
         <w:rPr>
           <w:b/>
           <w:bCs/>
-          <w:sz w:val="24"/>
-          <w:szCs w:val="24"/>
+          <w:sz w:val="28"/>
+          <w:szCs w:val="28"/>
           <w:u w:val="single"/>
         </w:rPr>
       </w:pPr>
@@ -11135,8 +11132,8 @@
         <w:rPr>
           <w:b/>
           <w:bCs/>
-          <w:sz w:val="24"/>
-          <w:szCs w:val="24"/>
+          <w:sz w:val="28"/>
+          <w:szCs w:val="28"/>
           <w:u w:val="single"/>
         </w:rPr>
         <w:lastRenderedPageBreak/>
@@ -12164,7 +12161,7 @@
           <w:szCs w:val="24"/>
         </w:rPr>
         <w:drawing>
-          <wp:anchor distT="0" distB="0" distL="114300" distR="114300" simplePos="0" relativeHeight="251669504" behindDoc="1" locked="0" layoutInCell="1" allowOverlap="1" wp14:anchorId="550DC1DB" wp14:editId="17434AFE">
+          <wp:anchor distT="0" distB="0" distL="114300" distR="114300" simplePos="0" relativeHeight="251669504" behindDoc="1" locked="0" layoutInCell="1" allowOverlap="1" wp14:anchorId="550DC1DB" wp14:editId="3F457916">
             <wp:simplePos x="0" y="0"/>
             <wp:positionH relativeFrom="column">
               <wp:posOffset>4500563</wp:posOffset>
@@ -12317,8 +12314,8 @@
         <w:rPr>
           <w:b/>
           <w:bCs/>
-          <w:sz w:val="24"/>
-          <w:szCs w:val="24"/>
+          <w:sz w:val="28"/>
+          <w:szCs w:val="28"/>
           <w:u w:val="single"/>
         </w:rPr>
       </w:pPr>
@@ -12326,21 +12323,11 @@
         <w:rPr>
           <w:b/>
           <w:bCs/>
-          <w:sz w:val="24"/>
-          <w:szCs w:val="24"/>
+          <w:sz w:val="28"/>
+          <w:szCs w:val="28"/>
           <w:u w:val="single"/>
         </w:rPr>
-        <w:t>Array Mapping &amp; Filters</w:t>
-      </w:r>
-      <w:r>
-        <w:rPr>
-          <w:b/>
-          <w:bCs/>
-          <w:sz w:val="24"/>
-          <w:szCs w:val="24"/>
-          <w:u w:val="single"/>
-        </w:rPr>
-        <w:t>:</w:t>
+        <w:t>Array Mapping &amp; Filters:</w:t>
       </w:r>
     </w:p>
     <w:p>
@@ -12896,7 +12883,7 @@
           <w:szCs w:val="24"/>
         </w:rPr>
         <w:drawing>
-          <wp:anchor distT="0" distB="0" distL="114300" distR="114300" simplePos="0" relativeHeight="251671552" behindDoc="1" locked="0" layoutInCell="1" allowOverlap="1" wp14:anchorId="280F6B0D" wp14:editId="0ED833AE">
+          <wp:anchor distT="0" distB="0" distL="114300" distR="114300" simplePos="0" relativeHeight="251671552" behindDoc="1" locked="0" layoutInCell="1" allowOverlap="1" wp14:anchorId="280F6B0D" wp14:editId="638D5011">
             <wp:simplePos x="0" y="0"/>
             <wp:positionH relativeFrom="margin">
               <wp:posOffset>4129088</wp:posOffset>
@@ -12958,7 +12945,7 @@
           <w:szCs w:val="24"/>
         </w:rPr>
         <w:drawing>
-          <wp:anchor distT="0" distB="0" distL="114300" distR="114300" simplePos="0" relativeHeight="251670528" behindDoc="0" locked="0" layoutInCell="1" allowOverlap="1" wp14:anchorId="399410B9" wp14:editId="75E28A15">
+          <wp:anchor distT="0" distB="0" distL="114300" distR="114300" simplePos="0" relativeHeight="251670528" behindDoc="0" locked="0" layoutInCell="1" allowOverlap="1" wp14:anchorId="399410B9" wp14:editId="1A8E6389">
             <wp:simplePos x="0" y="0"/>
             <wp:positionH relativeFrom="margin">
               <wp:posOffset>-9525</wp:posOffset>
@@ -15957,8 +15944,8 @@
         <w:rPr>
           <w:b/>
           <w:bCs/>
-          <w:sz w:val="24"/>
-          <w:szCs w:val="24"/>
+          <w:sz w:val="28"/>
+          <w:szCs w:val="28"/>
           <w:u w:val="single"/>
         </w:rPr>
       </w:pPr>
@@ -15966,40 +15953,928 @@
         <w:rPr>
           <w:b/>
           <w:bCs/>
-          <w:sz w:val="24"/>
-          <w:szCs w:val="24"/>
+          <w:sz w:val="28"/>
+          <w:szCs w:val="28"/>
           <w:u w:val="single"/>
         </w:rPr>
-        <w:t>Creating Elements</w:t>
-      </w:r>
-      <w:r>
-        <w:rPr>
-          <w:b/>
-          <w:bCs/>
-          <w:sz w:val="24"/>
-          <w:szCs w:val="24"/>
-          <w:u w:val="single"/>
-        </w:rPr>
-        <w:t>:</w:t>
-      </w:r>
-    </w:p>
-    <w:p>
-      <w:pPr>
-        <w:rPr>
-          <w:sz w:val="24"/>
-          <w:szCs w:val="24"/>
-        </w:rPr>
-      </w:pPr>
+        <w:t>Creating Elements:</w:t>
+      </w:r>
+    </w:p>
+    <w:p>
+      <w:pPr>
+        <w:rPr>
+          <w:b/>
+          <w:bCs/>
+          <w:sz w:val="24"/>
+          <w:szCs w:val="24"/>
+        </w:rPr>
+      </w:pPr>
+      <w:r>
+        <w:rPr>
+          <w:b/>
+          <w:bCs/>
+          <w:sz w:val="24"/>
+          <w:szCs w:val="24"/>
+        </w:rPr>
+        <w:t>Creating Elements in JavaScript DOM</w:t>
+      </w:r>
+    </w:p>
+    <w:p>
+      <w:pPr>
+        <w:rPr>
+          <w:sz w:val="24"/>
+          <w:szCs w:val="24"/>
+        </w:rPr>
+      </w:pPr>
+      <w:r>
+        <w:rPr>
+          <w:sz w:val="24"/>
+          <w:szCs w:val="24"/>
+        </w:rPr>
+        <w:t>What is Creating Elements?</w:t>
+      </w:r>
+    </w:p>
+    <w:p>
+      <w:pPr>
+        <w:rPr>
+          <w:sz w:val="24"/>
+          <w:szCs w:val="24"/>
+        </w:rPr>
+      </w:pPr>
+      <w:r>
+        <w:rPr>
+          <w:sz w:val="24"/>
+          <w:szCs w:val="24"/>
+        </w:rPr>
+        <w:t>Creating elements means dynamically generating new HTML elements using JavaScript and adding them to the webpage without manually writing them in the HTML file.</w:t>
+      </w:r>
+    </w:p>
+    <w:p>
+      <w:pPr>
+        <w:rPr>
+          <w:b/>
+          <w:bCs/>
+          <w:sz w:val="24"/>
+          <w:szCs w:val="24"/>
+        </w:rPr>
+      </w:pPr>
+      <w:r>
+        <w:rPr>
+          <w:b/>
+          <w:bCs/>
+          <w:sz w:val="24"/>
+          <w:szCs w:val="24"/>
+        </w:rPr>
+        <w:t>Real-Time Example</w:t>
+      </w:r>
+    </w:p>
+    <w:p>
+      <w:pPr>
+        <w:rPr>
+          <w:sz w:val="24"/>
+          <w:szCs w:val="24"/>
+        </w:rPr>
+      </w:pPr>
+      <w:r>
+        <w:rPr>
+          <w:sz w:val="24"/>
+          <w:szCs w:val="24"/>
+        </w:rPr>
+        <w:t>Imagine a user submits a registration form.</w:t>
+      </w:r>
+    </w:p>
+    <w:p>
+      <w:pPr>
+        <w:rPr>
+          <w:sz w:val="24"/>
+          <w:szCs w:val="24"/>
+        </w:rPr>
+      </w:pPr>
+      <w:r>
+        <w:rPr>
+          <w:sz w:val="24"/>
+          <w:szCs w:val="24"/>
+        </w:rPr>
+        <w:t>Instead of writing:</w:t>
+      </w:r>
+      <w:r>
+        <w:rPr>
+          <w:sz w:val="24"/>
+          <w:szCs w:val="24"/>
+        </w:rPr>
+        <w:t xml:space="preserve"> </w:t>
+      </w:r>
+      <w:r>
+        <w:rPr>
+          <w:sz w:val="24"/>
+          <w:szCs w:val="24"/>
+        </w:rPr>
+        <w:t xml:space="preserve"> </w:t>
+      </w:r>
+      <w:r>
+        <w:rPr>
+          <w:sz w:val="24"/>
+          <w:szCs w:val="24"/>
+        </w:rPr>
+        <w:t>&lt;div&gt;User Registered Successfully&lt;/div&gt;</w:t>
+      </w:r>
+    </w:p>
+    <w:p>
+      <w:pPr>
+        <w:rPr>
+          <w:sz w:val="24"/>
+          <w:szCs w:val="24"/>
+        </w:rPr>
+      </w:pPr>
+      <w:r>
+        <w:rPr>
+          <w:sz w:val="24"/>
+          <w:szCs w:val="24"/>
+        </w:rPr>
+        <w:t>inside HTML beforehand, JavaScript creates it dynamically after the user clicks Submit.</w:t>
+      </w:r>
+      <w:r>
+        <w:rPr>
+          <w:sz w:val="24"/>
+          <w:szCs w:val="24"/>
+        </w:rPr>
+        <w:t xml:space="preserve"> </w:t>
+      </w:r>
+      <w:r>
+        <w:rPr>
+          <w:sz w:val="24"/>
+          <w:szCs w:val="24"/>
+        </w:rPr>
+        <w:t xml:space="preserve">This is called </w:t>
+      </w:r>
+      <w:r>
+        <w:rPr>
+          <w:b/>
+          <w:bCs/>
+          <w:sz w:val="24"/>
+          <w:szCs w:val="24"/>
+        </w:rPr>
+        <w:t>DOM Element Creation</w:t>
+      </w:r>
+      <w:r>
+        <w:rPr>
+          <w:sz w:val="24"/>
+          <w:szCs w:val="24"/>
+        </w:rPr>
+        <w:t>.</w:t>
+      </w:r>
+    </w:p>
+    <w:p>
+      <w:pPr>
+        <w:rPr>
+          <w:b/>
+          <w:bCs/>
+          <w:sz w:val="24"/>
+          <w:szCs w:val="24"/>
+        </w:rPr>
+      </w:pPr>
+      <w:r>
+        <w:rPr>
+          <w:b/>
+          <w:bCs/>
+          <w:sz w:val="24"/>
+          <w:szCs w:val="24"/>
+        </w:rPr>
+        <w:t>Why Do We Create Elements?</w:t>
+      </w:r>
+    </w:p>
+    <w:p>
+      <w:pPr>
+        <w:rPr>
+          <w:sz w:val="24"/>
+          <w:szCs w:val="24"/>
+        </w:rPr>
+      </w:pPr>
+      <w:r>
+        <w:rPr>
+          <w:sz w:val="24"/>
+          <w:szCs w:val="24"/>
+        </w:rPr>
+        <w:t>We create elements when data is generated dynamically.</w:t>
+      </w:r>
+    </w:p>
+    <w:p>
+      <w:pPr>
+        <w:rPr>
+          <w:sz w:val="24"/>
+          <w:szCs w:val="24"/>
+        </w:rPr>
+      </w:pPr>
+      <w:r>
+        <w:rPr>
+          <w:sz w:val="24"/>
+          <w:szCs w:val="24"/>
+        </w:rPr>
+        <w:t>Examples:</w:t>
+      </w:r>
     </w:p>
     <w:p>
       <w:pPr>
         <w:pStyle w:val="ListParagraph"/>
-        <w:ind w:left="1440"/>
-        <w:rPr>
-          <w:sz w:val="24"/>
-          <w:szCs w:val="24"/>
-        </w:rPr>
-      </w:pPr>
+        <w:numPr>
+          <w:ilvl w:val="0"/>
+          <w:numId w:val="4"/>
+        </w:numPr>
+        <w:rPr>
+          <w:sz w:val="24"/>
+          <w:szCs w:val="24"/>
+        </w:rPr>
+      </w:pPr>
+      <w:r>
+        <w:rPr>
+          <w:sz w:val="24"/>
+          <w:szCs w:val="24"/>
+        </w:rPr>
+        <w:t>Adding comments in YouTube</w:t>
+      </w:r>
+    </w:p>
+    <w:p>
+      <w:pPr>
+        <w:pStyle w:val="ListParagraph"/>
+        <w:numPr>
+          <w:ilvl w:val="0"/>
+          <w:numId w:val="4"/>
+        </w:numPr>
+        <w:rPr>
+          <w:sz w:val="24"/>
+          <w:szCs w:val="24"/>
+        </w:rPr>
+      </w:pPr>
+      <w:r>
+        <w:rPr>
+          <w:sz w:val="24"/>
+          <w:szCs w:val="24"/>
+        </w:rPr>
+        <w:t>Adding products in Amazon</w:t>
+      </w:r>
+    </w:p>
+    <w:p>
+      <w:pPr>
+        <w:pStyle w:val="ListParagraph"/>
+        <w:numPr>
+          <w:ilvl w:val="0"/>
+          <w:numId w:val="4"/>
+        </w:numPr>
+        <w:rPr>
+          <w:sz w:val="24"/>
+          <w:szCs w:val="24"/>
+        </w:rPr>
+      </w:pPr>
+      <w:r>
+        <w:rPr>
+          <w:sz w:val="24"/>
+          <w:szCs w:val="24"/>
+        </w:rPr>
+        <w:t>Adding messages in WhatsApp</w:t>
+      </w:r>
+    </w:p>
+    <w:p>
+      <w:pPr>
+        <w:pStyle w:val="ListParagraph"/>
+        <w:numPr>
+          <w:ilvl w:val="0"/>
+          <w:numId w:val="4"/>
+        </w:numPr>
+        <w:rPr>
+          <w:sz w:val="24"/>
+          <w:szCs w:val="24"/>
+        </w:rPr>
+      </w:pPr>
+      <w:r>
+        <w:rPr>
+          <w:sz w:val="24"/>
+          <w:szCs w:val="24"/>
+        </w:rPr>
+        <w:t>Adding tasks in a To-Do application</w:t>
+      </w:r>
+    </w:p>
+    <w:p>
+      <w:pPr>
+        <w:pStyle w:val="ListParagraph"/>
+        <w:numPr>
+          <w:ilvl w:val="0"/>
+          <w:numId w:val="4"/>
+        </w:numPr>
+        <w:rPr>
+          <w:sz w:val="24"/>
+          <w:szCs w:val="24"/>
+        </w:rPr>
+      </w:pPr>
+      <w:r>
+        <w:rPr>
+          <w:sz w:val="24"/>
+          <w:szCs w:val="24"/>
+        </w:rPr>
+        <w:t>Displaying API data</w:t>
+      </w:r>
+    </w:p>
+    <w:p>
+      <w:pPr>
+        <w:rPr>
+          <w:b/>
+          <w:bCs/>
+          <w:sz w:val="24"/>
+          <w:szCs w:val="24"/>
+        </w:rPr>
+      </w:pPr>
+      <w:r>
+        <w:rPr>
+          <w:b/>
+          <w:bCs/>
+          <w:sz w:val="24"/>
+          <w:szCs w:val="24"/>
+        </w:rPr>
+        <w:t>Steps to Create an Element</w:t>
+      </w:r>
+    </w:p>
+    <w:p>
+      <w:pPr>
+        <w:rPr>
+          <w:sz w:val="24"/>
+          <w:szCs w:val="24"/>
+        </w:rPr>
+      </w:pPr>
+      <w:r>
+        <w:rPr>
+          <w:sz w:val="24"/>
+          <w:szCs w:val="24"/>
+        </w:rPr>
+        <w:t>There are three important steps.</w:t>
+      </w:r>
+    </w:p>
+    <w:p>
+      <w:pPr>
+        <w:rPr>
+          <w:sz w:val="24"/>
+          <w:szCs w:val="24"/>
+        </w:rPr>
+      </w:pPr>
+      <w:r>
+        <w:rPr>
+          <w:sz w:val="24"/>
+          <w:szCs w:val="24"/>
+        </w:rPr>
+        <w:drawing>
+          <wp:anchor distT="0" distB="0" distL="114300" distR="114300" simplePos="0" relativeHeight="251675648" behindDoc="0" locked="0" layoutInCell="1" allowOverlap="1" wp14:anchorId="72A4C6A1" wp14:editId="6D395A2D">
+            <wp:simplePos x="0" y="0"/>
+            <wp:positionH relativeFrom="margin">
+              <wp:posOffset>3009900</wp:posOffset>
+            </wp:positionH>
+            <wp:positionV relativeFrom="paragraph">
+              <wp:posOffset>5080</wp:posOffset>
+            </wp:positionV>
+            <wp:extent cx="3629660" cy="2356485"/>
+            <wp:effectExtent l="0" t="0" r="8890" b="5715"/>
+            <wp:wrapThrough wrapText="bothSides">
+              <wp:wrapPolygon edited="0">
+                <wp:start x="0" y="0"/>
+                <wp:lineTo x="0" y="21478"/>
+                <wp:lineTo x="21540" y="21478"/>
+                <wp:lineTo x="21540" y="0"/>
+                <wp:lineTo x="0" y="0"/>
+              </wp:wrapPolygon>
+            </wp:wrapThrough>
+            <wp:docPr id="318188595" name="Picture 1"/>
+            <wp:cNvGraphicFramePr>
+              <a:graphicFrameLocks xmlns:a="http://schemas.openxmlformats.org/drawingml/2006/main" noChangeAspect="1"/>
+            </wp:cNvGraphicFramePr>
+            <a:graphic xmlns:a="http://schemas.openxmlformats.org/drawingml/2006/main">
+              <a:graphicData uri="http://schemas.openxmlformats.org/drawingml/2006/picture">
+                <pic:pic xmlns:pic="http://schemas.openxmlformats.org/drawingml/2006/picture">
+                  <pic:nvPicPr>
+                    <pic:cNvPr id="318188595" name=""/>
+                    <pic:cNvPicPr/>
+                  </pic:nvPicPr>
+                  <pic:blipFill>
+                    <a:blip r:embed="rId36" cstate="print">
+                      <a:extLst>
+                        <a:ext uri="{28A0092B-C50C-407E-A947-70E740481C1C}">
+                          <a14:useLocalDpi xmlns:a14="http://schemas.microsoft.com/office/drawing/2010/main" val="0"/>
+                        </a:ext>
+                      </a:extLst>
+                    </a:blip>
+                    <a:stretch>
+                      <a:fillRect/>
+                    </a:stretch>
+                  </pic:blipFill>
+                  <pic:spPr>
+                    <a:xfrm>
+                      <a:off x="0" y="0"/>
+                      <a:ext cx="3629660" cy="2356485"/>
+                    </a:xfrm>
+                    <a:prstGeom prst="rect">
+                      <a:avLst/>
+                    </a:prstGeom>
+                  </pic:spPr>
+                </pic:pic>
+              </a:graphicData>
+            </a:graphic>
+            <wp14:sizeRelH relativeFrom="page">
+              <wp14:pctWidth>0</wp14:pctWidth>
+            </wp14:sizeRelH>
+            <wp14:sizeRelV relativeFrom="page">
+              <wp14:pctHeight>0</wp14:pctHeight>
+            </wp14:sizeRelV>
+          </wp:anchor>
+        </w:drawing>
+      </w:r>
+      <w:r>
+        <w:rPr>
+          <w:b/>
+          <w:bCs/>
+          <w:sz w:val="24"/>
+          <w:szCs w:val="24"/>
+        </w:rPr>
+        <w:t>Step 1:</w:t>
+      </w:r>
+      <w:r>
+        <w:rPr>
+          <w:sz w:val="24"/>
+          <w:szCs w:val="24"/>
+        </w:rPr>
+        <w:t xml:space="preserve"> Create Element</w:t>
+      </w:r>
+    </w:p>
+    <w:p>
+      <w:pPr>
+        <w:rPr>
+          <w:sz w:val="24"/>
+          <w:szCs w:val="24"/>
+        </w:rPr>
+      </w:pPr>
+      <w:r>
+        <w:rPr>
+          <w:sz w:val="24"/>
+          <w:szCs w:val="24"/>
+        </w:rPr>
+        <w:t xml:space="preserve">let heading = </w:t>
+      </w:r>
+      <w:r>
+        <w:rPr>
+          <w:sz w:val="24"/>
+          <w:szCs w:val="24"/>
+        </w:rPr>
+        <w:t>document. createElement</w:t>
+      </w:r>
+      <w:r>
+        <w:rPr>
+          <w:sz w:val="24"/>
+          <w:szCs w:val="24"/>
+        </w:rPr>
+        <w:t>("h1"</w:t>
+      </w:r>
+      <w:r>
+        <w:rPr>
+          <w:sz w:val="24"/>
+          <w:szCs w:val="24"/>
+        </w:rPr>
+        <w:t>);</w:t>
+      </w:r>
+      <w:r>
+        <w:rPr>
+          <w:sz w:val="24"/>
+          <w:szCs w:val="24"/>
+        </w:rPr>
+        <w:br/>
+      </w:r>
+      <w:r>
+        <w:rPr>
+          <w:sz w:val="24"/>
+          <w:szCs w:val="24"/>
+        </w:rPr>
+        <w:t xml:space="preserve">This </w:t>
+      </w:r>
+      <w:r>
+        <w:rPr>
+          <w:sz w:val="24"/>
+          <w:szCs w:val="24"/>
+        </w:rPr>
+        <w:t>Creates:</w:t>
+      </w:r>
+      <w:r>
+        <w:rPr>
+          <w:sz w:val="24"/>
+          <w:szCs w:val="24"/>
+        </w:rPr>
+        <w:t xml:space="preserve"> </w:t>
+      </w:r>
+      <w:r>
+        <w:rPr>
+          <w:sz w:val="24"/>
+          <w:szCs w:val="24"/>
+        </w:rPr>
+        <w:t>&lt;h1&gt;&lt;/h1&gt;</w:t>
+      </w:r>
+      <w:r>
+        <w:rPr>
+          <w:sz w:val="24"/>
+          <w:szCs w:val="24"/>
+        </w:rPr>
+        <w:t xml:space="preserve">       </w:t>
+      </w:r>
+      <w:r>
+        <w:rPr>
+          <w:sz w:val="24"/>
+          <w:szCs w:val="24"/>
+        </w:rPr>
+        <w:t>inside memory.</w:t>
+      </w:r>
+    </w:p>
+    <w:p>
+      <w:pPr>
+        <w:rPr>
+          <w:sz w:val="24"/>
+          <w:szCs w:val="24"/>
+        </w:rPr>
+      </w:pPr>
+      <w:r>
+        <w:rPr>
+          <w:b/>
+          <w:bCs/>
+          <w:sz w:val="24"/>
+          <w:szCs w:val="24"/>
+        </w:rPr>
+        <w:t>Step 2:</w:t>
+      </w:r>
+      <w:r>
+        <w:rPr>
+          <w:sz w:val="24"/>
+          <w:szCs w:val="24"/>
+        </w:rPr>
+        <w:t xml:space="preserve"> Add Content</w:t>
+      </w:r>
+    </w:p>
+    <w:p>
+      <w:pPr>
+        <w:rPr>
+          <w:sz w:val="24"/>
+          <w:szCs w:val="24"/>
+        </w:rPr>
+      </w:pPr>
+      <w:r>
+        <w:rPr>
+          <w:sz w:val="24"/>
+          <w:szCs w:val="24"/>
+        </w:rPr>
+        <w:t>heading.</w:t>
+      </w:r>
+      <w:r>
+        <w:rPr>
+          <w:sz w:val="24"/>
+          <w:szCs w:val="24"/>
+        </w:rPr>
+        <w:t xml:space="preserve"> </w:t>
+      </w:r>
+      <w:r>
+        <w:rPr>
+          <w:sz w:val="24"/>
+          <w:szCs w:val="24"/>
+        </w:rPr>
+        <w:t>innerText = "Welcome to JavaScript";</w:t>
+      </w:r>
+      <w:r>
+        <w:rPr>
+          <w:sz w:val="24"/>
+          <w:szCs w:val="24"/>
+        </w:rPr>
+        <w:br/>
+      </w:r>
+      <w:r>
+        <w:rPr>
+          <w:sz w:val="24"/>
+          <w:szCs w:val="24"/>
+        </w:rPr>
+        <w:t>Now it becomes:</w:t>
+      </w:r>
+      <w:r>
+        <w:rPr>
+          <w:sz w:val="24"/>
+          <w:szCs w:val="24"/>
+        </w:rPr>
+        <w:br/>
+      </w:r>
+      <w:r>
+        <w:rPr>
+          <w:sz w:val="24"/>
+          <w:szCs w:val="24"/>
+        </w:rPr>
+        <w:t>&lt;h1&gt;Welcome to JavaScript&lt;/h1&gt;</w:t>
+      </w:r>
+    </w:p>
+    <w:p>
+      <w:pPr>
+        <w:rPr>
+          <w:sz w:val="24"/>
+          <w:szCs w:val="24"/>
+        </w:rPr>
+      </w:pPr>
+      <w:r>
+        <w:rPr>
+          <w:b/>
+          <w:bCs/>
+          <w:sz w:val="24"/>
+          <w:szCs w:val="24"/>
+        </w:rPr>
+        <w:t>Step 3:</w:t>
+      </w:r>
+      <w:r>
+        <w:rPr>
+          <w:sz w:val="24"/>
+          <w:szCs w:val="24"/>
+        </w:rPr>
+        <w:t xml:space="preserve"> Append to DOM</w:t>
+      </w:r>
+    </w:p>
+    <w:p>
+      <w:pPr>
+        <w:rPr>
+          <w:sz w:val="24"/>
+          <w:szCs w:val="24"/>
+        </w:rPr>
+      </w:pPr>
+      <w:r>
+        <w:rPr>
+          <w:sz w:val="24"/>
+          <w:szCs w:val="24"/>
+        </w:rPr>
+        <w:t>document. body</w:t>
+      </w:r>
+      <w:r>
+        <w:rPr>
+          <w:sz w:val="24"/>
+          <w:szCs w:val="24"/>
+        </w:rPr>
+        <w:t>.</w:t>
+      </w:r>
+      <w:r>
+        <w:rPr>
+          <w:sz w:val="24"/>
+          <w:szCs w:val="24"/>
+        </w:rPr>
+        <w:t xml:space="preserve"> </w:t>
+      </w:r>
+      <w:r>
+        <w:rPr>
+          <w:sz w:val="24"/>
+          <w:szCs w:val="24"/>
+        </w:rPr>
+        <w:t>appendChild</w:t>
+      </w:r>
+      <w:r>
+        <w:rPr>
+          <w:sz w:val="24"/>
+          <w:szCs w:val="24"/>
+        </w:rPr>
+        <w:t xml:space="preserve"> </w:t>
+      </w:r>
+      <w:r>
+        <w:rPr>
+          <w:sz w:val="24"/>
+          <w:szCs w:val="24"/>
+        </w:rPr>
+        <w:t>(heading);</w:t>
+      </w:r>
+      <w:r>
+        <w:rPr>
+          <w:sz w:val="24"/>
+          <w:szCs w:val="24"/>
+        </w:rPr>
+        <w:br/>
+      </w:r>
+      <w:r>
+        <w:rPr>
+          <w:sz w:val="24"/>
+          <w:szCs w:val="24"/>
+        </w:rPr>
+        <w:t>Now the element appears on the webpage.</w:t>
+      </w:r>
+    </w:p>
+    <w:p>
+      <w:pPr>
+        <w:rPr>
+          <w:b/>
+          <w:bCs/>
+          <w:sz w:val="24"/>
+          <w:szCs w:val="24"/>
+        </w:rPr>
+      </w:pPr>
+      <w:r>
+        <w:rPr>
+          <w:b/>
+          <w:bCs/>
+          <w:sz w:val="24"/>
+          <w:szCs w:val="24"/>
+        </w:rPr>
+        <w:t>What does createElement</w:t>
+      </w:r>
+      <w:r>
+        <w:rPr>
+          <w:b/>
+          <w:bCs/>
+          <w:sz w:val="24"/>
+          <w:szCs w:val="24"/>
+        </w:rPr>
+        <w:t xml:space="preserve"> </w:t>
+      </w:r>
+      <w:r>
+        <w:rPr>
+          <w:b/>
+          <w:bCs/>
+          <w:sz w:val="24"/>
+          <w:szCs w:val="24"/>
+        </w:rPr>
+        <w:t>() do?</w:t>
+      </w:r>
+    </w:p>
+    <w:p>
+      <w:pPr>
+        <w:rPr>
+          <w:sz w:val="24"/>
+          <w:szCs w:val="24"/>
+        </w:rPr>
+      </w:pPr>
+      <w:r>
+        <w:rPr>
+          <w:sz w:val="24"/>
+          <w:szCs w:val="24"/>
+        </w:rPr>
+        <w:t xml:space="preserve">createElement </w:t>
+      </w:r>
+      <w:r>
+        <w:rPr>
+          <w:sz w:val="24"/>
+          <w:szCs w:val="24"/>
+        </w:rPr>
+        <w:t>() creates a new HTML element in memory. It does not appear on the webpage until it is appended to the DOM using methods like appendChild</w:t>
+      </w:r>
+      <w:r>
+        <w:rPr>
+          <w:sz w:val="24"/>
+          <w:szCs w:val="24"/>
+        </w:rPr>
+        <w:t xml:space="preserve"> </w:t>
+      </w:r>
+      <w:r>
+        <w:rPr>
+          <w:sz w:val="24"/>
+          <w:szCs w:val="24"/>
+        </w:rPr>
+        <w:t>().</w:t>
+      </w:r>
+    </w:p>
+    <w:p>
+      <w:pPr>
+        <w:rPr>
+          <w:b/>
+          <w:bCs/>
+          <w:sz w:val="24"/>
+          <w:szCs w:val="24"/>
+        </w:rPr>
+      </w:pPr>
+      <w:r>
+        <w:rPr>
+          <w:b/>
+          <w:bCs/>
+          <w:sz w:val="24"/>
+          <w:szCs w:val="24"/>
+        </w:rPr>
+        <w:lastRenderedPageBreak/>
+        <w:t>What is the difference between createElement</w:t>
+      </w:r>
+      <w:r>
+        <w:rPr>
+          <w:b/>
+          <w:bCs/>
+          <w:sz w:val="24"/>
+          <w:szCs w:val="24"/>
+        </w:rPr>
+        <w:t xml:space="preserve"> </w:t>
+      </w:r>
+      <w:r>
+        <w:rPr>
+          <w:b/>
+          <w:bCs/>
+          <w:sz w:val="24"/>
+          <w:szCs w:val="24"/>
+        </w:rPr>
+        <w:t>() and appendChild</w:t>
+      </w:r>
+      <w:r>
+        <w:rPr>
+          <w:b/>
+          <w:bCs/>
+          <w:sz w:val="24"/>
+          <w:szCs w:val="24"/>
+        </w:rPr>
+        <w:t xml:space="preserve"> </w:t>
+      </w:r>
+      <w:r>
+        <w:rPr>
+          <w:b/>
+          <w:bCs/>
+          <w:sz w:val="24"/>
+          <w:szCs w:val="24"/>
+        </w:rPr>
+        <w:t>()?</w:t>
+      </w:r>
+    </w:p>
+    <w:p>
+      <w:pPr>
+        <w:rPr>
+          <w:sz w:val="24"/>
+          <w:szCs w:val="24"/>
+        </w:rPr>
+      </w:pPr>
+      <w:r>
+        <w:rPr>
+          <w:sz w:val="24"/>
+          <w:szCs w:val="24"/>
+        </w:rPr>
+        <w:t>createElement</w:t>
+      </w:r>
+      <w:r>
+        <w:rPr>
+          <w:sz w:val="24"/>
+          <w:szCs w:val="24"/>
+        </w:rPr>
+        <w:t xml:space="preserve"> </w:t>
+      </w:r>
+      <w:r>
+        <w:rPr>
+          <w:sz w:val="24"/>
+          <w:szCs w:val="24"/>
+        </w:rPr>
+        <w:t xml:space="preserve">() creates an element in memory, whereas </w:t>
+      </w:r>
+      <w:r>
+        <w:rPr>
+          <w:sz w:val="24"/>
+          <w:szCs w:val="24"/>
+        </w:rPr>
+        <w:t>appendChild (</w:t>
+      </w:r>
+      <w:r>
+        <w:rPr>
+          <w:sz w:val="24"/>
+          <w:szCs w:val="24"/>
+        </w:rPr>
+        <w:t>) adds that element into the DOM so that it becomes visible on the webpage.</w:t>
+      </w:r>
+    </w:p>
+    <w:p>
+      <w:pPr>
+        <w:rPr>
+          <w:sz w:val="24"/>
+          <w:szCs w:val="24"/>
+        </w:rPr>
+      </w:pPr>
+      <w:r>
+        <w:rPr>
+          <w:sz w:val="24"/>
+          <w:szCs w:val="24"/>
+        </w:rPr>
+        <w:t xml:space="preserve">"Creating elements in JavaScript means dynamically generating HTML elements using DOM methods. We use </w:t>
+      </w:r>
+      <w:r>
+        <w:rPr>
+          <w:sz w:val="24"/>
+          <w:szCs w:val="24"/>
+        </w:rPr>
+        <w:t>document. createElement</w:t>
+      </w:r>
+      <w:r>
+        <w:rPr>
+          <w:sz w:val="24"/>
+          <w:szCs w:val="24"/>
+        </w:rPr>
+        <w:t xml:space="preserve"> </w:t>
+      </w:r>
+      <w:r>
+        <w:rPr>
+          <w:sz w:val="24"/>
+          <w:szCs w:val="24"/>
+        </w:rPr>
+        <w:t xml:space="preserve">() to create an element, set its content using innerText or innerHTML, and then add it to the webpage using </w:t>
+      </w:r>
+      <w:r>
+        <w:rPr>
+          <w:sz w:val="24"/>
+          <w:szCs w:val="24"/>
+        </w:rPr>
+        <w:t>appendChild (</w:t>
+      </w:r>
+      <w:r>
+        <w:rPr>
+          <w:sz w:val="24"/>
+          <w:szCs w:val="24"/>
+        </w:rPr>
+        <w:t>). This approach is commonly used in applications such as To-Do lists, chat applications, comment sections, and rendering API data dynamically."</w:t>
+      </w:r>
     </w:p>
     <w:p>
       <w:pPr>
@@ -17995,7 +18870,6 @@
     <w:next w:val="Normal"/>
     <w:link w:val="Heading3Char"/>
     <w:uiPriority w:val="9"/>
-    <w:semiHidden/>
     <w:unhideWhenUsed/>
     <w:qFormat/>
     <w:rsid w:val="001F49D3"/>
@@ -18147,7 +19021,6 @@
   <w:style w:type="character" w:default="1" w:styleId="DefaultParagraphFont">
     <w:name w:val="Default Paragraph Font"/>
     <w:uiPriority w:val="1"/>
-    <w:semiHidden/>
     <w:unhideWhenUsed/>
   </w:style>
   <w:style w:type="table" w:default="1" w:styleId="TableNormal">
@@ -18202,7 +19075,6 @@
     <w:basedOn w:val="DefaultParagraphFont"/>
     <w:link w:val="Heading3"/>
     <w:uiPriority w:val="9"/>
-    <w:semiHidden/>
     <w:rsid w:val="001F49D3"/>
     <w:rPr>
       <w:rFonts w:eastAsiaTheme="majorEastAsia" w:cstheme="majorBidi"/>

</xml_diff>

<commit_message>
Added JavaScript notes and creating elements topic
</commit_message>
<xml_diff>
--- a/Interview prep/JavaScript Notes.docx
+++ b/Interview prep/JavaScript Notes.docx
@@ -12161,7 +12161,7 @@
           <w:szCs w:val="24"/>
         </w:rPr>
         <w:drawing>
-          <wp:anchor distT="0" distB="0" distL="114300" distR="114300" simplePos="0" relativeHeight="251669504" behindDoc="1" locked="0" layoutInCell="1" allowOverlap="1" wp14:anchorId="550DC1DB" wp14:editId="3F457916">
+          <wp:anchor distT="0" distB="0" distL="114300" distR="114300" simplePos="0" relativeHeight="251669504" behindDoc="1" locked="0" layoutInCell="1" allowOverlap="1" wp14:anchorId="550DC1DB" wp14:editId="303D3E77">
             <wp:simplePos x="0" y="0"/>
             <wp:positionH relativeFrom="column">
               <wp:posOffset>4500563</wp:posOffset>
@@ -12883,7 +12883,7 @@
           <w:szCs w:val="24"/>
         </w:rPr>
         <w:drawing>
-          <wp:anchor distT="0" distB="0" distL="114300" distR="114300" simplePos="0" relativeHeight="251671552" behindDoc="1" locked="0" layoutInCell="1" allowOverlap="1" wp14:anchorId="280F6B0D" wp14:editId="638D5011">
+          <wp:anchor distT="0" distB="0" distL="114300" distR="114300" simplePos="0" relativeHeight="251671552" behindDoc="1" locked="0" layoutInCell="1" allowOverlap="1" wp14:anchorId="280F6B0D" wp14:editId="116D7C10">
             <wp:simplePos x="0" y="0"/>
             <wp:positionH relativeFrom="margin">
               <wp:posOffset>4129088</wp:posOffset>
@@ -12945,7 +12945,7 @@
           <w:szCs w:val="24"/>
         </w:rPr>
         <w:drawing>
-          <wp:anchor distT="0" distB="0" distL="114300" distR="114300" simplePos="0" relativeHeight="251670528" behindDoc="0" locked="0" layoutInCell="1" allowOverlap="1" wp14:anchorId="399410B9" wp14:editId="1A8E6389">
+          <wp:anchor distT="0" distB="0" distL="114300" distR="114300" simplePos="0" relativeHeight="251670528" behindDoc="0" locked="0" layoutInCell="1" allowOverlap="1" wp14:anchorId="399410B9" wp14:editId="6659786B">
             <wp:simplePos x="0" y="0"/>
             <wp:positionH relativeFrom="margin">
               <wp:posOffset>-9525</wp:posOffset>
@@ -16316,11 +16316,12 @@
       </w:pPr>
       <w:r>
         <w:rPr>
+          <w:noProof/>
           <w:sz w:val="24"/>
           <w:szCs w:val="24"/>
         </w:rPr>
         <w:drawing>
-          <wp:anchor distT="0" distB="0" distL="114300" distR="114300" simplePos="0" relativeHeight="251675648" behindDoc="0" locked="0" layoutInCell="1" allowOverlap="1" wp14:anchorId="72A4C6A1" wp14:editId="6D395A2D">
+          <wp:anchor distT="0" distB="0" distL="114300" distR="114300" simplePos="0" relativeHeight="251675648" behindDoc="0" locked="0" layoutInCell="1" allowOverlap="1" wp14:anchorId="72A4C6A1" wp14:editId="031C0E33">
             <wp:simplePos x="0" y="0"/>
             <wp:positionH relativeFrom="margin">
               <wp:posOffset>3009900</wp:posOffset>
@@ -16441,12 +16442,6 @@
           <w:szCs w:val="24"/>
         </w:rPr>
         <w:br/>
-      </w:r>
-      <w:r>
-        <w:rPr>
-          <w:sz w:val="24"/>
-          <w:szCs w:val="24"/>
-        </w:rPr>
         <w:t xml:space="preserve">This </w:t>
       </w:r>
       <w:r>
@@ -16602,14 +16597,7 @@
           <w:sz w:val="24"/>
           <w:szCs w:val="24"/>
         </w:rPr>
-        <w:t>document. body</w:t>
-      </w:r>
-      <w:r>
-        <w:rPr>
-          <w:sz w:val="24"/>
-          <w:szCs w:val="24"/>
-        </w:rPr>
-        <w:t>.</w:t>
+        <w:t>document. body.</w:t>
       </w:r>
       <w:r>
         <w:rPr>
@@ -16838,14 +16826,7 @@
           <w:sz w:val="24"/>
           <w:szCs w:val="24"/>
         </w:rPr>
-        <w:t xml:space="preserve">"Creating elements in JavaScript means dynamically generating HTML elements using DOM methods. We use </w:t>
-      </w:r>
-      <w:r>
-        <w:rPr>
-          <w:sz w:val="24"/>
-          <w:szCs w:val="24"/>
-        </w:rPr>
-        <w:t>document. createElement</w:t>
+        <w:t>"Creating elements in JavaScript means dynamically generating HTML elements using DOM methods. We use document. createElement</w:t>
       </w:r>
       <w:r>
         <w:rPr>
@@ -16859,22 +16840,1312 @@
           <w:sz w:val="24"/>
           <w:szCs w:val="24"/>
         </w:rPr>
-        <w:t xml:space="preserve">() to create an element, set its content using innerText or innerHTML, and then add it to the webpage using </w:t>
-      </w:r>
-      <w:r>
-        <w:rPr>
-          <w:sz w:val="24"/>
-          <w:szCs w:val="24"/>
-        </w:rPr>
-        <w:t>appendChild (</w:t>
-      </w:r>
-      <w:r>
-        <w:rPr>
-          <w:sz w:val="24"/>
-          <w:szCs w:val="24"/>
-        </w:rPr>
-        <w:t>). This approach is commonly used in applications such as To-Do lists, chat applications, comment sections, and rendering API data dynamically."</w:t>
-      </w:r>
+        <w:t>() to create an element, set its content using innerText or innerHTML, and then add it to the webpage using appendChild (). This approach is commonly used in applications such as To-Do lists, chat applications, comment sections, and rendering API data dynamically."</w:t>
+      </w:r>
+    </w:p>
+    <w:p>
+      <w:pPr>
+        <w:jc w:val="center"/>
+        <w:rPr>
+          <w:sz w:val="24"/>
+          <w:szCs w:val="24"/>
+        </w:rPr>
+      </w:pPr>
+      <w:r>
+        <w:rPr>
+          <w:b/>
+          <w:bCs/>
+          <w:sz w:val="28"/>
+          <w:szCs w:val="28"/>
+          <w:u w:val="single"/>
+        </w:rPr>
+        <w:t>Event Listeners in JavaScript</w:t>
+      </w:r>
+    </w:p>
+    <w:p>
+      <w:pPr>
+        <w:rPr>
+          <w:b/>
+          <w:bCs/>
+          <w:sz w:val="24"/>
+          <w:szCs w:val="24"/>
+        </w:rPr>
+      </w:pPr>
+      <w:r>
+        <w:rPr>
+          <w:b/>
+          <w:bCs/>
+          <w:sz w:val="24"/>
+          <w:szCs w:val="24"/>
+        </w:rPr>
+        <w:t>What is an Event?</w:t>
+      </w:r>
+    </w:p>
+    <w:p>
+      <w:pPr>
+        <w:rPr>
+          <w:sz w:val="24"/>
+          <w:szCs w:val="24"/>
+        </w:rPr>
+      </w:pPr>
+      <w:r>
+        <w:rPr>
+          <w:sz w:val="24"/>
+          <w:szCs w:val="24"/>
+        </w:rPr>
+        <w:t>An event is an action performed by the user or browser.</w:t>
+      </w:r>
+    </w:p>
+    <w:p>
+      <w:pPr>
+        <w:rPr>
+          <w:sz w:val="24"/>
+          <w:szCs w:val="24"/>
+        </w:rPr>
+      </w:pPr>
+      <w:r>
+        <w:rPr>
+          <w:sz w:val="24"/>
+          <w:szCs w:val="24"/>
+        </w:rPr>
+        <w:t>Examples</w:t>
+      </w:r>
+      <w:r>
+        <w:rPr>
+          <w:sz w:val="24"/>
+          <w:szCs w:val="24"/>
+        </w:rPr>
+        <w:t>:</w:t>
+      </w:r>
+    </w:p>
+    <w:p>
+      <w:pPr>
+        <w:pStyle w:val="ListParagraph"/>
+        <w:numPr>
+          <w:ilvl w:val="0"/>
+          <w:numId w:val="13"/>
+        </w:numPr>
+        <w:rPr>
+          <w:sz w:val="24"/>
+          <w:szCs w:val="24"/>
+        </w:rPr>
+      </w:pPr>
+      <w:r>
+        <w:rPr>
+          <w:sz w:val="24"/>
+          <w:szCs w:val="24"/>
+        </w:rPr>
+        <w:t xml:space="preserve">Clicking a button </w:t>
+      </w:r>
+    </w:p>
+    <w:p>
+      <w:pPr>
+        <w:pStyle w:val="ListParagraph"/>
+        <w:numPr>
+          <w:ilvl w:val="0"/>
+          <w:numId w:val="13"/>
+        </w:numPr>
+        <w:rPr>
+          <w:sz w:val="24"/>
+          <w:szCs w:val="24"/>
+        </w:rPr>
+      </w:pPr>
+      <w:r>
+        <w:rPr>
+          <w:sz w:val="24"/>
+          <w:szCs w:val="24"/>
+        </w:rPr>
+        <w:t xml:space="preserve">Typing in an input field </w:t>
+      </w:r>
+    </w:p>
+    <w:p>
+      <w:pPr>
+        <w:pStyle w:val="ListParagraph"/>
+        <w:numPr>
+          <w:ilvl w:val="0"/>
+          <w:numId w:val="13"/>
+        </w:numPr>
+        <w:rPr>
+          <w:sz w:val="24"/>
+          <w:szCs w:val="24"/>
+        </w:rPr>
+      </w:pPr>
+      <w:r>
+        <w:rPr>
+          <w:sz w:val="24"/>
+          <w:szCs w:val="24"/>
+        </w:rPr>
+        <w:t xml:space="preserve">Moving the mouse </w:t>
+      </w:r>
+    </w:p>
+    <w:p>
+      <w:pPr>
+        <w:pStyle w:val="ListParagraph"/>
+        <w:numPr>
+          <w:ilvl w:val="0"/>
+          <w:numId w:val="13"/>
+        </w:numPr>
+        <w:rPr>
+          <w:sz w:val="24"/>
+          <w:szCs w:val="24"/>
+        </w:rPr>
+      </w:pPr>
+      <w:r>
+        <w:rPr>
+          <w:sz w:val="24"/>
+          <w:szCs w:val="24"/>
+        </w:rPr>
+        <w:t xml:space="preserve">Submitting a form </w:t>
+      </w:r>
+    </w:p>
+    <w:p>
+      <w:pPr>
+        <w:pStyle w:val="ListParagraph"/>
+        <w:numPr>
+          <w:ilvl w:val="0"/>
+          <w:numId w:val="13"/>
+        </w:numPr>
+        <w:rPr>
+          <w:sz w:val="24"/>
+          <w:szCs w:val="24"/>
+        </w:rPr>
+      </w:pPr>
+      <w:r>
+        <w:rPr>
+          <w:sz w:val="24"/>
+          <w:szCs w:val="24"/>
+        </w:rPr>
+        <w:t xml:space="preserve">Pressing a keyboard key </w:t>
+      </w:r>
+    </w:p>
+    <w:p>
+      <w:pPr>
+        <w:pStyle w:val="ListParagraph"/>
+        <w:numPr>
+          <w:ilvl w:val="0"/>
+          <w:numId w:val="13"/>
+        </w:numPr>
+        <w:rPr>
+          <w:sz w:val="24"/>
+          <w:szCs w:val="24"/>
+        </w:rPr>
+      </w:pPr>
+      <w:r>
+        <w:rPr>
+          <w:sz w:val="24"/>
+          <w:szCs w:val="24"/>
+        </w:rPr>
+        <w:t>Loading a webpage</w:t>
+      </w:r>
+    </w:p>
+    <w:p>
+      <w:pPr>
+        <w:rPr>
+          <w:b/>
+          <w:bCs/>
+          <w:sz w:val="24"/>
+          <w:szCs w:val="24"/>
+        </w:rPr>
+      </w:pPr>
+      <w:r>
+        <w:rPr>
+          <w:b/>
+          <w:bCs/>
+          <w:sz w:val="24"/>
+          <w:szCs w:val="24"/>
+        </w:rPr>
+        <w:t>What is an Event Listener?</w:t>
+      </w:r>
+    </w:p>
+    <w:p>
+      <w:pPr>
+        <w:rPr>
+          <w:sz w:val="24"/>
+          <w:szCs w:val="24"/>
+        </w:rPr>
+      </w:pPr>
+      <w:r>
+        <w:rPr>
+          <w:sz w:val="24"/>
+          <w:szCs w:val="24"/>
+        </w:rPr>
+        <w:t>An Event Listener is a function that waits for a specific event to occur and then executes some code.</w:t>
+      </w:r>
+    </w:p>
+    <w:p>
+      <w:pPr>
+        <w:rPr>
+          <w:sz w:val="24"/>
+          <w:szCs w:val="24"/>
+        </w:rPr>
+      </w:pPr>
+      <w:r>
+        <w:rPr>
+          <w:sz w:val="24"/>
+          <w:szCs w:val="24"/>
+        </w:rPr>
+        <w:t>An Event Listener is a JavaScript method used to listen for user interactions or browser events and execute a callback function when the event occurs.</w:t>
+      </w:r>
+    </w:p>
+    <w:p>
+      <w:pPr>
+        <w:rPr>
+          <w:sz w:val="24"/>
+          <w:szCs w:val="24"/>
+        </w:rPr>
+      </w:pPr>
+      <w:r>
+        <w:rPr>
+          <w:sz w:val="24"/>
+          <w:szCs w:val="24"/>
+        </w:rPr>
+        <w:drawing>
+          <wp:anchor distT="0" distB="0" distL="114300" distR="114300" simplePos="0" relativeHeight="251676672" behindDoc="0" locked="0" layoutInCell="1" allowOverlap="1" wp14:anchorId="1B6DC7B0" wp14:editId="1487CADF">
+            <wp:simplePos x="0" y="0"/>
+            <wp:positionH relativeFrom="margin">
+              <wp:align>left</wp:align>
+            </wp:positionH>
+            <wp:positionV relativeFrom="paragraph">
+              <wp:posOffset>304165</wp:posOffset>
+            </wp:positionV>
+            <wp:extent cx="3970655" cy="3793490"/>
+            <wp:effectExtent l="0" t="0" r="0" b="0"/>
+            <wp:wrapThrough wrapText="bothSides">
+              <wp:wrapPolygon edited="0">
+                <wp:start x="0" y="0"/>
+                <wp:lineTo x="0" y="21477"/>
+                <wp:lineTo x="21451" y="21477"/>
+                <wp:lineTo x="21451" y="0"/>
+                <wp:lineTo x="0" y="0"/>
+              </wp:wrapPolygon>
+            </wp:wrapThrough>
+            <wp:docPr id="1242277041" name="Picture 1"/>
+            <wp:cNvGraphicFramePr>
+              <a:graphicFrameLocks xmlns:a="http://schemas.openxmlformats.org/drawingml/2006/main" noChangeAspect="1"/>
+            </wp:cNvGraphicFramePr>
+            <a:graphic xmlns:a="http://schemas.openxmlformats.org/drawingml/2006/main">
+              <a:graphicData uri="http://schemas.openxmlformats.org/drawingml/2006/picture">
+                <pic:pic xmlns:pic="http://schemas.openxmlformats.org/drawingml/2006/picture">
+                  <pic:nvPicPr>
+                    <pic:cNvPr id="1242277041" name=""/>
+                    <pic:cNvPicPr/>
+                  </pic:nvPicPr>
+                  <pic:blipFill>
+                    <a:blip r:embed="rId37">
+                      <a:extLst>
+                        <a:ext uri="{28A0092B-C50C-407E-A947-70E740481C1C}">
+                          <a14:useLocalDpi xmlns:a14="http://schemas.microsoft.com/office/drawing/2010/main" val="0"/>
+                        </a:ext>
+                      </a:extLst>
+                    </a:blip>
+                    <a:stretch>
+                      <a:fillRect/>
+                    </a:stretch>
+                  </pic:blipFill>
+                  <pic:spPr>
+                    <a:xfrm>
+                      <a:off x="0" y="0"/>
+                      <a:ext cx="3970655" cy="3793490"/>
+                    </a:xfrm>
+                    <a:prstGeom prst="rect">
+                      <a:avLst/>
+                    </a:prstGeom>
+                  </pic:spPr>
+                </pic:pic>
+              </a:graphicData>
+            </a:graphic>
+            <wp14:sizeRelH relativeFrom="page">
+              <wp14:pctWidth>0</wp14:pctWidth>
+            </wp14:sizeRelH>
+            <wp14:sizeRelV relativeFrom="page">
+              <wp14:pctHeight>0</wp14:pctHeight>
+            </wp14:sizeRelV>
+          </wp:anchor>
+        </w:drawing>
+      </w:r>
+      <w:r>
+        <w:rPr>
+          <w:b/>
+          <w:bCs/>
+          <w:sz w:val="24"/>
+          <w:szCs w:val="24"/>
+        </w:rPr>
+        <w:t>Syntax</w:t>
+      </w:r>
+      <w:r>
+        <w:rPr>
+          <w:sz w:val="24"/>
+          <w:szCs w:val="24"/>
+        </w:rPr>
+        <w:t xml:space="preserve"> - </w:t>
+      </w:r>
+      <w:r>
+        <w:rPr>
+          <w:sz w:val="24"/>
+          <w:szCs w:val="24"/>
+        </w:rPr>
+        <w:t>element. addEventListener</w:t>
+      </w:r>
+      <w:r>
+        <w:rPr>
+          <w:sz w:val="24"/>
+          <w:szCs w:val="24"/>
+        </w:rPr>
+        <w:t xml:space="preserve"> </w:t>
+      </w:r>
+      <w:r>
+        <w:rPr>
+          <w:sz w:val="24"/>
+          <w:szCs w:val="24"/>
+        </w:rPr>
+        <w:t>("event", callbackFunction);</w:t>
+      </w:r>
+    </w:p>
+    <w:p>
+      <w:pPr>
+        <w:rPr>
+          <w:sz w:val="24"/>
+          <w:szCs w:val="24"/>
+        </w:rPr>
+      </w:pPr>
+      <w:r>
+        <w:rPr>
+          <w:sz w:val="24"/>
+          <w:szCs w:val="24"/>
+        </w:rPr>
+        <w:drawing>
+          <wp:anchor distT="0" distB="0" distL="114300" distR="114300" simplePos="0" relativeHeight="251677696" behindDoc="0" locked="0" layoutInCell="1" allowOverlap="1" wp14:anchorId="53CE638B" wp14:editId="4A3692CE">
+            <wp:simplePos x="0" y="0"/>
+            <wp:positionH relativeFrom="column">
+              <wp:posOffset>3916680</wp:posOffset>
+            </wp:positionH>
+            <wp:positionV relativeFrom="paragraph">
+              <wp:posOffset>360680</wp:posOffset>
+            </wp:positionV>
+            <wp:extent cx="2861310" cy="1416050"/>
+            <wp:effectExtent l="0" t="0" r="0" b="0"/>
+            <wp:wrapThrough wrapText="bothSides">
+              <wp:wrapPolygon edited="0">
+                <wp:start x="0" y="0"/>
+                <wp:lineTo x="0" y="21213"/>
+                <wp:lineTo x="21427" y="21213"/>
+                <wp:lineTo x="21427" y="0"/>
+                <wp:lineTo x="0" y="0"/>
+              </wp:wrapPolygon>
+            </wp:wrapThrough>
+            <wp:docPr id="278156898" name="Picture 1"/>
+            <wp:cNvGraphicFramePr>
+              <a:graphicFrameLocks xmlns:a="http://schemas.openxmlformats.org/drawingml/2006/main" noChangeAspect="1"/>
+            </wp:cNvGraphicFramePr>
+            <a:graphic xmlns:a="http://schemas.openxmlformats.org/drawingml/2006/main">
+              <a:graphicData uri="http://schemas.openxmlformats.org/drawingml/2006/picture">
+                <pic:pic xmlns:pic="http://schemas.openxmlformats.org/drawingml/2006/picture">
+                  <pic:nvPicPr>
+                    <pic:cNvPr id="278156898" name=""/>
+                    <pic:cNvPicPr/>
+                  </pic:nvPicPr>
+                  <pic:blipFill>
+                    <a:blip r:embed="rId38" cstate="print">
+                      <a:extLst>
+                        <a:ext uri="{28A0092B-C50C-407E-A947-70E740481C1C}">
+                          <a14:useLocalDpi xmlns:a14="http://schemas.microsoft.com/office/drawing/2010/main" val="0"/>
+                        </a:ext>
+                      </a:extLst>
+                    </a:blip>
+                    <a:stretch>
+                      <a:fillRect/>
+                    </a:stretch>
+                  </pic:blipFill>
+                  <pic:spPr>
+                    <a:xfrm>
+                      <a:off x="0" y="0"/>
+                      <a:ext cx="2861310" cy="1416050"/>
+                    </a:xfrm>
+                    <a:prstGeom prst="rect">
+                      <a:avLst/>
+                    </a:prstGeom>
+                  </pic:spPr>
+                </pic:pic>
+              </a:graphicData>
+            </a:graphic>
+            <wp14:sizeRelH relativeFrom="page">
+              <wp14:pctWidth>0</wp14:pctWidth>
+            </wp14:sizeRelH>
+            <wp14:sizeRelV relativeFrom="page">
+              <wp14:pctHeight>0</wp14:pctHeight>
+            </wp14:sizeRelV>
+          </wp:anchor>
+        </w:drawing>
+      </w:r>
+    </w:p>
+    <w:p>
+      <w:pPr>
+        <w:rPr>
+          <w:b/>
+          <w:bCs/>
+          <w:sz w:val="24"/>
+          <w:szCs w:val="24"/>
+        </w:rPr>
+      </w:pPr>
+      <w:r>
+        <w:rPr>
+          <w:b/>
+          <w:bCs/>
+          <w:sz w:val="24"/>
+          <w:szCs w:val="24"/>
+        </w:rPr>
+        <w:t>Why is addEventListener preferred over onclick?</w:t>
+      </w:r>
+      <w:r>
+        <w:rPr>
+          <w:b/>
+          <w:bCs/>
+          <w:sz w:val="24"/>
+          <w:szCs w:val="24"/>
+        </w:rPr>
+        <w:t xml:space="preserve"> </w:t>
+      </w:r>
+    </w:p>
+    <w:p>
+      <w:pPr>
+        <w:rPr>
+          <w:sz w:val="24"/>
+          <w:szCs w:val="24"/>
+        </w:rPr>
+      </w:pPr>
+      <w:r>
+        <w:rPr>
+          <w:sz w:val="24"/>
+          <w:szCs w:val="24"/>
+        </w:rPr>
+        <w:t>addEventListener</w:t>
+      </w:r>
+      <w:r>
+        <w:rPr>
+          <w:sz w:val="24"/>
+          <w:szCs w:val="24"/>
+        </w:rPr>
+        <w:t xml:space="preserve"> </w:t>
+      </w:r>
+      <w:r>
+        <w:rPr>
+          <w:sz w:val="24"/>
+          <w:szCs w:val="24"/>
+        </w:rPr>
+        <w:t>() allows multiple event handlers on the same element, provides better separation of HTML and JavaScript, and offers more control over event handling.</w:t>
+      </w:r>
+    </w:p>
+    <w:p>
+      <w:pPr>
+        <w:rPr>
+          <w:sz w:val="24"/>
+          <w:szCs w:val="24"/>
+        </w:rPr>
+      </w:pPr>
+    </w:p>
+    <w:p>
+      <w:pPr>
+        <w:rPr>
+          <w:sz w:val="24"/>
+          <w:szCs w:val="24"/>
+        </w:rPr>
+      </w:pPr>
+    </w:p>
+    <w:p>
+      <w:pPr>
+        <w:rPr>
+          <w:sz w:val="24"/>
+          <w:szCs w:val="24"/>
+        </w:rPr>
+      </w:pPr>
+      <w:r>
+        <w:rPr>
+          <w:sz w:val="24"/>
+          <w:szCs w:val="24"/>
+        </w:rPr>
+        <w:lastRenderedPageBreak/>
+        <w:drawing>
+          <wp:anchor distT="0" distB="0" distL="114300" distR="114300" simplePos="0" relativeHeight="251679744" behindDoc="0" locked="0" layoutInCell="1" allowOverlap="1" wp14:anchorId="78DD0233" wp14:editId="10A970F8">
+            <wp:simplePos x="0" y="0"/>
+            <wp:positionH relativeFrom="column">
+              <wp:posOffset>3711484</wp:posOffset>
+            </wp:positionH>
+            <wp:positionV relativeFrom="paragraph">
+              <wp:posOffset>315685</wp:posOffset>
+            </wp:positionV>
+            <wp:extent cx="3170555" cy="1801495"/>
+            <wp:effectExtent l="0" t="0" r="0" b="8255"/>
+            <wp:wrapThrough wrapText="bothSides">
+              <wp:wrapPolygon edited="0">
+                <wp:start x="0" y="0"/>
+                <wp:lineTo x="0" y="21471"/>
+                <wp:lineTo x="21414" y="21471"/>
+                <wp:lineTo x="21414" y="0"/>
+                <wp:lineTo x="0" y="0"/>
+              </wp:wrapPolygon>
+            </wp:wrapThrough>
+            <wp:docPr id="1436750380" name="Picture 1"/>
+            <wp:cNvGraphicFramePr>
+              <a:graphicFrameLocks xmlns:a="http://schemas.openxmlformats.org/drawingml/2006/main" noChangeAspect="1"/>
+            </wp:cNvGraphicFramePr>
+            <a:graphic xmlns:a="http://schemas.openxmlformats.org/drawingml/2006/main">
+              <a:graphicData uri="http://schemas.openxmlformats.org/drawingml/2006/picture">
+                <pic:pic xmlns:pic="http://schemas.openxmlformats.org/drawingml/2006/picture">
+                  <pic:nvPicPr>
+                    <pic:cNvPr id="1436750380" name=""/>
+                    <pic:cNvPicPr/>
+                  </pic:nvPicPr>
+                  <pic:blipFill>
+                    <a:blip r:embed="rId39" cstate="print">
+                      <a:extLst>
+                        <a:ext uri="{28A0092B-C50C-407E-A947-70E740481C1C}">
+                          <a14:useLocalDpi xmlns:a14="http://schemas.microsoft.com/office/drawing/2010/main" val="0"/>
+                        </a:ext>
+                      </a:extLst>
+                    </a:blip>
+                    <a:stretch>
+                      <a:fillRect/>
+                    </a:stretch>
+                  </pic:blipFill>
+                  <pic:spPr>
+                    <a:xfrm>
+                      <a:off x="0" y="0"/>
+                      <a:ext cx="3170555" cy="1801495"/>
+                    </a:xfrm>
+                    <a:prstGeom prst="rect">
+                      <a:avLst/>
+                    </a:prstGeom>
+                  </pic:spPr>
+                </pic:pic>
+              </a:graphicData>
+            </a:graphic>
+            <wp14:sizeRelH relativeFrom="page">
+              <wp14:pctWidth>0</wp14:pctWidth>
+            </wp14:sizeRelH>
+            <wp14:sizeRelV relativeFrom="page">
+              <wp14:pctHeight>0</wp14:pctHeight>
+            </wp14:sizeRelV>
+          </wp:anchor>
+        </w:drawing>
+      </w:r>
+      <w:r>
+        <w:rPr>
+          <w:sz w:val="24"/>
+          <w:szCs w:val="24"/>
+        </w:rPr>
+        <w:drawing>
+          <wp:anchor distT="0" distB="0" distL="114300" distR="114300" simplePos="0" relativeHeight="251678720" behindDoc="0" locked="0" layoutInCell="1" allowOverlap="1" wp14:anchorId="40941E37" wp14:editId="3C076D87">
+            <wp:simplePos x="0" y="0"/>
+            <wp:positionH relativeFrom="margin">
+              <wp:posOffset>-147320</wp:posOffset>
+            </wp:positionH>
+            <wp:positionV relativeFrom="paragraph">
+              <wp:posOffset>0</wp:posOffset>
+            </wp:positionV>
+            <wp:extent cx="3879850" cy="2236470"/>
+            <wp:effectExtent l="0" t="0" r="6350" b="0"/>
+            <wp:wrapThrough wrapText="bothSides">
+              <wp:wrapPolygon edited="0">
+                <wp:start x="0" y="0"/>
+                <wp:lineTo x="0" y="21342"/>
+                <wp:lineTo x="21529" y="21342"/>
+                <wp:lineTo x="21529" y="0"/>
+                <wp:lineTo x="0" y="0"/>
+              </wp:wrapPolygon>
+            </wp:wrapThrough>
+            <wp:docPr id="1965966971" name="Picture 1"/>
+            <wp:cNvGraphicFramePr>
+              <a:graphicFrameLocks xmlns:a="http://schemas.openxmlformats.org/drawingml/2006/main" noChangeAspect="1"/>
+            </wp:cNvGraphicFramePr>
+            <a:graphic xmlns:a="http://schemas.openxmlformats.org/drawingml/2006/main">
+              <a:graphicData uri="http://schemas.openxmlformats.org/drawingml/2006/picture">
+                <pic:pic xmlns:pic="http://schemas.openxmlformats.org/drawingml/2006/picture">
+                  <pic:nvPicPr>
+                    <pic:cNvPr id="1965966971" name=""/>
+                    <pic:cNvPicPr/>
+                  </pic:nvPicPr>
+                  <pic:blipFill>
+                    <a:blip r:embed="rId40">
+                      <a:extLst>
+                        <a:ext uri="{28A0092B-C50C-407E-A947-70E740481C1C}">
+                          <a14:useLocalDpi xmlns:a14="http://schemas.microsoft.com/office/drawing/2010/main" val="0"/>
+                        </a:ext>
+                      </a:extLst>
+                    </a:blip>
+                    <a:stretch>
+                      <a:fillRect/>
+                    </a:stretch>
+                  </pic:blipFill>
+                  <pic:spPr>
+                    <a:xfrm>
+                      <a:off x="0" y="0"/>
+                      <a:ext cx="3879850" cy="2236470"/>
+                    </a:xfrm>
+                    <a:prstGeom prst="rect">
+                      <a:avLst/>
+                    </a:prstGeom>
+                  </pic:spPr>
+                </pic:pic>
+              </a:graphicData>
+            </a:graphic>
+            <wp14:sizeRelH relativeFrom="page">
+              <wp14:pctWidth>0</wp14:pctWidth>
+            </wp14:sizeRelH>
+            <wp14:sizeRelV relativeFrom="page">
+              <wp14:pctHeight>0</wp14:pctHeight>
+            </wp14:sizeRelV>
+          </wp:anchor>
+        </w:drawing>
+      </w:r>
+    </w:p>
+    <w:p>
+      <w:pPr>
+        <w:rPr>
+          <w:sz w:val="24"/>
+          <w:szCs w:val="24"/>
+        </w:rPr>
+      </w:pPr>
+    </w:p>
+    <w:p>
+      <w:pPr>
+        <w:rPr>
+          <w:b/>
+          <w:bCs/>
+          <w:sz w:val="24"/>
+          <w:szCs w:val="24"/>
+        </w:rPr>
+      </w:pPr>
+      <w:r>
+        <w:rPr>
+          <w:sz w:val="24"/>
+          <w:szCs w:val="24"/>
+        </w:rPr>
+        <w:drawing>
+          <wp:anchor distT="0" distB="0" distL="114300" distR="114300" simplePos="0" relativeHeight="251681792" behindDoc="0" locked="0" layoutInCell="1" allowOverlap="1" wp14:anchorId="6E1C9C1B" wp14:editId="0435E6C1">
+            <wp:simplePos x="0" y="0"/>
+            <wp:positionH relativeFrom="column">
+              <wp:posOffset>3782695</wp:posOffset>
+            </wp:positionH>
+            <wp:positionV relativeFrom="paragraph">
+              <wp:posOffset>1812925</wp:posOffset>
+            </wp:positionV>
+            <wp:extent cx="3098165" cy="2759075"/>
+            <wp:effectExtent l="0" t="0" r="6985" b="3175"/>
+            <wp:wrapThrough wrapText="bothSides">
+              <wp:wrapPolygon edited="0">
+                <wp:start x="0" y="0"/>
+                <wp:lineTo x="0" y="21476"/>
+                <wp:lineTo x="21516" y="21476"/>
+                <wp:lineTo x="21516" y="0"/>
+                <wp:lineTo x="0" y="0"/>
+              </wp:wrapPolygon>
+            </wp:wrapThrough>
+            <wp:docPr id="701835223" name="Picture 1"/>
+            <wp:cNvGraphicFramePr>
+              <a:graphicFrameLocks xmlns:a="http://schemas.openxmlformats.org/drawingml/2006/main" noChangeAspect="1"/>
+            </wp:cNvGraphicFramePr>
+            <a:graphic xmlns:a="http://schemas.openxmlformats.org/drawingml/2006/main">
+              <a:graphicData uri="http://schemas.openxmlformats.org/drawingml/2006/picture">
+                <pic:pic xmlns:pic="http://schemas.openxmlformats.org/drawingml/2006/picture">
+                  <pic:nvPicPr>
+                    <pic:cNvPr id="701835223" name=""/>
+                    <pic:cNvPicPr/>
+                  </pic:nvPicPr>
+                  <pic:blipFill>
+                    <a:blip r:embed="rId41" cstate="print">
+                      <a:extLst>
+                        <a:ext uri="{28A0092B-C50C-407E-A947-70E740481C1C}">
+                          <a14:useLocalDpi xmlns:a14="http://schemas.microsoft.com/office/drawing/2010/main" val="0"/>
+                        </a:ext>
+                      </a:extLst>
+                    </a:blip>
+                    <a:stretch>
+                      <a:fillRect/>
+                    </a:stretch>
+                  </pic:blipFill>
+                  <pic:spPr>
+                    <a:xfrm>
+                      <a:off x="0" y="0"/>
+                      <a:ext cx="3098165" cy="2759075"/>
+                    </a:xfrm>
+                    <a:prstGeom prst="rect">
+                      <a:avLst/>
+                    </a:prstGeom>
+                  </pic:spPr>
+                </pic:pic>
+              </a:graphicData>
+            </a:graphic>
+            <wp14:sizeRelH relativeFrom="page">
+              <wp14:pctWidth>0</wp14:pctWidth>
+            </wp14:sizeRelH>
+            <wp14:sizeRelV relativeFrom="page">
+              <wp14:pctHeight>0</wp14:pctHeight>
+            </wp14:sizeRelV>
+          </wp:anchor>
+        </w:drawing>
+      </w:r>
+      <w:r>
+        <w:rPr>
+          <w:sz w:val="24"/>
+          <w:szCs w:val="24"/>
+        </w:rPr>
+        <w:drawing>
+          <wp:anchor distT="0" distB="0" distL="114300" distR="114300" simplePos="0" relativeHeight="251680768" behindDoc="0" locked="0" layoutInCell="1" allowOverlap="1" wp14:anchorId="7C399F77" wp14:editId="49326977">
+            <wp:simplePos x="0" y="0"/>
+            <wp:positionH relativeFrom="margin">
+              <wp:posOffset>-141605</wp:posOffset>
+            </wp:positionH>
+            <wp:positionV relativeFrom="page">
+              <wp:posOffset>4735195</wp:posOffset>
+            </wp:positionV>
+            <wp:extent cx="3939540" cy="2884170"/>
+            <wp:effectExtent l="0" t="0" r="3810" b="0"/>
+            <wp:wrapTopAndBottom/>
+            <wp:docPr id="634009423" name="Picture 1"/>
+            <wp:cNvGraphicFramePr>
+              <a:graphicFrameLocks xmlns:a="http://schemas.openxmlformats.org/drawingml/2006/main" noChangeAspect="1"/>
+            </wp:cNvGraphicFramePr>
+            <a:graphic xmlns:a="http://schemas.openxmlformats.org/drawingml/2006/main">
+              <a:graphicData uri="http://schemas.openxmlformats.org/drawingml/2006/picture">
+                <pic:pic xmlns:pic="http://schemas.openxmlformats.org/drawingml/2006/picture">
+                  <pic:nvPicPr>
+                    <pic:cNvPr id="634009423" name=""/>
+                    <pic:cNvPicPr/>
+                  </pic:nvPicPr>
+                  <pic:blipFill>
+                    <a:blip r:embed="rId42">
+                      <a:extLst>
+                        <a:ext uri="{28A0092B-C50C-407E-A947-70E740481C1C}">
+                          <a14:useLocalDpi xmlns:a14="http://schemas.microsoft.com/office/drawing/2010/main" val="0"/>
+                        </a:ext>
+                      </a:extLst>
+                    </a:blip>
+                    <a:stretch>
+                      <a:fillRect/>
+                    </a:stretch>
+                  </pic:blipFill>
+                  <pic:spPr>
+                    <a:xfrm>
+                      <a:off x="0" y="0"/>
+                      <a:ext cx="3939540" cy="2884170"/>
+                    </a:xfrm>
+                    <a:prstGeom prst="rect">
+                      <a:avLst/>
+                    </a:prstGeom>
+                  </pic:spPr>
+                </pic:pic>
+              </a:graphicData>
+            </a:graphic>
+            <wp14:sizeRelH relativeFrom="page">
+              <wp14:pctWidth>0</wp14:pctWidth>
+            </wp14:sizeRelH>
+            <wp14:sizeRelV relativeFrom="page">
+              <wp14:pctHeight>0</wp14:pctHeight>
+            </wp14:sizeRelV>
+          </wp:anchor>
+        </w:drawing>
+      </w:r>
+      <w:r>
+        <w:rPr>
+          <w:b/>
+          <w:bCs/>
+          <w:sz w:val="24"/>
+          <w:szCs w:val="24"/>
+        </w:rPr>
+        <w:t>Difference between onclick and addEventListener?</w:t>
+      </w:r>
+    </w:p>
+    <w:tbl>
+      <w:tblPr>
+        <w:tblW w:w="10879" w:type="dxa"/>
+        <w:tblCellSpacing w:w="15" w:type="dxa"/>
+        <w:tblBorders>
+          <w:top w:val="single" w:sz="4" w:space="0" w:color="auto"/>
+          <w:left w:val="single" w:sz="4" w:space="0" w:color="auto"/>
+          <w:bottom w:val="single" w:sz="4" w:space="0" w:color="auto"/>
+          <w:right w:val="single" w:sz="4" w:space="0" w:color="auto"/>
+          <w:insideH w:val="single" w:sz="4" w:space="0" w:color="auto"/>
+          <w:insideV w:val="single" w:sz="4" w:space="0" w:color="auto"/>
+        </w:tblBorders>
+        <w:tblCellMar>
+          <w:top w:w="15" w:type="dxa"/>
+          <w:left w:w="15" w:type="dxa"/>
+          <w:bottom w:w="15" w:type="dxa"/>
+          <w:right w:w="15" w:type="dxa"/>
+        </w:tblCellMar>
+        <w:tblLook w:val="04A0" w:firstRow="1" w:lastRow="0" w:firstColumn="1" w:lastColumn="0" w:noHBand="0" w:noVBand="1"/>
+      </w:tblPr>
+      <w:tblGrid>
+        <w:gridCol w:w="5862"/>
+        <w:gridCol w:w="5017"/>
+      </w:tblGrid>
+      <w:tr>
+        <w:trPr>
+          <w:trHeight w:val="447"/>
+          <w:tblHeader/>
+          <w:tblCellSpacing w:w="15" w:type="dxa"/>
+        </w:trPr>
+        <w:tc>
+          <w:tcPr>
+            <w:tcW w:w="0" w:type="auto"/>
+            <w:vAlign w:val="center"/>
+            <w:hideMark/>
+          </w:tcPr>
+          <w:p>
+            <w:pPr>
+              <w:jc w:val="center"/>
+              <w:rPr>
+                <w:b/>
+                <w:bCs/>
+                <w:sz w:val="24"/>
+                <w:szCs w:val="24"/>
+              </w:rPr>
+            </w:pPr>
+            <w:r>
+              <w:rPr>
+                <w:b/>
+                <w:bCs/>
+                <w:sz w:val="24"/>
+                <w:szCs w:val="24"/>
+              </w:rPr>
+              <w:t>onclick</w:t>
+            </w:r>
+          </w:p>
+        </w:tc>
+        <w:tc>
+          <w:tcPr>
+            <w:tcW w:w="0" w:type="auto"/>
+            <w:vAlign w:val="center"/>
+            <w:hideMark/>
+          </w:tcPr>
+          <w:p>
+            <w:pPr>
+              <w:jc w:val="center"/>
+              <w:rPr>
+                <w:b/>
+                <w:bCs/>
+                <w:sz w:val="24"/>
+                <w:szCs w:val="24"/>
+              </w:rPr>
+            </w:pPr>
+            <w:r>
+              <w:rPr>
+                <w:b/>
+                <w:bCs/>
+                <w:sz w:val="24"/>
+                <w:szCs w:val="24"/>
+              </w:rPr>
+              <w:t>addEventListener</w:t>
+            </w:r>
+          </w:p>
+        </w:tc>
+      </w:tr>
+      <w:tr>
+        <w:trPr>
+          <w:trHeight w:val="447"/>
+          <w:tblCellSpacing w:w="15" w:type="dxa"/>
+        </w:trPr>
+        <w:tc>
+          <w:tcPr>
+            <w:tcW w:w="0" w:type="auto"/>
+            <w:vAlign w:val="center"/>
+            <w:hideMark/>
+          </w:tcPr>
+          <w:p>
+            <w:pPr>
+              <w:jc w:val="center"/>
+              <w:rPr>
+                <w:sz w:val="24"/>
+                <w:szCs w:val="24"/>
+              </w:rPr>
+            </w:pPr>
+            <w:r>
+              <w:rPr>
+                <w:sz w:val="24"/>
+                <w:szCs w:val="24"/>
+              </w:rPr>
+              <w:t>One handler</w:t>
+            </w:r>
+          </w:p>
+        </w:tc>
+        <w:tc>
+          <w:tcPr>
+            <w:tcW w:w="0" w:type="auto"/>
+            <w:vAlign w:val="center"/>
+            <w:hideMark/>
+          </w:tcPr>
+          <w:p>
+            <w:pPr>
+              <w:jc w:val="center"/>
+              <w:rPr>
+                <w:sz w:val="24"/>
+                <w:szCs w:val="24"/>
+              </w:rPr>
+            </w:pPr>
+            <w:r>
+              <w:rPr>
+                <w:sz w:val="24"/>
+                <w:szCs w:val="24"/>
+              </w:rPr>
+              <w:t>Multiple handlers</w:t>
+            </w:r>
+          </w:p>
+        </w:tc>
+      </w:tr>
+      <w:tr>
+        <w:trPr>
+          <w:trHeight w:val="447"/>
+          <w:tblCellSpacing w:w="15" w:type="dxa"/>
+        </w:trPr>
+        <w:tc>
+          <w:tcPr>
+            <w:tcW w:w="0" w:type="auto"/>
+            <w:vAlign w:val="center"/>
+            <w:hideMark/>
+          </w:tcPr>
+          <w:p>
+            <w:pPr>
+              <w:jc w:val="center"/>
+              <w:rPr>
+                <w:sz w:val="24"/>
+                <w:szCs w:val="24"/>
+              </w:rPr>
+            </w:pPr>
+            <w:r>
+              <w:rPr>
+                <w:sz w:val="24"/>
+                <w:szCs w:val="24"/>
+              </w:rPr>
+              <w:t>Inline HTML possible</w:t>
+            </w:r>
+          </w:p>
+        </w:tc>
+        <w:tc>
+          <w:tcPr>
+            <w:tcW w:w="0" w:type="auto"/>
+            <w:vAlign w:val="center"/>
+            <w:hideMark/>
+          </w:tcPr>
+          <w:p>
+            <w:pPr>
+              <w:jc w:val="center"/>
+              <w:rPr>
+                <w:sz w:val="24"/>
+                <w:szCs w:val="24"/>
+              </w:rPr>
+            </w:pPr>
+            <w:r>
+              <w:rPr>
+                <w:sz w:val="24"/>
+                <w:szCs w:val="24"/>
+              </w:rPr>
+              <w:t>Separate JS</w:t>
+            </w:r>
+          </w:p>
+        </w:tc>
+      </w:tr>
+      <w:tr>
+        <w:trPr>
+          <w:trHeight w:val="439"/>
+          <w:tblCellSpacing w:w="15" w:type="dxa"/>
+        </w:trPr>
+        <w:tc>
+          <w:tcPr>
+            <w:tcW w:w="0" w:type="auto"/>
+            <w:vAlign w:val="center"/>
+            <w:hideMark/>
+          </w:tcPr>
+          <w:p>
+            <w:pPr>
+              <w:jc w:val="center"/>
+              <w:rPr>
+                <w:sz w:val="24"/>
+                <w:szCs w:val="24"/>
+              </w:rPr>
+            </w:pPr>
+            <w:r>
+              <w:rPr>
+                <w:sz w:val="24"/>
+                <w:szCs w:val="24"/>
+              </w:rPr>
+              <w:t>Less flexible</w:t>
+            </w:r>
+          </w:p>
+        </w:tc>
+        <w:tc>
+          <w:tcPr>
+            <w:tcW w:w="0" w:type="auto"/>
+            <w:vAlign w:val="center"/>
+            <w:hideMark/>
+          </w:tcPr>
+          <w:p>
+            <w:pPr>
+              <w:jc w:val="center"/>
+              <w:rPr>
+                <w:sz w:val="24"/>
+                <w:szCs w:val="24"/>
+              </w:rPr>
+            </w:pPr>
+            <w:r>
+              <w:rPr>
+                <w:sz w:val="24"/>
+                <w:szCs w:val="24"/>
+              </w:rPr>
+              <w:t>More flexible</w:t>
+            </w:r>
+          </w:p>
+        </w:tc>
+      </w:tr>
+    </w:tbl>
+    <w:p>
+      <w:pPr>
+        <w:rPr>
+          <w:b/>
+          <w:bCs/>
+          <w:sz w:val="24"/>
+          <w:szCs w:val="24"/>
+        </w:rPr>
+      </w:pPr>
+      <w:r>
+        <w:rPr>
+          <w:b/>
+          <w:bCs/>
+          <w:sz w:val="24"/>
+          <w:szCs w:val="24"/>
+        </w:rPr>
+        <w:t>What is a callback function?</w:t>
+      </w:r>
+    </w:p>
+    <w:p>
+      <w:pPr>
+        <w:rPr>
+          <w:sz w:val="24"/>
+          <w:szCs w:val="24"/>
+        </w:rPr>
+      </w:pPr>
+      <w:r>
+        <w:rPr>
+          <w:sz w:val="24"/>
+          <w:szCs w:val="24"/>
+        </w:rPr>
+        <w:t>A callback function is a function passed as an argument to another function and executed later when an event occurs.</w:t>
+      </w:r>
+    </w:p>
+    <w:p>
+      <w:pPr>
+        <w:rPr>
+          <w:b/>
+          <w:bCs/>
+          <w:sz w:val="24"/>
+          <w:szCs w:val="24"/>
+        </w:rPr>
+      </w:pPr>
+      <w:r>
+        <w:rPr>
+          <w:b/>
+          <w:bCs/>
+          <w:sz w:val="24"/>
+          <w:szCs w:val="24"/>
+        </w:rPr>
+        <w:t>Easy Memory Trick</w:t>
+      </w:r>
+    </w:p>
+    <w:p>
+      <w:pPr>
+        <w:rPr>
+          <w:sz w:val="24"/>
+          <w:szCs w:val="24"/>
+        </w:rPr>
+      </w:pPr>
+      <w:r>
+        <w:rPr>
+          <w:sz w:val="24"/>
+          <w:szCs w:val="24"/>
+        </w:rPr>
+        <w:t>Element</w:t>
+      </w:r>
+      <w:r>
+        <w:rPr>
+          <w:sz w:val="24"/>
+          <w:szCs w:val="24"/>
+        </w:rPr>
+        <w:t xml:space="preserve"> </w:t>
+      </w:r>
+      <w:r>
+        <w:rPr>
+          <w:sz w:val="24"/>
+          <w:szCs w:val="24"/>
+        </w:rPr>
+        <w:t xml:space="preserve">-&gt; </w:t>
+      </w:r>
+      <w:r>
+        <w:rPr>
+          <w:sz w:val="24"/>
+          <w:szCs w:val="24"/>
+        </w:rPr>
+        <w:t>addEventListener</w:t>
+      </w:r>
+      <w:r>
+        <w:rPr>
+          <w:sz w:val="24"/>
+          <w:szCs w:val="24"/>
+        </w:rPr>
+        <w:t xml:space="preserve"> </w:t>
+      </w:r>
+      <w:r>
+        <w:rPr>
+          <w:sz w:val="24"/>
+          <w:szCs w:val="24"/>
+        </w:rPr>
+        <w:t>()</w:t>
+      </w:r>
+      <w:r>
+        <w:rPr>
+          <w:b/>
+          <w:bCs/>
+          <w:sz w:val="24"/>
+          <w:szCs w:val="24"/>
+        </w:rPr>
+        <w:t xml:space="preserve"> </w:t>
+      </w:r>
+      <w:r>
+        <w:rPr>
+          <w:sz w:val="24"/>
+          <w:szCs w:val="24"/>
+        </w:rPr>
+        <w:t xml:space="preserve">-&gt; </w:t>
+      </w:r>
+      <w:r>
+        <w:rPr>
+          <w:sz w:val="24"/>
+          <w:szCs w:val="24"/>
+        </w:rPr>
+        <w:t>Event</w:t>
+      </w:r>
+      <w:r>
+        <w:rPr>
+          <w:b/>
+          <w:bCs/>
+          <w:sz w:val="24"/>
+          <w:szCs w:val="24"/>
+        </w:rPr>
+        <w:t xml:space="preserve"> </w:t>
+      </w:r>
+      <w:r>
+        <w:rPr>
+          <w:sz w:val="24"/>
+          <w:szCs w:val="24"/>
+        </w:rPr>
+        <w:t xml:space="preserve">-&gt; </w:t>
+      </w:r>
+      <w:r>
+        <w:rPr>
+          <w:sz w:val="24"/>
+          <w:szCs w:val="24"/>
+        </w:rPr>
+        <w:t>Callback Function</w:t>
+      </w:r>
+      <w:r>
+        <w:rPr>
+          <w:b/>
+          <w:bCs/>
+          <w:sz w:val="24"/>
+          <w:szCs w:val="24"/>
+        </w:rPr>
+        <w:t xml:space="preserve"> </w:t>
+      </w:r>
+      <w:r>
+        <w:rPr>
+          <w:sz w:val="24"/>
+          <w:szCs w:val="24"/>
+        </w:rPr>
+        <w:t xml:space="preserve">-&gt; </w:t>
+      </w:r>
+      <w:r>
+        <w:rPr>
+          <w:sz w:val="24"/>
+          <w:szCs w:val="24"/>
+        </w:rPr>
+        <w:t>Action Performed</w:t>
+      </w:r>
+    </w:p>
+    <w:p>
+      <w:pPr>
+        <w:rPr>
+          <w:sz w:val="24"/>
+          <w:szCs w:val="24"/>
+        </w:rPr>
+      </w:pPr>
+      <w:r>
+        <w:rPr>
+          <w:sz w:val="24"/>
+          <w:szCs w:val="24"/>
+        </w:rPr>
+        <w:t>Event Listeners are used to handle user interactions such as clicks, keyboard input, form submissions, and mouse events. We attach an event listener to a DOM element using the addEventListener</w:t>
+      </w:r>
+      <w:r>
+        <w:rPr>
+          <w:sz w:val="24"/>
+          <w:szCs w:val="24"/>
+        </w:rPr>
+        <w:t xml:space="preserve"> </w:t>
+      </w:r>
+      <w:r>
+        <w:rPr>
+          <w:sz w:val="24"/>
+          <w:szCs w:val="24"/>
+        </w:rPr>
+        <w:t>() method, specifying the event type and a callback function. When the event occurs, the callback function executes. Event listeners are preferred over inline event handlers because they support multiple handlers, provide cleaner code organization, and offer better control over event handling.</w:t>
+      </w:r>
+    </w:p>
+    <w:p>
+      <w:pPr>
+        <w:jc w:val="center"/>
+        <w:rPr>
+          <w:b/>
+          <w:bCs/>
+          <w:sz w:val="24"/>
+          <w:szCs w:val="24"/>
+          <w:u w:val="single"/>
+        </w:rPr>
+      </w:pPr>
+      <w:r>
+        <w:rPr>
+          <w:b/>
+          <w:bCs/>
+          <w:sz w:val="28"/>
+          <w:szCs w:val="28"/>
+          <w:u w:val="single"/>
+        </w:rPr>
+        <w:lastRenderedPageBreak/>
+        <w:t>Local Storage &amp; Session Storage</w:t>
+      </w:r>
+      <w:r>
+        <w:rPr>
+          <w:b/>
+          <w:bCs/>
+          <w:sz w:val="28"/>
+          <w:szCs w:val="28"/>
+          <w:u w:val="single"/>
+        </w:rPr>
+        <w:t xml:space="preserve"> in JavaScript</w:t>
+      </w:r>
+    </w:p>
+    <w:p>
+      <w:pPr>
+        <w:rPr>
+          <w:sz w:val="24"/>
+          <w:szCs w:val="24"/>
+        </w:rPr>
+      </w:pPr>
+    </w:p>
+    <w:p>
+      <w:pPr>
+        <w:rPr>
+          <w:sz w:val="24"/>
+          <w:szCs w:val="24"/>
+        </w:rPr>
+      </w:pPr>
     </w:p>
     <w:p>
       <w:pPr>
@@ -18291,6 +19562,155 @@
     </w:lvl>
   </w:abstractNum>
   <w:abstractNum w:abstractNumId="11" w15:restartNumberingAfterBreak="0">
+    <w:nsid w:val="57663C21"/>
+    <w:multiLevelType w:val="multilevel"/>
+    <w:tmpl w:val="0E540BF4"/>
+    <w:lvl w:ilvl="0">
+      <w:start w:val="1"/>
+      <w:numFmt w:val="bullet"/>
+      <w:lvlText w:val=""/>
+      <w:lvlJc w:val="left"/>
+      <w:pPr>
+        <w:tabs>
+          <w:tab w:val="num" w:pos="720"/>
+        </w:tabs>
+        <w:ind w:left="720" w:hanging="360"/>
+      </w:pPr>
+      <w:rPr>
+        <w:rFonts w:ascii="Symbol" w:hAnsi="Symbol" w:hint="default"/>
+        <w:sz w:val="20"/>
+      </w:rPr>
+    </w:lvl>
+    <w:lvl w:ilvl="1" w:tentative="1">
+      <w:start w:val="1"/>
+      <w:numFmt w:val="bullet"/>
+      <w:lvlText w:val="o"/>
+      <w:lvlJc w:val="left"/>
+      <w:pPr>
+        <w:tabs>
+          <w:tab w:val="num" w:pos="1440"/>
+        </w:tabs>
+        <w:ind w:left="1440" w:hanging="360"/>
+      </w:pPr>
+      <w:rPr>
+        <w:rFonts w:ascii="Courier New" w:hAnsi="Courier New" w:hint="default"/>
+        <w:sz w:val="20"/>
+      </w:rPr>
+    </w:lvl>
+    <w:lvl w:ilvl="2" w:tentative="1">
+      <w:start w:val="1"/>
+      <w:numFmt w:val="bullet"/>
+      <w:lvlText w:val=""/>
+      <w:lvlJc w:val="left"/>
+      <w:pPr>
+        <w:tabs>
+          <w:tab w:val="num" w:pos="2160"/>
+        </w:tabs>
+        <w:ind w:left="2160" w:hanging="360"/>
+      </w:pPr>
+      <w:rPr>
+        <w:rFonts w:ascii="Wingdings" w:hAnsi="Wingdings" w:hint="default"/>
+        <w:sz w:val="20"/>
+      </w:rPr>
+    </w:lvl>
+    <w:lvl w:ilvl="3" w:tentative="1">
+      <w:start w:val="1"/>
+      <w:numFmt w:val="bullet"/>
+      <w:lvlText w:val=""/>
+      <w:lvlJc w:val="left"/>
+      <w:pPr>
+        <w:tabs>
+          <w:tab w:val="num" w:pos="2880"/>
+        </w:tabs>
+        <w:ind w:left="2880" w:hanging="360"/>
+      </w:pPr>
+      <w:rPr>
+        <w:rFonts w:ascii="Wingdings" w:hAnsi="Wingdings" w:hint="default"/>
+        <w:sz w:val="20"/>
+      </w:rPr>
+    </w:lvl>
+    <w:lvl w:ilvl="4" w:tentative="1">
+      <w:start w:val="1"/>
+      <w:numFmt w:val="bullet"/>
+      <w:lvlText w:val=""/>
+      <w:lvlJc w:val="left"/>
+      <w:pPr>
+        <w:tabs>
+          <w:tab w:val="num" w:pos="3600"/>
+        </w:tabs>
+        <w:ind w:left="3600" w:hanging="360"/>
+      </w:pPr>
+      <w:rPr>
+        <w:rFonts w:ascii="Wingdings" w:hAnsi="Wingdings" w:hint="default"/>
+        <w:sz w:val="20"/>
+      </w:rPr>
+    </w:lvl>
+    <w:lvl w:ilvl="5" w:tentative="1">
+      <w:start w:val="1"/>
+      <w:numFmt w:val="bullet"/>
+      <w:lvlText w:val=""/>
+      <w:lvlJc w:val="left"/>
+      <w:pPr>
+        <w:tabs>
+          <w:tab w:val="num" w:pos="4320"/>
+        </w:tabs>
+        <w:ind w:left="4320" w:hanging="360"/>
+      </w:pPr>
+      <w:rPr>
+        <w:rFonts w:ascii="Wingdings" w:hAnsi="Wingdings" w:hint="default"/>
+        <w:sz w:val="20"/>
+      </w:rPr>
+    </w:lvl>
+    <w:lvl w:ilvl="6" w:tentative="1">
+      <w:start w:val="1"/>
+      <w:numFmt w:val="bullet"/>
+      <w:lvlText w:val=""/>
+      <w:lvlJc w:val="left"/>
+      <w:pPr>
+        <w:tabs>
+          <w:tab w:val="num" w:pos="5040"/>
+        </w:tabs>
+        <w:ind w:left="5040" w:hanging="360"/>
+      </w:pPr>
+      <w:rPr>
+        <w:rFonts w:ascii="Wingdings" w:hAnsi="Wingdings" w:hint="default"/>
+        <w:sz w:val="20"/>
+      </w:rPr>
+    </w:lvl>
+    <w:lvl w:ilvl="7" w:tentative="1">
+      <w:start w:val="1"/>
+      <w:numFmt w:val="bullet"/>
+      <w:lvlText w:val=""/>
+      <w:lvlJc w:val="left"/>
+      <w:pPr>
+        <w:tabs>
+          <w:tab w:val="num" w:pos="5760"/>
+        </w:tabs>
+        <w:ind w:left="5760" w:hanging="360"/>
+      </w:pPr>
+      <w:rPr>
+        <w:rFonts w:ascii="Wingdings" w:hAnsi="Wingdings" w:hint="default"/>
+        <w:sz w:val="20"/>
+      </w:rPr>
+    </w:lvl>
+    <w:lvl w:ilvl="8" w:tentative="1">
+      <w:start w:val="1"/>
+      <w:numFmt w:val="bullet"/>
+      <w:lvlText w:val=""/>
+      <w:lvlJc w:val="left"/>
+      <w:pPr>
+        <w:tabs>
+          <w:tab w:val="num" w:pos="6480"/>
+        </w:tabs>
+        <w:ind w:left="6480" w:hanging="360"/>
+      </w:pPr>
+      <w:rPr>
+        <w:rFonts w:ascii="Wingdings" w:hAnsi="Wingdings" w:hint="default"/>
+        <w:sz w:val="20"/>
+      </w:rPr>
+    </w:lvl>
+  </w:abstractNum>
+  <w:abstractNum w:abstractNumId="12" w15:restartNumberingAfterBreak="0">
     <w:nsid w:val="7D0916E7"/>
     <w:multiLevelType w:val="hybridMultilevel"/>
     <w:tmpl w:val="1E32C622"/>
@@ -18415,6 +19835,9 @@
     <w:abstractNumId w:val="1"/>
   </w:num>
   <w:num w:numId="12" w16cid:durableId="746222985">
+    <w:abstractNumId w:val="12"/>
+  </w:num>
+  <w:num w:numId="13" w16cid:durableId="1823037376">
     <w:abstractNumId w:val="11"/>
   </w:num>
 </w:numbering>

</xml_diff>

<commit_message>
Sync and async with movie api
</commit_message>
<xml_diff>
--- a/Interview prep/JavaScript Notes.docx
+++ b/Interview prep/JavaScript Notes.docx
@@ -12161,7 +12161,7 @@
           <w:szCs w:val="24"/>
         </w:rPr>
         <w:drawing>
-          <wp:anchor distT="0" distB="0" distL="114300" distR="114300" simplePos="0" relativeHeight="251669504" behindDoc="1" locked="0" layoutInCell="1" allowOverlap="1" wp14:anchorId="550DC1DB" wp14:editId="303D3E77">
+          <wp:anchor distT="0" distB="0" distL="114300" distR="114300" simplePos="0" relativeHeight="251669504" behindDoc="1" locked="0" layoutInCell="1" allowOverlap="1" wp14:anchorId="550DC1DB" wp14:editId="7FFBC54D">
             <wp:simplePos x="0" y="0"/>
             <wp:positionH relativeFrom="column">
               <wp:posOffset>4500563</wp:posOffset>
@@ -12883,7 +12883,7 @@
           <w:szCs w:val="24"/>
         </w:rPr>
         <w:drawing>
-          <wp:anchor distT="0" distB="0" distL="114300" distR="114300" simplePos="0" relativeHeight="251671552" behindDoc="1" locked="0" layoutInCell="1" allowOverlap="1" wp14:anchorId="280F6B0D" wp14:editId="116D7C10">
+          <wp:anchor distT="0" distB="0" distL="114300" distR="114300" simplePos="0" relativeHeight="251671552" behindDoc="1" locked="0" layoutInCell="1" allowOverlap="1" wp14:anchorId="280F6B0D" wp14:editId="0B601469">
             <wp:simplePos x="0" y="0"/>
             <wp:positionH relativeFrom="margin">
               <wp:posOffset>4129088</wp:posOffset>
@@ -12945,7 +12945,7 @@
           <w:szCs w:val="24"/>
         </w:rPr>
         <w:drawing>
-          <wp:anchor distT="0" distB="0" distL="114300" distR="114300" simplePos="0" relativeHeight="251670528" behindDoc="0" locked="0" layoutInCell="1" allowOverlap="1" wp14:anchorId="399410B9" wp14:editId="6659786B">
+          <wp:anchor distT="0" distB="0" distL="114300" distR="114300" simplePos="0" relativeHeight="251670528" behindDoc="0" locked="0" layoutInCell="1" allowOverlap="1" wp14:anchorId="399410B9" wp14:editId="392CEBD5">
             <wp:simplePos x="0" y="0"/>
             <wp:positionH relativeFrom="margin">
               <wp:posOffset>-9525</wp:posOffset>
@@ -16321,7 +16321,7 @@
           <w:szCs w:val="24"/>
         </w:rPr>
         <w:drawing>
-          <wp:anchor distT="0" distB="0" distL="114300" distR="114300" simplePos="0" relativeHeight="251675648" behindDoc="0" locked="0" layoutInCell="1" allowOverlap="1" wp14:anchorId="72A4C6A1" wp14:editId="031C0E33">
+          <wp:anchor distT="0" distB="0" distL="114300" distR="114300" simplePos="0" relativeHeight="251675648" behindDoc="0" locked="0" layoutInCell="1" allowOverlap="1" wp14:anchorId="72A4C6A1" wp14:editId="2BC17EDF">
             <wp:simplePos x="0" y="0"/>
             <wp:positionH relativeFrom="margin">
               <wp:posOffset>3009900</wp:posOffset>
@@ -17096,6 +17096,7 @@
       </w:pPr>
       <w:r>
         <w:rPr>
+          <w:noProof/>
           <w:sz w:val="24"/>
           <w:szCs w:val="24"/>
         </w:rPr>
@@ -17210,11 +17211,12 @@
       </w:pPr>
       <w:r>
         <w:rPr>
+          <w:noProof/>
           <w:sz w:val="24"/>
           <w:szCs w:val="24"/>
         </w:rPr>
         <w:drawing>
-          <wp:anchor distT="0" distB="0" distL="114300" distR="114300" simplePos="0" relativeHeight="251677696" behindDoc="0" locked="0" layoutInCell="1" allowOverlap="1" wp14:anchorId="53CE638B" wp14:editId="4A3692CE">
+          <wp:anchor distT="0" distB="0" distL="114300" distR="114300" simplePos="0" relativeHeight="251677696" behindDoc="0" locked="0" layoutInCell="1" allowOverlap="1" wp14:anchorId="53CE638B" wp14:editId="2E69CBF0">
             <wp:simplePos x="0" y="0"/>
             <wp:positionH relativeFrom="column">
               <wp:posOffset>3916680</wp:posOffset>
@@ -17360,12 +17362,13 @@
       </w:pPr>
       <w:r>
         <w:rPr>
+          <w:noProof/>
           <w:sz w:val="24"/>
           <w:szCs w:val="24"/>
         </w:rPr>
         <w:lastRenderedPageBreak/>
         <w:drawing>
-          <wp:anchor distT="0" distB="0" distL="114300" distR="114300" simplePos="0" relativeHeight="251679744" behindDoc="0" locked="0" layoutInCell="1" allowOverlap="1" wp14:anchorId="78DD0233" wp14:editId="10A970F8">
+          <wp:anchor distT="0" distB="0" distL="114300" distR="114300" simplePos="0" relativeHeight="251679744" behindDoc="0" locked="0" layoutInCell="1" allowOverlap="1" wp14:anchorId="78DD0233" wp14:editId="2C4356E8">
             <wp:simplePos x="0" y="0"/>
             <wp:positionH relativeFrom="column">
               <wp:posOffset>3711484</wp:posOffset>
@@ -17430,6 +17433,7 @@
       </w:r>
       <w:r>
         <w:rPr>
+          <w:noProof/>
           <w:sz w:val="24"/>
           <w:szCs w:val="24"/>
         </w:rPr>
@@ -17517,11 +17521,12 @@
       </w:pPr>
       <w:r>
         <w:rPr>
+          <w:noProof/>
           <w:sz w:val="24"/>
           <w:szCs w:val="24"/>
         </w:rPr>
         <w:drawing>
-          <wp:anchor distT="0" distB="0" distL="114300" distR="114300" simplePos="0" relativeHeight="251681792" behindDoc="0" locked="0" layoutInCell="1" allowOverlap="1" wp14:anchorId="6E1C9C1B" wp14:editId="0435E6C1">
+          <wp:anchor distT="0" distB="0" distL="114300" distR="114300" simplePos="0" relativeHeight="251681792" behindDoc="0" locked="0" layoutInCell="1" allowOverlap="1" wp14:anchorId="6E1C9C1B" wp14:editId="7932C884">
             <wp:simplePos x="0" y="0"/>
             <wp:positionH relativeFrom="column">
               <wp:posOffset>3782695</wp:posOffset>
@@ -17586,6 +17591,7 @@
       </w:r>
       <w:r>
         <w:rPr>
+          <w:noProof/>
           <w:sz w:val="24"/>
           <w:szCs w:val="24"/>
         </w:rPr>
@@ -18118,9 +18124,1628 @@
           <w:u w:val="single"/>
         </w:rPr>
         <w:lastRenderedPageBreak/>
-        <w:t>Local Storage &amp; Session Storage</w:t>
-      </w:r>
-      <w:r>
+        <w:t>Local Storage &amp; Session Storage in JavaScript</w:t>
+      </w:r>
+    </w:p>
+    <w:p>
+      <w:pPr>
+        <w:rPr>
+          <w:b/>
+          <w:bCs/>
+          <w:sz w:val="24"/>
+          <w:szCs w:val="24"/>
+        </w:rPr>
+      </w:pPr>
+      <w:r>
+        <w:rPr>
+          <w:b/>
+          <w:bCs/>
+          <w:sz w:val="24"/>
+          <w:szCs w:val="24"/>
+        </w:rPr>
+        <w:t>What is Web Storage?</w:t>
+      </w:r>
+    </w:p>
+    <w:p>
+      <w:pPr>
+        <w:rPr>
+          <w:sz w:val="24"/>
+          <w:szCs w:val="24"/>
+        </w:rPr>
+      </w:pPr>
+      <w:r>
+        <w:rPr>
+          <w:sz w:val="24"/>
+          <w:szCs w:val="24"/>
+        </w:rPr>
+        <w:t>Web Storage allows JavaScript to store data in the browser without using a database.</w:t>
+      </w:r>
+    </w:p>
+    <w:p>
+      <w:pPr>
+        <w:rPr>
+          <w:sz w:val="24"/>
+          <w:szCs w:val="24"/>
+        </w:rPr>
+      </w:pPr>
+      <w:r>
+        <w:rPr>
+          <w:sz w:val="24"/>
+          <w:szCs w:val="24"/>
+        </w:rPr>
+        <w:t>There are two types:</w:t>
+      </w:r>
+    </w:p>
+    <w:p>
+      <w:pPr>
+        <w:pStyle w:val="ListParagraph"/>
+        <w:numPr>
+          <w:ilvl w:val="0"/>
+          <w:numId w:val="14"/>
+        </w:numPr>
+        <w:rPr>
+          <w:sz w:val="24"/>
+          <w:szCs w:val="24"/>
+        </w:rPr>
+      </w:pPr>
+      <w:r>
+        <w:rPr>
+          <w:sz w:val="24"/>
+          <w:szCs w:val="24"/>
+        </w:rPr>
+        <w:t xml:space="preserve">Local Storage </w:t>
+      </w:r>
+    </w:p>
+    <w:p>
+      <w:pPr>
+        <w:pStyle w:val="ListParagraph"/>
+        <w:numPr>
+          <w:ilvl w:val="0"/>
+          <w:numId w:val="14"/>
+        </w:numPr>
+        <w:rPr>
+          <w:sz w:val="24"/>
+          <w:szCs w:val="24"/>
+        </w:rPr>
+      </w:pPr>
+      <w:r>
+        <w:rPr>
+          <w:sz w:val="24"/>
+          <w:szCs w:val="24"/>
+        </w:rPr>
+        <w:t>Session Storage</w:t>
+      </w:r>
+    </w:p>
+    <w:p>
+      <w:pPr>
+        <w:rPr>
+          <w:b/>
+          <w:bCs/>
+          <w:sz w:val="24"/>
+          <w:szCs w:val="24"/>
+        </w:rPr>
+      </w:pPr>
+      <w:r>
+        <w:rPr>
+          <w:b/>
+          <w:bCs/>
+          <w:sz w:val="24"/>
+          <w:szCs w:val="24"/>
+        </w:rPr>
+        <w:t>Why Do We Use Web Storage?</w:t>
+      </w:r>
+    </w:p>
+    <w:p>
+      <w:pPr>
+        <w:rPr>
+          <w:sz w:val="24"/>
+          <w:szCs w:val="24"/>
+        </w:rPr>
+      </w:pPr>
+      <w:r>
+        <w:rPr>
+          <w:sz w:val="24"/>
+          <w:szCs w:val="24"/>
+        </w:rPr>
+        <w:t>Web Storage is used to store user data in the browser.</w:t>
+      </w:r>
+    </w:p>
+    <w:p>
+      <w:pPr>
+        <w:rPr>
+          <w:b/>
+          <w:bCs/>
+          <w:sz w:val="24"/>
+          <w:szCs w:val="24"/>
+        </w:rPr>
+      </w:pPr>
+      <w:r>
+        <w:rPr>
+          <w:b/>
+          <w:bCs/>
+          <w:sz w:val="24"/>
+          <w:szCs w:val="24"/>
+        </w:rPr>
+        <w:t>Real-Time Examples</w:t>
+      </w:r>
+    </w:p>
+    <w:p>
+      <w:pPr>
+        <w:pStyle w:val="ListParagraph"/>
+        <w:numPr>
+          <w:ilvl w:val="0"/>
+          <w:numId w:val="15"/>
+        </w:numPr>
+        <w:rPr>
+          <w:b/>
+          <w:bCs/>
+          <w:sz w:val="24"/>
+          <w:szCs w:val="24"/>
+        </w:rPr>
+      </w:pPr>
+      <w:r>
+        <w:rPr>
+          <w:sz w:val="24"/>
+          <w:szCs w:val="24"/>
+        </w:rPr>
+        <w:t xml:space="preserve">Dark/Light Theme Preference </w:t>
+      </w:r>
+    </w:p>
+    <w:p>
+      <w:pPr>
+        <w:pStyle w:val="ListParagraph"/>
+        <w:numPr>
+          <w:ilvl w:val="0"/>
+          <w:numId w:val="15"/>
+        </w:numPr>
+        <w:rPr>
+          <w:b/>
+          <w:bCs/>
+          <w:sz w:val="24"/>
+          <w:szCs w:val="24"/>
+        </w:rPr>
+      </w:pPr>
+      <w:r>
+        <w:rPr>
+          <w:sz w:val="24"/>
+          <w:szCs w:val="24"/>
+        </w:rPr>
+        <w:t xml:space="preserve">Shopping Cart Data </w:t>
+      </w:r>
+    </w:p>
+    <w:p>
+      <w:pPr>
+        <w:pStyle w:val="ListParagraph"/>
+        <w:numPr>
+          <w:ilvl w:val="0"/>
+          <w:numId w:val="15"/>
+        </w:numPr>
+        <w:rPr>
+          <w:b/>
+          <w:bCs/>
+          <w:sz w:val="24"/>
+          <w:szCs w:val="24"/>
+        </w:rPr>
+      </w:pPr>
+      <w:r>
+        <w:rPr>
+          <w:sz w:val="24"/>
+          <w:szCs w:val="24"/>
+        </w:rPr>
+        <w:t xml:space="preserve">Language Settings </w:t>
+      </w:r>
+    </w:p>
+    <w:p>
+      <w:pPr>
+        <w:pStyle w:val="ListParagraph"/>
+        <w:numPr>
+          <w:ilvl w:val="0"/>
+          <w:numId w:val="15"/>
+        </w:numPr>
+        <w:rPr>
+          <w:b/>
+          <w:bCs/>
+          <w:sz w:val="24"/>
+          <w:szCs w:val="24"/>
+        </w:rPr>
+      </w:pPr>
+      <w:r>
+        <w:rPr>
+          <w:sz w:val="24"/>
+          <w:szCs w:val="24"/>
+        </w:rPr>
+        <w:t xml:space="preserve">Remember Username </w:t>
+      </w:r>
+    </w:p>
+    <w:p>
+      <w:pPr>
+        <w:pStyle w:val="ListParagraph"/>
+        <w:numPr>
+          <w:ilvl w:val="0"/>
+          <w:numId w:val="15"/>
+        </w:numPr>
+        <w:rPr>
+          <w:b/>
+          <w:bCs/>
+          <w:sz w:val="24"/>
+          <w:szCs w:val="24"/>
+        </w:rPr>
+      </w:pPr>
+      <w:r>
+        <w:rPr>
+          <w:sz w:val="24"/>
+          <w:szCs w:val="24"/>
+        </w:rPr>
+        <w:t xml:space="preserve">Form Drafts </w:t>
+      </w:r>
+    </w:p>
+    <w:p>
+      <w:pPr>
+        <w:pStyle w:val="ListParagraph"/>
+        <w:numPr>
+          <w:ilvl w:val="0"/>
+          <w:numId w:val="15"/>
+        </w:numPr>
+        <w:rPr>
+          <w:b/>
+          <w:bCs/>
+          <w:sz w:val="24"/>
+          <w:szCs w:val="24"/>
+        </w:rPr>
+      </w:pPr>
+      <w:r>
+        <w:rPr>
+          <w:sz w:val="24"/>
+          <w:szCs w:val="24"/>
+        </w:rPr>
+        <w:t>User Preferences</w:t>
+      </w:r>
+    </w:p>
+    <w:p>
+      <w:pPr>
+        <w:rPr>
+          <w:b/>
+          <w:bCs/>
+          <w:sz w:val="24"/>
+          <w:szCs w:val="24"/>
+        </w:rPr>
+      </w:pPr>
+      <w:r>
+        <w:rPr>
+          <w:b/>
+          <w:bCs/>
+          <w:sz w:val="24"/>
+          <w:szCs w:val="24"/>
+        </w:rPr>
+        <w:t>Local Storage</w:t>
+      </w:r>
+    </w:p>
+    <w:p>
+      <w:pPr>
+        <w:rPr>
+          <w:sz w:val="24"/>
+          <w:szCs w:val="24"/>
+        </w:rPr>
+      </w:pPr>
+      <w:r>
+        <w:rPr>
+          <w:sz w:val="24"/>
+          <w:szCs w:val="24"/>
+        </w:rPr>
+        <w:t>Local Storage stores data permanently in the browser until it is manually removed.</w:t>
+      </w:r>
+    </w:p>
+    <w:p>
+      <w:pPr>
+        <w:rPr>
+          <w:sz w:val="24"/>
+          <w:szCs w:val="24"/>
+        </w:rPr>
+      </w:pPr>
+      <w:r>
+        <w:rPr>
+          <w:sz w:val="24"/>
+          <w:szCs w:val="24"/>
+        </w:rPr>
+        <w:t>Local Storage is a browser storage mechanism that stores data with no expiration time. The data remains available even after closing and reopening the browser.</w:t>
+      </w:r>
+    </w:p>
+    <w:p>
+      <w:pPr>
+        <w:rPr>
+          <w:b/>
+          <w:bCs/>
+          <w:sz w:val="24"/>
+          <w:szCs w:val="24"/>
+        </w:rPr>
+      </w:pPr>
+      <w:r>
+        <w:rPr>
+          <w:b/>
+          <w:bCs/>
+          <w:sz w:val="24"/>
+          <w:szCs w:val="24"/>
+        </w:rPr>
+        <w:t>Session Storage</w:t>
+      </w:r>
+    </w:p>
+    <w:p>
+      <w:pPr>
+        <w:rPr>
+          <w:sz w:val="24"/>
+          <w:szCs w:val="24"/>
+        </w:rPr>
+      </w:pPr>
+      <w:r>
+        <w:rPr>
+          <w:sz w:val="24"/>
+          <w:szCs w:val="24"/>
+        </w:rPr>
+        <w:t>Session Storage stores data only for the current browser tab/session.</w:t>
+      </w:r>
+    </w:p>
+    <w:p>
+      <w:pPr>
+        <w:rPr>
+          <w:sz w:val="24"/>
+          <w:szCs w:val="24"/>
+        </w:rPr>
+      </w:pPr>
+      <w:r>
+        <w:rPr>
+          <w:sz w:val="24"/>
+          <w:szCs w:val="24"/>
+        </w:rPr>
+        <w:drawing>
+          <wp:anchor distT="0" distB="0" distL="114300" distR="114300" simplePos="0" relativeHeight="251683840" behindDoc="0" locked="0" layoutInCell="1" allowOverlap="1" wp14:anchorId="03CF1B0F" wp14:editId="45000879">
+            <wp:simplePos x="0" y="0"/>
+            <wp:positionH relativeFrom="margin">
+              <wp:posOffset>1895475</wp:posOffset>
+            </wp:positionH>
+            <wp:positionV relativeFrom="paragraph">
+              <wp:posOffset>299720</wp:posOffset>
+            </wp:positionV>
+            <wp:extent cx="1736090" cy="3476625"/>
+            <wp:effectExtent l="0" t="0" r="0" b="9525"/>
+            <wp:wrapThrough wrapText="bothSides">
+              <wp:wrapPolygon edited="0">
+                <wp:start x="0" y="0"/>
+                <wp:lineTo x="0" y="21541"/>
+                <wp:lineTo x="21331" y="21541"/>
+                <wp:lineTo x="21331" y="0"/>
+                <wp:lineTo x="0" y="0"/>
+              </wp:wrapPolygon>
+            </wp:wrapThrough>
+            <wp:docPr id="90199709" name="Picture 1"/>
+            <wp:cNvGraphicFramePr>
+              <a:graphicFrameLocks xmlns:a="http://schemas.openxmlformats.org/drawingml/2006/main" noChangeAspect="1"/>
+            </wp:cNvGraphicFramePr>
+            <a:graphic xmlns:a="http://schemas.openxmlformats.org/drawingml/2006/main">
+              <a:graphicData uri="http://schemas.openxmlformats.org/drawingml/2006/picture">
+                <pic:pic xmlns:pic="http://schemas.openxmlformats.org/drawingml/2006/picture">
+                  <pic:nvPicPr>
+                    <pic:cNvPr id="90199709" name=""/>
+                    <pic:cNvPicPr/>
+                  </pic:nvPicPr>
+                  <pic:blipFill>
+                    <a:blip r:embed="rId43">
+                      <a:extLst>
+                        <a:ext uri="{28A0092B-C50C-407E-A947-70E740481C1C}">
+                          <a14:useLocalDpi xmlns:a14="http://schemas.microsoft.com/office/drawing/2010/main" val="0"/>
+                        </a:ext>
+                      </a:extLst>
+                    </a:blip>
+                    <a:stretch>
+                      <a:fillRect/>
+                    </a:stretch>
+                  </pic:blipFill>
+                  <pic:spPr>
+                    <a:xfrm>
+                      <a:off x="0" y="0"/>
+                      <a:ext cx="1736090" cy="3476625"/>
+                    </a:xfrm>
+                    <a:prstGeom prst="rect">
+                      <a:avLst/>
+                    </a:prstGeom>
+                  </pic:spPr>
+                </pic:pic>
+              </a:graphicData>
+            </a:graphic>
+            <wp14:sizeRelH relativeFrom="page">
+              <wp14:pctWidth>0</wp14:pctWidth>
+            </wp14:sizeRelH>
+            <wp14:sizeRelV relativeFrom="page">
+              <wp14:pctHeight>0</wp14:pctHeight>
+            </wp14:sizeRelV>
+          </wp:anchor>
+        </w:drawing>
+      </w:r>
+      <w:r>
+        <w:rPr>
+          <w:sz w:val="24"/>
+          <w:szCs w:val="24"/>
+        </w:rPr>
+        <w:t>Session Storage stores data temporarily and automatically removes it when the browser tab is closed.</w:t>
+      </w:r>
+    </w:p>
+    <w:p>
+      <w:pPr>
+        <w:rPr>
+          <w:sz w:val="24"/>
+          <w:szCs w:val="24"/>
+        </w:rPr>
+      </w:pPr>
+      <w:r>
+        <w:rPr>
+          <w:noProof/>
+          <w:sz w:val="24"/>
+          <w:szCs w:val="24"/>
+        </w:rPr>
+        <w:drawing>
+          <wp:inline distT="0" distB="0" distL="0" distR="0" wp14:anchorId="208E889F" wp14:editId="52D7EE51">
+            <wp:extent cx="1752600" cy="3429000"/>
+            <wp:effectExtent l="0" t="0" r="0" b="0"/>
+            <wp:docPr id="1640899340" name="Picture 1"/>
+            <wp:cNvGraphicFramePr>
+              <a:graphicFrameLocks xmlns:a="http://schemas.openxmlformats.org/drawingml/2006/main" noChangeAspect="1"/>
+            </wp:cNvGraphicFramePr>
+            <a:graphic xmlns:a="http://schemas.openxmlformats.org/drawingml/2006/main">
+              <a:graphicData uri="http://schemas.openxmlformats.org/drawingml/2006/picture">
+                <pic:pic xmlns:pic="http://schemas.openxmlformats.org/drawingml/2006/picture">
+                  <pic:nvPicPr>
+                    <pic:cNvPr id="0" name="Picture 2"/>
+                    <pic:cNvPicPr>
+                      <a:picLocks noChangeAspect="1" noChangeArrowheads="1"/>
+                    </pic:cNvPicPr>
+                  </pic:nvPicPr>
+                  <pic:blipFill>
+                    <a:blip r:embed="rId44" cstate="print">
+                      <a:extLst>
+                        <a:ext uri="{28A0092B-C50C-407E-A947-70E740481C1C}">
+                          <a14:useLocalDpi xmlns:a14="http://schemas.microsoft.com/office/drawing/2010/main" val="0"/>
+                        </a:ext>
+                      </a:extLst>
+                    </a:blip>
+                    <a:srcRect/>
+                    <a:stretch>
+                      <a:fillRect/>
+                    </a:stretch>
+                  </pic:blipFill>
+                  <pic:spPr bwMode="auto">
+                    <a:xfrm>
+                      <a:off x="0" y="0"/>
+                      <a:ext cx="1762690" cy="3448742"/>
+                    </a:xfrm>
+                    <a:prstGeom prst="rect">
+                      <a:avLst/>
+                    </a:prstGeom>
+                    <a:noFill/>
+                  </pic:spPr>
+                </pic:pic>
+              </a:graphicData>
+            </a:graphic>
+          </wp:inline>
+        </w:drawing>
+      </w:r>
+    </w:p>
+    <w:p>
+      <w:pPr>
+        <w:rPr>
+          <w:b/>
+          <w:bCs/>
+          <w:sz w:val="24"/>
+          <w:szCs w:val="24"/>
+        </w:rPr>
+      </w:pPr>
+      <w:r>
+        <w:rPr>
+          <w:b/>
+          <w:bCs/>
+          <w:sz w:val="24"/>
+          <w:szCs w:val="24"/>
+        </w:rPr>
+        <w:t>Difference Between Local Storage &amp; Session Storage</w:t>
+      </w:r>
+    </w:p>
+    <w:tbl>
+      <w:tblPr>
+        <w:tblW w:w="10892" w:type="dxa"/>
+        <w:tblCellSpacing w:w="15" w:type="dxa"/>
+        <w:tblBorders>
+          <w:top w:val="single" w:sz="4" w:space="0" w:color="auto"/>
+          <w:left w:val="single" w:sz="4" w:space="0" w:color="auto"/>
+          <w:bottom w:val="single" w:sz="4" w:space="0" w:color="auto"/>
+          <w:right w:val="single" w:sz="4" w:space="0" w:color="auto"/>
+          <w:insideH w:val="single" w:sz="4" w:space="0" w:color="auto"/>
+          <w:insideV w:val="single" w:sz="4" w:space="0" w:color="auto"/>
+        </w:tblBorders>
+        <w:tblCellMar>
+          <w:top w:w="15" w:type="dxa"/>
+          <w:left w:w="15" w:type="dxa"/>
+          <w:bottom w:w="15" w:type="dxa"/>
+          <w:right w:w="15" w:type="dxa"/>
+        </w:tblCellMar>
+        <w:tblLook w:val="04A0" w:firstRow="1" w:lastRow="0" w:firstColumn="1" w:lastColumn="0" w:noHBand="0" w:noVBand="1"/>
+      </w:tblPr>
+      <w:tblGrid>
+        <w:gridCol w:w="3868"/>
+        <w:gridCol w:w="2957"/>
+        <w:gridCol w:w="4067"/>
+      </w:tblGrid>
+      <w:tr>
+        <w:trPr>
+          <w:trHeight w:val="241"/>
+          <w:tblHeader/>
+          <w:tblCellSpacing w:w="15" w:type="dxa"/>
+        </w:trPr>
+        <w:tc>
+          <w:tcPr>
+            <w:tcW w:w="0" w:type="auto"/>
+            <w:vAlign w:val="center"/>
+            <w:hideMark/>
+          </w:tcPr>
+          <w:p>
+            <w:pPr>
+              <w:rPr>
+                <w:b/>
+                <w:bCs/>
+                <w:sz w:val="24"/>
+                <w:szCs w:val="24"/>
+              </w:rPr>
+            </w:pPr>
+            <w:r>
+              <w:rPr>
+                <w:b/>
+                <w:bCs/>
+                <w:sz w:val="24"/>
+                <w:szCs w:val="24"/>
+              </w:rPr>
+              <w:lastRenderedPageBreak/>
+              <w:t>Feature</w:t>
+            </w:r>
+          </w:p>
+        </w:tc>
+        <w:tc>
+          <w:tcPr>
+            <w:tcW w:w="0" w:type="auto"/>
+            <w:vAlign w:val="center"/>
+            <w:hideMark/>
+          </w:tcPr>
+          <w:p>
+            <w:pPr>
+              <w:rPr>
+                <w:b/>
+                <w:bCs/>
+                <w:sz w:val="24"/>
+                <w:szCs w:val="24"/>
+              </w:rPr>
+            </w:pPr>
+            <w:r>
+              <w:rPr>
+                <w:b/>
+                <w:bCs/>
+                <w:sz w:val="24"/>
+                <w:szCs w:val="24"/>
+              </w:rPr>
+              <w:t>Local Storage</w:t>
+            </w:r>
+          </w:p>
+        </w:tc>
+        <w:tc>
+          <w:tcPr>
+            <w:tcW w:w="0" w:type="auto"/>
+            <w:vAlign w:val="center"/>
+            <w:hideMark/>
+          </w:tcPr>
+          <w:p>
+            <w:pPr>
+              <w:rPr>
+                <w:b/>
+                <w:bCs/>
+                <w:sz w:val="24"/>
+                <w:szCs w:val="24"/>
+              </w:rPr>
+            </w:pPr>
+            <w:r>
+              <w:rPr>
+                <w:b/>
+                <w:bCs/>
+                <w:sz w:val="24"/>
+                <w:szCs w:val="24"/>
+              </w:rPr>
+              <w:t>Session Storage</w:t>
+            </w:r>
+          </w:p>
+        </w:tc>
+      </w:tr>
+      <w:tr>
+        <w:trPr>
+          <w:trHeight w:val="248"/>
+          <w:tblCellSpacing w:w="15" w:type="dxa"/>
+        </w:trPr>
+        <w:tc>
+          <w:tcPr>
+            <w:tcW w:w="0" w:type="auto"/>
+            <w:vAlign w:val="center"/>
+            <w:hideMark/>
+          </w:tcPr>
+          <w:p>
+            <w:pPr>
+              <w:rPr>
+                <w:sz w:val="24"/>
+                <w:szCs w:val="24"/>
+              </w:rPr>
+            </w:pPr>
+            <w:r>
+              <w:rPr>
+                <w:sz w:val="24"/>
+                <w:szCs w:val="24"/>
+              </w:rPr>
+              <w:t>Storage Limit</w:t>
+            </w:r>
+          </w:p>
+        </w:tc>
+        <w:tc>
+          <w:tcPr>
+            <w:tcW w:w="0" w:type="auto"/>
+            <w:vAlign w:val="center"/>
+            <w:hideMark/>
+          </w:tcPr>
+          <w:p>
+            <w:pPr>
+              <w:rPr>
+                <w:sz w:val="24"/>
+                <w:szCs w:val="24"/>
+              </w:rPr>
+            </w:pPr>
+            <w:r>
+              <w:rPr>
+                <w:sz w:val="24"/>
+                <w:szCs w:val="24"/>
+              </w:rPr>
+              <w:t>~5-10 MB</w:t>
+            </w:r>
+          </w:p>
+        </w:tc>
+        <w:tc>
+          <w:tcPr>
+            <w:tcW w:w="0" w:type="auto"/>
+            <w:vAlign w:val="center"/>
+            <w:hideMark/>
+          </w:tcPr>
+          <w:p>
+            <w:pPr>
+              <w:rPr>
+                <w:sz w:val="24"/>
+                <w:szCs w:val="24"/>
+              </w:rPr>
+            </w:pPr>
+            <w:r>
+              <w:rPr>
+                <w:sz w:val="24"/>
+                <w:szCs w:val="24"/>
+              </w:rPr>
+              <w:t>~5-10 MB</w:t>
+            </w:r>
+          </w:p>
+        </w:tc>
+      </w:tr>
+      <w:tr>
+        <w:trPr>
+          <w:trHeight w:val="244"/>
+          <w:tblCellSpacing w:w="15" w:type="dxa"/>
+        </w:trPr>
+        <w:tc>
+          <w:tcPr>
+            <w:tcW w:w="0" w:type="auto"/>
+            <w:vAlign w:val="center"/>
+            <w:hideMark/>
+          </w:tcPr>
+          <w:p>
+            <w:pPr>
+              <w:rPr>
+                <w:sz w:val="24"/>
+                <w:szCs w:val="24"/>
+              </w:rPr>
+            </w:pPr>
+            <w:r>
+              <w:rPr>
+                <w:sz w:val="24"/>
+                <w:szCs w:val="24"/>
+              </w:rPr>
+              <w:t>Expiry</w:t>
+            </w:r>
+          </w:p>
+        </w:tc>
+        <w:tc>
+          <w:tcPr>
+            <w:tcW w:w="0" w:type="auto"/>
+            <w:vAlign w:val="center"/>
+            <w:hideMark/>
+          </w:tcPr>
+          <w:p>
+            <w:pPr>
+              <w:rPr>
+                <w:sz w:val="24"/>
+                <w:szCs w:val="24"/>
+              </w:rPr>
+            </w:pPr>
+            <w:r>
+              <w:rPr>
+                <w:sz w:val="24"/>
+                <w:szCs w:val="24"/>
+              </w:rPr>
+              <w:t>No Expiry</w:t>
+            </w:r>
+          </w:p>
+        </w:tc>
+        <w:tc>
+          <w:tcPr>
+            <w:tcW w:w="0" w:type="auto"/>
+            <w:vAlign w:val="center"/>
+            <w:hideMark/>
+          </w:tcPr>
+          <w:p>
+            <w:pPr>
+              <w:rPr>
+                <w:sz w:val="24"/>
+                <w:szCs w:val="24"/>
+              </w:rPr>
+            </w:pPr>
+            <w:r>
+              <w:rPr>
+                <w:sz w:val="24"/>
+                <w:szCs w:val="24"/>
+              </w:rPr>
+              <w:t>Ends when tab closes</w:t>
+            </w:r>
+          </w:p>
+        </w:tc>
+      </w:tr>
+      <w:tr>
+        <w:trPr>
+          <w:trHeight w:val="244"/>
+          <w:tblCellSpacing w:w="15" w:type="dxa"/>
+        </w:trPr>
+        <w:tc>
+          <w:tcPr>
+            <w:tcW w:w="0" w:type="auto"/>
+            <w:vAlign w:val="center"/>
+            <w:hideMark/>
+          </w:tcPr>
+          <w:p>
+            <w:pPr>
+              <w:rPr>
+                <w:sz w:val="24"/>
+                <w:szCs w:val="24"/>
+              </w:rPr>
+            </w:pPr>
+            <w:r>
+              <w:rPr>
+                <w:sz w:val="24"/>
+                <w:szCs w:val="24"/>
+              </w:rPr>
+              <w:t>Browser Restart</w:t>
+            </w:r>
+          </w:p>
+        </w:tc>
+        <w:tc>
+          <w:tcPr>
+            <w:tcW w:w="0" w:type="auto"/>
+            <w:vAlign w:val="center"/>
+            <w:hideMark/>
+          </w:tcPr>
+          <w:p>
+            <w:pPr>
+              <w:rPr>
+                <w:sz w:val="24"/>
+                <w:szCs w:val="24"/>
+              </w:rPr>
+            </w:pPr>
+            <w:r>
+              <w:rPr>
+                <w:sz w:val="24"/>
+                <w:szCs w:val="24"/>
+              </w:rPr>
+              <w:t>Data remains</w:t>
+            </w:r>
+          </w:p>
+        </w:tc>
+        <w:tc>
+          <w:tcPr>
+            <w:tcW w:w="0" w:type="auto"/>
+            <w:vAlign w:val="center"/>
+            <w:hideMark/>
+          </w:tcPr>
+          <w:p>
+            <w:pPr>
+              <w:rPr>
+                <w:sz w:val="24"/>
+                <w:szCs w:val="24"/>
+              </w:rPr>
+            </w:pPr>
+            <w:r>
+              <w:rPr>
+                <w:sz w:val="24"/>
+                <w:szCs w:val="24"/>
+              </w:rPr>
+              <w:t>Data removed</w:t>
+            </w:r>
+          </w:p>
+        </w:tc>
+      </w:tr>
+      <w:tr>
+        <w:trPr>
+          <w:trHeight w:val="244"/>
+          <w:tblCellSpacing w:w="15" w:type="dxa"/>
+        </w:trPr>
+        <w:tc>
+          <w:tcPr>
+            <w:tcW w:w="0" w:type="auto"/>
+            <w:vAlign w:val="center"/>
+            <w:hideMark/>
+          </w:tcPr>
+          <w:p>
+            <w:pPr>
+              <w:rPr>
+                <w:sz w:val="24"/>
+                <w:szCs w:val="24"/>
+              </w:rPr>
+            </w:pPr>
+            <w:r>
+              <w:rPr>
+                <w:sz w:val="24"/>
+                <w:szCs w:val="24"/>
+              </w:rPr>
+              <w:t>Accessible Across Tabs</w:t>
+            </w:r>
+          </w:p>
+        </w:tc>
+        <w:tc>
+          <w:tcPr>
+            <w:tcW w:w="0" w:type="auto"/>
+            <w:vAlign w:val="center"/>
+            <w:hideMark/>
+          </w:tcPr>
+          <w:p>
+            <w:pPr>
+              <w:rPr>
+                <w:sz w:val="24"/>
+                <w:szCs w:val="24"/>
+              </w:rPr>
+            </w:pPr>
+            <w:r>
+              <w:rPr>
+                <w:sz w:val="24"/>
+                <w:szCs w:val="24"/>
+              </w:rPr>
+              <w:t>Yes</w:t>
+            </w:r>
+          </w:p>
+        </w:tc>
+        <w:tc>
+          <w:tcPr>
+            <w:tcW w:w="0" w:type="auto"/>
+            <w:vAlign w:val="center"/>
+            <w:hideMark/>
+          </w:tcPr>
+          <w:p>
+            <w:pPr>
+              <w:rPr>
+                <w:sz w:val="24"/>
+                <w:szCs w:val="24"/>
+              </w:rPr>
+            </w:pPr>
+            <w:r>
+              <w:rPr>
+                <w:sz w:val="24"/>
+                <w:szCs w:val="24"/>
+              </w:rPr>
+              <w:t>No</w:t>
+            </w:r>
+          </w:p>
+        </w:tc>
+      </w:tr>
+      <w:tr>
+        <w:trPr>
+          <w:trHeight w:val="244"/>
+          <w:tblCellSpacing w:w="15" w:type="dxa"/>
+        </w:trPr>
+        <w:tc>
+          <w:tcPr>
+            <w:tcW w:w="0" w:type="auto"/>
+            <w:vAlign w:val="center"/>
+            <w:hideMark/>
+          </w:tcPr>
+          <w:p>
+            <w:pPr>
+              <w:rPr>
+                <w:sz w:val="24"/>
+                <w:szCs w:val="24"/>
+              </w:rPr>
+            </w:pPr>
+            <w:r>
+              <w:rPr>
+                <w:sz w:val="24"/>
+                <w:szCs w:val="24"/>
+              </w:rPr>
+              <w:t>Use Case</w:t>
+            </w:r>
+          </w:p>
+        </w:tc>
+        <w:tc>
+          <w:tcPr>
+            <w:tcW w:w="0" w:type="auto"/>
+            <w:vAlign w:val="center"/>
+            <w:hideMark/>
+          </w:tcPr>
+          <w:p>
+            <w:pPr>
+              <w:rPr>
+                <w:sz w:val="24"/>
+                <w:szCs w:val="24"/>
+              </w:rPr>
+            </w:pPr>
+            <w:r>
+              <w:rPr>
+                <w:sz w:val="24"/>
+                <w:szCs w:val="24"/>
+              </w:rPr>
+              <w:t>User preferences</w:t>
+            </w:r>
+          </w:p>
+        </w:tc>
+        <w:tc>
+          <w:tcPr>
+            <w:tcW w:w="0" w:type="auto"/>
+            <w:vAlign w:val="center"/>
+            <w:hideMark/>
+          </w:tcPr>
+          <w:p>
+            <w:pPr>
+              <w:rPr>
+                <w:sz w:val="24"/>
+                <w:szCs w:val="24"/>
+              </w:rPr>
+            </w:pPr>
+            <w:r>
+              <w:rPr>
+                <w:sz w:val="24"/>
+                <w:szCs w:val="24"/>
+              </w:rPr>
+              <w:t>Temporary session data</w:t>
+            </w:r>
+          </w:p>
+        </w:tc>
+      </w:tr>
+    </w:tbl>
+    <w:p>
+      <w:pPr>
+        <w:rPr>
+          <w:sz w:val="24"/>
+          <w:szCs w:val="24"/>
+        </w:rPr>
+      </w:pPr>
+      <w:r>
+        <w:rPr>
+          <w:sz w:val="24"/>
+          <w:szCs w:val="24"/>
+        </w:rPr>
+        <w:drawing>
+          <wp:anchor distT="0" distB="0" distL="114300" distR="114300" simplePos="0" relativeHeight="251684864" behindDoc="0" locked="0" layoutInCell="1" allowOverlap="1" wp14:anchorId="5A766BB7" wp14:editId="13189919">
+            <wp:simplePos x="0" y="0"/>
+            <wp:positionH relativeFrom="margin">
+              <wp:align>left</wp:align>
+            </wp:positionH>
+            <wp:positionV relativeFrom="paragraph">
+              <wp:posOffset>501650</wp:posOffset>
+            </wp:positionV>
+            <wp:extent cx="1709420" cy="2110740"/>
+            <wp:effectExtent l="0" t="0" r="5080" b="3810"/>
+            <wp:wrapThrough wrapText="bothSides">
+              <wp:wrapPolygon edited="0">
+                <wp:start x="0" y="0"/>
+                <wp:lineTo x="0" y="21444"/>
+                <wp:lineTo x="21423" y="21444"/>
+                <wp:lineTo x="21423" y="0"/>
+                <wp:lineTo x="0" y="0"/>
+              </wp:wrapPolygon>
+            </wp:wrapThrough>
+            <wp:docPr id="1462318885" name="Picture 1"/>
+            <wp:cNvGraphicFramePr>
+              <a:graphicFrameLocks xmlns:a="http://schemas.openxmlformats.org/drawingml/2006/main" noChangeAspect="1"/>
+            </wp:cNvGraphicFramePr>
+            <a:graphic xmlns:a="http://schemas.openxmlformats.org/drawingml/2006/main">
+              <a:graphicData uri="http://schemas.openxmlformats.org/drawingml/2006/picture">
+                <pic:pic xmlns:pic="http://schemas.openxmlformats.org/drawingml/2006/picture">
+                  <pic:nvPicPr>
+                    <pic:cNvPr id="1462318885" name=""/>
+                    <pic:cNvPicPr/>
+                  </pic:nvPicPr>
+                  <pic:blipFill>
+                    <a:blip r:embed="rId45">
+                      <a:extLst>
+                        <a:ext uri="{28A0092B-C50C-407E-A947-70E740481C1C}">
+                          <a14:useLocalDpi xmlns:a14="http://schemas.microsoft.com/office/drawing/2010/main" val="0"/>
+                        </a:ext>
+                      </a:extLst>
+                    </a:blip>
+                    <a:stretch>
+                      <a:fillRect/>
+                    </a:stretch>
+                  </pic:blipFill>
+                  <pic:spPr>
+                    <a:xfrm>
+                      <a:off x="0" y="0"/>
+                      <a:ext cx="1709420" cy="2110740"/>
+                    </a:xfrm>
+                    <a:prstGeom prst="rect">
+                      <a:avLst/>
+                    </a:prstGeom>
+                  </pic:spPr>
+                </pic:pic>
+              </a:graphicData>
+            </a:graphic>
+            <wp14:sizeRelH relativeFrom="page">
+              <wp14:pctWidth>0</wp14:pctWidth>
+            </wp14:sizeRelH>
+            <wp14:sizeRelV relativeFrom="page">
+              <wp14:pctHeight>0</wp14:pctHeight>
+            </wp14:sizeRelV>
+          </wp:anchor>
+        </w:drawing>
+      </w:r>
+      <w:r>
+        <w:rPr>
+          <w:b/>
+          <w:bCs/>
+          <w:sz w:val="24"/>
+          <w:szCs w:val="24"/>
+        </w:rPr>
+        <w:br/>
+      </w:r>
+      <w:r>
+        <w:rPr>
+          <w:b/>
+          <w:bCs/>
+          <w:sz w:val="24"/>
+          <w:szCs w:val="24"/>
+        </w:rPr>
+        <w:t>Storing Objects</w:t>
+      </w:r>
+      <w:r>
+        <w:rPr>
+          <w:b/>
+          <w:bCs/>
+          <w:sz w:val="24"/>
+          <w:szCs w:val="24"/>
+        </w:rPr>
+        <w:t xml:space="preserve">: </w:t>
+      </w:r>
+      <w:r>
+        <w:rPr>
+          <w:sz w:val="24"/>
+          <w:szCs w:val="24"/>
+        </w:rPr>
+        <w:t xml:space="preserve">Important topic, </w:t>
+      </w:r>
+      <w:r>
+        <w:rPr>
+          <w:sz w:val="24"/>
+          <w:szCs w:val="24"/>
+        </w:rPr>
+        <w:t>Interviewers often ask this.</w:t>
+      </w:r>
+    </w:p>
+    <w:p>
+      <w:pPr>
+        <w:rPr>
+          <w:sz w:val="24"/>
+          <w:szCs w:val="24"/>
+        </w:rPr>
+      </w:pPr>
+      <w:r>
+        <w:rPr>
+          <w:sz w:val="24"/>
+          <w:szCs w:val="24"/>
+        </w:rPr>
+        <w:drawing>
+          <wp:anchor distT="0" distB="0" distL="114300" distR="114300" simplePos="0" relativeHeight="251685888" behindDoc="0" locked="0" layoutInCell="1" allowOverlap="1" wp14:anchorId="4A785601" wp14:editId="35F200B0">
+            <wp:simplePos x="0" y="0"/>
+            <wp:positionH relativeFrom="column">
+              <wp:posOffset>2009775</wp:posOffset>
+            </wp:positionH>
+            <wp:positionV relativeFrom="paragraph">
+              <wp:posOffset>-1270</wp:posOffset>
+            </wp:positionV>
+            <wp:extent cx="1906270" cy="2110740"/>
+            <wp:effectExtent l="0" t="0" r="0" b="3810"/>
+            <wp:wrapThrough wrapText="bothSides">
+              <wp:wrapPolygon edited="0">
+                <wp:start x="0" y="0"/>
+                <wp:lineTo x="0" y="21444"/>
+                <wp:lineTo x="21370" y="21444"/>
+                <wp:lineTo x="21370" y="0"/>
+                <wp:lineTo x="0" y="0"/>
+              </wp:wrapPolygon>
+            </wp:wrapThrough>
+            <wp:docPr id="615861859" name="Picture 1"/>
+            <wp:cNvGraphicFramePr>
+              <a:graphicFrameLocks xmlns:a="http://schemas.openxmlformats.org/drawingml/2006/main" noChangeAspect="1"/>
+            </wp:cNvGraphicFramePr>
+            <a:graphic xmlns:a="http://schemas.openxmlformats.org/drawingml/2006/main">
+              <a:graphicData uri="http://schemas.openxmlformats.org/drawingml/2006/picture">
+                <pic:pic xmlns:pic="http://schemas.openxmlformats.org/drawingml/2006/picture">
+                  <pic:nvPicPr>
+                    <pic:cNvPr id="615861859" name=""/>
+                    <pic:cNvPicPr/>
+                  </pic:nvPicPr>
+                  <pic:blipFill>
+                    <a:blip r:embed="rId46">
+                      <a:extLst>
+                        <a:ext uri="{28A0092B-C50C-407E-A947-70E740481C1C}">
+                          <a14:useLocalDpi xmlns:a14="http://schemas.microsoft.com/office/drawing/2010/main" val="0"/>
+                        </a:ext>
+                      </a:extLst>
+                    </a:blip>
+                    <a:stretch>
+                      <a:fillRect/>
+                    </a:stretch>
+                  </pic:blipFill>
+                  <pic:spPr>
+                    <a:xfrm>
+                      <a:off x="0" y="0"/>
+                      <a:ext cx="1906270" cy="2110740"/>
+                    </a:xfrm>
+                    <a:prstGeom prst="rect">
+                      <a:avLst/>
+                    </a:prstGeom>
+                  </pic:spPr>
+                </pic:pic>
+              </a:graphicData>
+            </a:graphic>
+            <wp14:sizeRelH relativeFrom="page">
+              <wp14:pctWidth>0</wp14:pctWidth>
+            </wp14:sizeRelH>
+            <wp14:sizeRelV relativeFrom="page">
+              <wp14:pctHeight>0</wp14:pctHeight>
+            </wp14:sizeRelV>
+          </wp:anchor>
+        </w:drawing>
+      </w:r>
+      <w:r>
+        <w:rPr>
+          <w:noProof/>
+        </w:rPr>
+        <w:drawing>
+          <wp:anchor distT="0" distB="0" distL="114300" distR="114300" simplePos="0" relativeHeight="251686912" behindDoc="0" locked="0" layoutInCell="1" allowOverlap="1" wp14:anchorId="59D7650A" wp14:editId="0635FDD4">
+            <wp:simplePos x="0" y="0"/>
+            <wp:positionH relativeFrom="margin">
+              <wp:posOffset>4371975</wp:posOffset>
+            </wp:positionH>
+            <wp:positionV relativeFrom="paragraph">
+              <wp:posOffset>-1270</wp:posOffset>
+            </wp:positionV>
+            <wp:extent cx="2032635" cy="2009775"/>
+            <wp:effectExtent l="0" t="0" r="5715" b="9525"/>
+            <wp:wrapThrough wrapText="bothSides">
+              <wp:wrapPolygon edited="0">
+                <wp:start x="0" y="0"/>
+                <wp:lineTo x="0" y="21498"/>
+                <wp:lineTo x="21458" y="21498"/>
+                <wp:lineTo x="21458" y="0"/>
+                <wp:lineTo x="0" y="0"/>
+              </wp:wrapPolygon>
+            </wp:wrapThrough>
+            <wp:docPr id="540781606" name="Picture 1"/>
+            <wp:cNvGraphicFramePr>
+              <a:graphicFrameLocks xmlns:a="http://schemas.openxmlformats.org/drawingml/2006/main" noChangeAspect="1"/>
+            </wp:cNvGraphicFramePr>
+            <a:graphic xmlns:a="http://schemas.openxmlformats.org/drawingml/2006/main">
+              <a:graphicData uri="http://schemas.openxmlformats.org/drawingml/2006/picture">
+                <pic:pic xmlns:pic="http://schemas.openxmlformats.org/drawingml/2006/picture">
+                  <pic:nvPicPr>
+                    <pic:cNvPr id="540781606" name=""/>
+                    <pic:cNvPicPr/>
+                  </pic:nvPicPr>
+                  <pic:blipFill>
+                    <a:blip r:embed="rId47">
+                      <a:extLst>
+                        <a:ext uri="{28A0092B-C50C-407E-A947-70E740481C1C}">
+                          <a14:useLocalDpi xmlns:a14="http://schemas.microsoft.com/office/drawing/2010/main" val="0"/>
+                        </a:ext>
+                      </a:extLst>
+                    </a:blip>
+                    <a:stretch>
+                      <a:fillRect/>
+                    </a:stretch>
+                  </pic:blipFill>
+                  <pic:spPr>
+                    <a:xfrm>
+                      <a:off x="0" y="0"/>
+                      <a:ext cx="2032635" cy="2009775"/>
+                    </a:xfrm>
+                    <a:prstGeom prst="rect">
+                      <a:avLst/>
+                    </a:prstGeom>
+                  </pic:spPr>
+                </pic:pic>
+              </a:graphicData>
+            </a:graphic>
+            <wp14:sizeRelH relativeFrom="margin">
+              <wp14:pctWidth>0</wp14:pctWidth>
+            </wp14:sizeRelH>
+            <wp14:sizeRelV relativeFrom="margin">
+              <wp14:pctHeight>0</wp14:pctHeight>
+            </wp14:sizeRelV>
+          </wp:anchor>
+        </w:drawing>
+      </w:r>
+      <w:r>
+        <w:rPr>
+          <w:noProof/>
+        </w:rPr>
+        <w:t xml:space="preserve"> </w:t>
+      </w:r>
+    </w:p>
+    <w:p>
+      <w:pPr>
+        <w:rPr>
+          <w:b/>
+          <w:bCs/>
+          <w:sz w:val="24"/>
+          <w:szCs w:val="24"/>
+        </w:rPr>
+      </w:pPr>
+    </w:p>
+    <w:p>
+      <w:pPr>
+        <w:rPr>
+          <w:sz w:val="24"/>
+          <w:szCs w:val="24"/>
+        </w:rPr>
+      </w:pPr>
+    </w:p>
+    <w:p>
+      <w:pPr>
+        <w:rPr>
+          <w:sz w:val="24"/>
+          <w:szCs w:val="24"/>
+        </w:rPr>
+      </w:pPr>
+      <w:r>
+        <w:rPr>
+          <w:sz w:val="24"/>
+          <w:szCs w:val="24"/>
+        </w:rPr>
+        <w:t xml:space="preserve">  </w:t>
+      </w:r>
+    </w:p>
+    <w:p>
+      <w:pPr>
+        <w:rPr>
+          <w:sz w:val="24"/>
+          <w:szCs w:val="24"/>
+        </w:rPr>
+      </w:pPr>
+    </w:p>
+    <w:p>
+      <w:pPr>
+        <w:rPr>
+          <w:sz w:val="24"/>
+          <w:szCs w:val="24"/>
+        </w:rPr>
+      </w:pPr>
+    </w:p>
+    <w:p>
+      <w:pPr>
+        <w:rPr>
+          <w:sz w:val="24"/>
+          <w:szCs w:val="24"/>
+        </w:rPr>
+      </w:pPr>
+    </w:p>
+    <w:p>
+      <w:pPr>
+        <w:rPr>
+          <w:b/>
+          <w:bCs/>
+          <w:sz w:val="24"/>
+          <w:szCs w:val="24"/>
+        </w:rPr>
+      </w:pPr>
+      <w:r>
+        <w:rPr>
+          <w:sz w:val="24"/>
+          <w:szCs w:val="24"/>
+        </w:rPr>
+        <w:br/>
+      </w:r>
+      <w:r>
+        <w:rPr>
+          <w:b/>
+          <w:bCs/>
+          <w:sz w:val="24"/>
+          <w:szCs w:val="24"/>
+        </w:rPr>
+        <w:t>Why JSON.</w:t>
+      </w:r>
+      <w:r>
+        <w:rPr>
+          <w:b/>
+          <w:bCs/>
+          <w:sz w:val="24"/>
+          <w:szCs w:val="24"/>
+        </w:rPr>
+        <w:t xml:space="preserve"> </w:t>
+      </w:r>
+      <w:r>
+        <w:rPr>
+          <w:b/>
+          <w:bCs/>
+          <w:sz w:val="24"/>
+          <w:szCs w:val="24"/>
+        </w:rPr>
+        <w:t>stringify</w:t>
+      </w:r>
+      <w:r>
+        <w:rPr>
+          <w:b/>
+          <w:bCs/>
+          <w:sz w:val="24"/>
+          <w:szCs w:val="24"/>
+        </w:rPr>
+        <w:t xml:space="preserve"> </w:t>
+      </w:r>
+      <w:r>
+        <w:rPr>
+          <w:b/>
+          <w:bCs/>
+          <w:sz w:val="24"/>
+          <w:szCs w:val="24"/>
+        </w:rPr>
+        <w:t>()?</w:t>
+      </w:r>
+    </w:p>
+    <w:p>
+      <w:pPr>
+        <w:rPr>
+          <w:sz w:val="24"/>
+          <w:szCs w:val="24"/>
+        </w:rPr>
+      </w:pPr>
+      <w:r>
+        <w:rPr>
+          <w:sz w:val="24"/>
+          <w:szCs w:val="24"/>
+        </w:rPr>
+        <w:t xml:space="preserve">Local Storage can only store strings. Therefore, objects must be converted into JSON strings using </w:t>
+      </w:r>
+      <w:r>
+        <w:rPr>
+          <w:b/>
+          <w:bCs/>
+          <w:sz w:val="24"/>
+          <w:szCs w:val="24"/>
+        </w:rPr>
+        <w:t>JSON.</w:t>
+      </w:r>
+      <w:r>
+        <w:rPr>
+          <w:b/>
+          <w:bCs/>
+          <w:sz w:val="24"/>
+          <w:szCs w:val="24"/>
+        </w:rPr>
+        <w:t xml:space="preserve"> </w:t>
+      </w:r>
+      <w:r>
+        <w:rPr>
+          <w:b/>
+          <w:bCs/>
+          <w:sz w:val="24"/>
+          <w:szCs w:val="24"/>
+        </w:rPr>
+        <w:t>stringify</w:t>
+      </w:r>
+      <w:r>
+        <w:rPr>
+          <w:b/>
+          <w:bCs/>
+          <w:sz w:val="24"/>
+          <w:szCs w:val="24"/>
+        </w:rPr>
+        <w:t xml:space="preserve"> </w:t>
+      </w:r>
+      <w:r>
+        <w:rPr>
+          <w:b/>
+          <w:bCs/>
+          <w:sz w:val="24"/>
+          <w:szCs w:val="24"/>
+        </w:rPr>
+        <w:t>()</w:t>
+      </w:r>
+      <w:r>
+        <w:rPr>
+          <w:sz w:val="24"/>
+          <w:szCs w:val="24"/>
+        </w:rPr>
+        <w:t xml:space="preserve"> before storing.</w:t>
+      </w:r>
+    </w:p>
+    <w:p>
+      <w:pPr>
+        <w:rPr>
+          <w:b/>
+          <w:bCs/>
+          <w:sz w:val="24"/>
+          <w:szCs w:val="24"/>
+        </w:rPr>
+      </w:pPr>
+      <w:r>
+        <w:rPr>
+          <w:b/>
+          <w:bCs/>
+          <w:sz w:val="24"/>
+          <w:szCs w:val="24"/>
+        </w:rPr>
+        <w:t>Why JSON.</w:t>
+      </w:r>
+      <w:r>
+        <w:rPr>
+          <w:b/>
+          <w:bCs/>
+          <w:sz w:val="24"/>
+          <w:szCs w:val="24"/>
+        </w:rPr>
+        <w:t xml:space="preserve"> p</w:t>
+      </w:r>
+      <w:r>
+        <w:rPr>
+          <w:b/>
+          <w:bCs/>
+          <w:sz w:val="24"/>
+          <w:szCs w:val="24"/>
+        </w:rPr>
+        <w:t>arse</w:t>
+      </w:r>
+      <w:r>
+        <w:rPr>
+          <w:b/>
+          <w:bCs/>
+          <w:sz w:val="24"/>
+          <w:szCs w:val="24"/>
+        </w:rPr>
+        <w:t xml:space="preserve"> </w:t>
+      </w:r>
+      <w:r>
+        <w:rPr>
+          <w:b/>
+          <w:bCs/>
+          <w:sz w:val="24"/>
+          <w:szCs w:val="24"/>
+        </w:rPr>
+        <w:t>()?</w:t>
+      </w:r>
+    </w:p>
+    <w:p>
+      <w:pPr>
+        <w:rPr>
+          <w:sz w:val="24"/>
+          <w:szCs w:val="24"/>
+        </w:rPr>
+      </w:pPr>
+      <w:r>
+        <w:rPr>
+          <w:sz w:val="24"/>
+          <w:szCs w:val="24"/>
+        </w:rPr>
+        <w:t>JSON.</w:t>
+      </w:r>
+      <w:r>
+        <w:rPr>
+          <w:sz w:val="24"/>
+          <w:szCs w:val="24"/>
+        </w:rPr>
+        <w:t xml:space="preserve"> </w:t>
+      </w:r>
+      <w:r>
+        <w:rPr>
+          <w:sz w:val="24"/>
+          <w:szCs w:val="24"/>
+        </w:rPr>
+        <w:t>parse</w:t>
+      </w:r>
+      <w:r>
+        <w:rPr>
+          <w:sz w:val="24"/>
+          <w:szCs w:val="24"/>
+        </w:rPr>
+        <w:t xml:space="preserve"> </w:t>
+      </w:r>
+      <w:r>
+        <w:rPr>
+          <w:sz w:val="24"/>
+          <w:szCs w:val="24"/>
+        </w:rPr>
+        <w:t>() converts the JSON string back into a JavaScript object.</w:t>
+      </w:r>
+    </w:p>
+    <w:p>
+      <w:pPr>
+        <w:rPr>
+          <w:sz w:val="24"/>
+          <w:szCs w:val="24"/>
+        </w:rPr>
+      </w:pPr>
+      <w:r>
+        <w:rPr>
+          <w:sz w:val="24"/>
+          <w:szCs w:val="24"/>
+        </w:rPr>
+        <w:t>Web Storage provides a way to store data in the browser. Local Storage stores data permanently until it is manually removed, while Session Storage stores data only for the current browser session and clears it when the tab is closed. Both store data as key-value pairs and only support strings. To store JavaScript objects, we use JSON.</w:t>
+      </w:r>
+      <w:r>
+        <w:rPr>
+          <w:sz w:val="24"/>
+          <w:szCs w:val="24"/>
+        </w:rPr>
+        <w:t xml:space="preserve"> </w:t>
+      </w:r>
+      <w:r>
+        <w:rPr>
+          <w:sz w:val="24"/>
+          <w:szCs w:val="24"/>
+        </w:rPr>
+        <w:t>stringify</w:t>
+      </w:r>
+      <w:r>
+        <w:rPr>
+          <w:sz w:val="24"/>
+          <w:szCs w:val="24"/>
+        </w:rPr>
+        <w:t xml:space="preserve"> </w:t>
+      </w:r>
+      <w:r>
+        <w:rPr>
+          <w:sz w:val="24"/>
+          <w:szCs w:val="24"/>
+        </w:rPr>
+        <w:t>() while saving and JSON.</w:t>
+      </w:r>
+      <w:r>
+        <w:rPr>
+          <w:sz w:val="24"/>
+          <w:szCs w:val="24"/>
+        </w:rPr>
+        <w:t xml:space="preserve"> </w:t>
+      </w:r>
+      <w:r>
+        <w:rPr>
+          <w:sz w:val="24"/>
+          <w:szCs w:val="24"/>
+        </w:rPr>
+        <w:t>parse</w:t>
+      </w:r>
+      <w:r>
+        <w:rPr>
+          <w:sz w:val="24"/>
+          <w:szCs w:val="24"/>
+        </w:rPr>
+        <w:t xml:space="preserve"> </w:t>
+      </w:r>
+      <w:r>
+        <w:rPr>
+          <w:sz w:val="24"/>
+          <w:szCs w:val="24"/>
+        </w:rPr>
+        <w:t>() while retrieving. Local Storage is commonly used for user preferences, shopping carts, and theme settings, while Session Storage is used for temporary session-related data.</w:t>
+      </w:r>
+    </w:p>
+    <w:p>
+      <w:pPr>
+        <w:jc w:val="center"/>
         <w:rPr>
           <w:b/>
           <w:bCs/>
@@ -18128,32 +19753,17 @@
           <w:szCs w:val="28"/>
           <w:u w:val="single"/>
         </w:rPr>
-        <w:t xml:space="preserve"> in JavaScript</w:t>
-      </w:r>
-    </w:p>
-    <w:p>
-      <w:pPr>
-        <w:rPr>
-          <w:sz w:val="24"/>
-          <w:szCs w:val="24"/>
-        </w:rPr>
-      </w:pPr>
-    </w:p>
-    <w:p>
-      <w:pPr>
-        <w:rPr>
-          <w:sz w:val="24"/>
-          <w:szCs w:val="24"/>
-        </w:rPr>
-      </w:pPr>
-    </w:p>
-    <w:p>
-      <w:pPr>
-        <w:rPr>
-          <w:sz w:val="24"/>
-          <w:szCs w:val="24"/>
-        </w:rPr>
-      </w:pPr>
+      </w:pPr>
+      <w:r>
+        <w:rPr>
+          <w:b/>
+          <w:bCs/>
+          <w:sz w:val="28"/>
+          <w:szCs w:val="28"/>
+          <w:u w:val="single"/>
+        </w:rPr>
+        <w:t>Synchronous and Asynchronous JavaScript</w:t>
+      </w:r>
     </w:p>
     <w:p>
       <w:pPr>
@@ -18288,9 +19898,9 @@
     </w:lvl>
   </w:abstractNum>
   <w:abstractNum w:abstractNumId="1" w15:restartNumberingAfterBreak="0">
-    <w:nsid w:val="1E293DBF"/>
+    <w:nsid w:val="16A332CA"/>
     <w:multiLevelType w:val="multilevel"/>
-    <w:tmpl w:val="FB082F7C"/>
+    <w:tmpl w:val="4D68FA4C"/>
     <w:lvl w:ilvl="0">
       <w:start w:val="1"/>
       <w:numFmt w:val="bullet"/>
@@ -18437,9 +20047,9 @@
     </w:lvl>
   </w:abstractNum>
   <w:abstractNum w:abstractNumId="2" w15:restartNumberingAfterBreak="0">
-    <w:nsid w:val="28A2091C"/>
+    <w:nsid w:val="1E293DBF"/>
     <w:multiLevelType w:val="multilevel"/>
-    <w:tmpl w:val="59C40BD0"/>
+    <w:tmpl w:val="FB082F7C"/>
     <w:lvl w:ilvl="0">
       <w:start w:val="1"/>
       <w:numFmt w:val="bullet"/>
@@ -18586,6 +20196,155 @@
     </w:lvl>
   </w:abstractNum>
   <w:abstractNum w:abstractNumId="3" w15:restartNumberingAfterBreak="0">
+    <w:nsid w:val="28A2091C"/>
+    <w:multiLevelType w:val="multilevel"/>
+    <w:tmpl w:val="59C40BD0"/>
+    <w:lvl w:ilvl="0">
+      <w:start w:val="1"/>
+      <w:numFmt w:val="bullet"/>
+      <w:lvlText w:val=""/>
+      <w:lvlJc w:val="left"/>
+      <w:pPr>
+        <w:tabs>
+          <w:tab w:val="num" w:pos="720"/>
+        </w:tabs>
+        <w:ind w:left="720" w:hanging="360"/>
+      </w:pPr>
+      <w:rPr>
+        <w:rFonts w:ascii="Symbol" w:hAnsi="Symbol" w:hint="default"/>
+        <w:sz w:val="20"/>
+      </w:rPr>
+    </w:lvl>
+    <w:lvl w:ilvl="1" w:tentative="1">
+      <w:start w:val="1"/>
+      <w:numFmt w:val="bullet"/>
+      <w:lvlText w:val="o"/>
+      <w:lvlJc w:val="left"/>
+      <w:pPr>
+        <w:tabs>
+          <w:tab w:val="num" w:pos="1440"/>
+        </w:tabs>
+        <w:ind w:left="1440" w:hanging="360"/>
+      </w:pPr>
+      <w:rPr>
+        <w:rFonts w:ascii="Courier New" w:hAnsi="Courier New" w:hint="default"/>
+        <w:sz w:val="20"/>
+      </w:rPr>
+    </w:lvl>
+    <w:lvl w:ilvl="2" w:tentative="1">
+      <w:start w:val="1"/>
+      <w:numFmt w:val="bullet"/>
+      <w:lvlText w:val=""/>
+      <w:lvlJc w:val="left"/>
+      <w:pPr>
+        <w:tabs>
+          <w:tab w:val="num" w:pos="2160"/>
+        </w:tabs>
+        <w:ind w:left="2160" w:hanging="360"/>
+      </w:pPr>
+      <w:rPr>
+        <w:rFonts w:ascii="Wingdings" w:hAnsi="Wingdings" w:hint="default"/>
+        <w:sz w:val="20"/>
+      </w:rPr>
+    </w:lvl>
+    <w:lvl w:ilvl="3" w:tentative="1">
+      <w:start w:val="1"/>
+      <w:numFmt w:val="bullet"/>
+      <w:lvlText w:val=""/>
+      <w:lvlJc w:val="left"/>
+      <w:pPr>
+        <w:tabs>
+          <w:tab w:val="num" w:pos="2880"/>
+        </w:tabs>
+        <w:ind w:left="2880" w:hanging="360"/>
+      </w:pPr>
+      <w:rPr>
+        <w:rFonts w:ascii="Wingdings" w:hAnsi="Wingdings" w:hint="default"/>
+        <w:sz w:val="20"/>
+      </w:rPr>
+    </w:lvl>
+    <w:lvl w:ilvl="4" w:tentative="1">
+      <w:start w:val="1"/>
+      <w:numFmt w:val="bullet"/>
+      <w:lvlText w:val=""/>
+      <w:lvlJc w:val="left"/>
+      <w:pPr>
+        <w:tabs>
+          <w:tab w:val="num" w:pos="3600"/>
+        </w:tabs>
+        <w:ind w:left="3600" w:hanging="360"/>
+      </w:pPr>
+      <w:rPr>
+        <w:rFonts w:ascii="Wingdings" w:hAnsi="Wingdings" w:hint="default"/>
+        <w:sz w:val="20"/>
+      </w:rPr>
+    </w:lvl>
+    <w:lvl w:ilvl="5" w:tentative="1">
+      <w:start w:val="1"/>
+      <w:numFmt w:val="bullet"/>
+      <w:lvlText w:val=""/>
+      <w:lvlJc w:val="left"/>
+      <w:pPr>
+        <w:tabs>
+          <w:tab w:val="num" w:pos="4320"/>
+        </w:tabs>
+        <w:ind w:left="4320" w:hanging="360"/>
+      </w:pPr>
+      <w:rPr>
+        <w:rFonts w:ascii="Wingdings" w:hAnsi="Wingdings" w:hint="default"/>
+        <w:sz w:val="20"/>
+      </w:rPr>
+    </w:lvl>
+    <w:lvl w:ilvl="6" w:tentative="1">
+      <w:start w:val="1"/>
+      <w:numFmt w:val="bullet"/>
+      <w:lvlText w:val=""/>
+      <w:lvlJc w:val="left"/>
+      <w:pPr>
+        <w:tabs>
+          <w:tab w:val="num" w:pos="5040"/>
+        </w:tabs>
+        <w:ind w:left="5040" w:hanging="360"/>
+      </w:pPr>
+      <w:rPr>
+        <w:rFonts w:ascii="Wingdings" w:hAnsi="Wingdings" w:hint="default"/>
+        <w:sz w:val="20"/>
+      </w:rPr>
+    </w:lvl>
+    <w:lvl w:ilvl="7" w:tentative="1">
+      <w:start w:val="1"/>
+      <w:numFmt w:val="bullet"/>
+      <w:lvlText w:val=""/>
+      <w:lvlJc w:val="left"/>
+      <w:pPr>
+        <w:tabs>
+          <w:tab w:val="num" w:pos="5760"/>
+        </w:tabs>
+        <w:ind w:left="5760" w:hanging="360"/>
+      </w:pPr>
+      <w:rPr>
+        <w:rFonts w:ascii="Wingdings" w:hAnsi="Wingdings" w:hint="default"/>
+        <w:sz w:val="20"/>
+      </w:rPr>
+    </w:lvl>
+    <w:lvl w:ilvl="8" w:tentative="1">
+      <w:start w:val="1"/>
+      <w:numFmt w:val="bullet"/>
+      <w:lvlText w:val=""/>
+      <w:lvlJc w:val="left"/>
+      <w:pPr>
+        <w:tabs>
+          <w:tab w:val="num" w:pos="6480"/>
+        </w:tabs>
+        <w:ind w:left="6480" w:hanging="360"/>
+      </w:pPr>
+      <w:rPr>
+        <w:rFonts w:ascii="Wingdings" w:hAnsi="Wingdings" w:hint="default"/>
+        <w:sz w:val="20"/>
+      </w:rPr>
+    </w:lvl>
+  </w:abstractNum>
+  <w:abstractNum w:abstractNumId="4" w15:restartNumberingAfterBreak="0">
     <w:nsid w:val="2EC44B1C"/>
     <w:multiLevelType w:val="hybridMultilevel"/>
     <w:tmpl w:val="538EC676"/>
@@ -18698,7 +20457,7 @@
       </w:rPr>
     </w:lvl>
   </w:abstractNum>
-  <w:abstractNum w:abstractNumId="4" w15:restartNumberingAfterBreak="0">
+  <w:abstractNum w:abstractNumId="5" w15:restartNumberingAfterBreak="0">
     <w:nsid w:val="3C456A73"/>
     <w:multiLevelType w:val="hybridMultilevel"/>
     <w:tmpl w:val="F2264262"/>
@@ -18811,7 +20570,7 @@
       </w:rPr>
     </w:lvl>
   </w:abstractNum>
-  <w:abstractNum w:abstractNumId="5" w15:restartNumberingAfterBreak="0">
+  <w:abstractNum w:abstractNumId="6" w15:restartNumberingAfterBreak="0">
     <w:nsid w:val="3E573D70"/>
     <w:multiLevelType w:val="hybridMultilevel"/>
     <w:tmpl w:val="60FAD36A"/>
@@ -18897,7 +20656,7 @@
       </w:pPr>
     </w:lvl>
   </w:abstractNum>
-  <w:abstractNum w:abstractNumId="6" w15:restartNumberingAfterBreak="0">
+  <w:abstractNum w:abstractNumId="7" w15:restartNumberingAfterBreak="0">
     <w:nsid w:val="42F26D8F"/>
     <w:multiLevelType w:val="hybridMultilevel"/>
     <w:tmpl w:val="BD200F96"/>
@@ -19009,7 +20768,7 @@
       </w:rPr>
     </w:lvl>
   </w:abstractNum>
-  <w:abstractNum w:abstractNumId="7" w15:restartNumberingAfterBreak="0">
+  <w:abstractNum w:abstractNumId="8" w15:restartNumberingAfterBreak="0">
     <w:nsid w:val="45910445"/>
     <w:multiLevelType w:val="multilevel"/>
     <w:tmpl w:val="92AA1602"/>
@@ -19154,7 +20913,7 @@
       </w:rPr>
     </w:lvl>
   </w:abstractNum>
-  <w:abstractNum w:abstractNumId="8" w15:restartNumberingAfterBreak="0">
+  <w:abstractNum w:abstractNumId="9" w15:restartNumberingAfterBreak="0">
     <w:nsid w:val="46531F27"/>
     <w:multiLevelType w:val="multilevel"/>
     <w:tmpl w:val="B67AEB42"/>
@@ -19303,7 +21062,7 @@
       </w:rPr>
     </w:lvl>
   </w:abstractNum>
-  <w:abstractNum w:abstractNumId="9" w15:restartNumberingAfterBreak="0">
+  <w:abstractNum w:abstractNumId="10" w15:restartNumberingAfterBreak="0">
     <w:nsid w:val="49E218B7"/>
     <w:multiLevelType w:val="multilevel"/>
     <w:tmpl w:val="04D84B0E"/>
@@ -19448,7 +21207,7 @@
       </w:rPr>
     </w:lvl>
   </w:abstractNum>
-  <w:abstractNum w:abstractNumId="10" w15:restartNumberingAfterBreak="0">
+  <w:abstractNum w:abstractNumId="11" w15:restartNumberingAfterBreak="0">
     <w:nsid w:val="51B25827"/>
     <w:multiLevelType w:val="hybridMultilevel"/>
     <w:tmpl w:val="540A814C"/>
@@ -19561,7 +21320,7 @@
       </w:rPr>
     </w:lvl>
   </w:abstractNum>
-  <w:abstractNum w:abstractNumId="11" w15:restartNumberingAfterBreak="0">
+  <w:abstractNum w:abstractNumId="12" w15:restartNumberingAfterBreak="0">
     <w:nsid w:val="57663C21"/>
     <w:multiLevelType w:val="multilevel"/>
     <w:tmpl w:val="0E540BF4"/>
@@ -19710,7 +21469,123 @@
       </w:rPr>
     </w:lvl>
   </w:abstractNum>
-  <w:abstractNum w:abstractNumId="12" w15:restartNumberingAfterBreak="0">
+  <w:abstractNum w:abstractNumId="13" w15:restartNumberingAfterBreak="0">
+    <w:nsid w:val="6B963847"/>
+    <w:multiLevelType w:val="multilevel"/>
+    <w:tmpl w:val="E93EB1F0"/>
+    <w:lvl w:ilvl="0">
+      <w:start w:val="1"/>
+      <w:numFmt w:val="decimal"/>
+      <w:lvlText w:val="%1."/>
+      <w:lvlJc w:val="left"/>
+      <w:pPr>
+        <w:tabs>
+          <w:tab w:val="num" w:pos="720"/>
+        </w:tabs>
+        <w:ind w:left="720" w:hanging="360"/>
+      </w:pPr>
+      <w:rPr>
+        <w:rFonts w:asciiTheme="minorHAnsi" w:eastAsiaTheme="minorHAnsi" w:hAnsiTheme="minorHAnsi" w:cstheme="minorBidi"/>
+      </w:rPr>
+    </w:lvl>
+    <w:lvl w:ilvl="1" w:tentative="1">
+      <w:start w:val="1"/>
+      <w:numFmt w:val="decimal"/>
+      <w:lvlText w:val="%2."/>
+      <w:lvlJc w:val="left"/>
+      <w:pPr>
+        <w:tabs>
+          <w:tab w:val="num" w:pos="1440"/>
+        </w:tabs>
+        <w:ind w:left="1440" w:hanging="360"/>
+      </w:pPr>
+    </w:lvl>
+    <w:lvl w:ilvl="2" w:tentative="1">
+      <w:start w:val="1"/>
+      <w:numFmt w:val="decimal"/>
+      <w:lvlText w:val="%3."/>
+      <w:lvlJc w:val="left"/>
+      <w:pPr>
+        <w:tabs>
+          <w:tab w:val="num" w:pos="2160"/>
+        </w:tabs>
+        <w:ind w:left="2160" w:hanging="360"/>
+      </w:pPr>
+    </w:lvl>
+    <w:lvl w:ilvl="3" w:tentative="1">
+      <w:start w:val="1"/>
+      <w:numFmt w:val="decimal"/>
+      <w:lvlText w:val="%4."/>
+      <w:lvlJc w:val="left"/>
+      <w:pPr>
+        <w:tabs>
+          <w:tab w:val="num" w:pos="2880"/>
+        </w:tabs>
+        <w:ind w:left="2880" w:hanging="360"/>
+      </w:pPr>
+    </w:lvl>
+    <w:lvl w:ilvl="4" w:tentative="1">
+      <w:start w:val="1"/>
+      <w:numFmt w:val="decimal"/>
+      <w:lvlText w:val="%5."/>
+      <w:lvlJc w:val="left"/>
+      <w:pPr>
+        <w:tabs>
+          <w:tab w:val="num" w:pos="3600"/>
+        </w:tabs>
+        <w:ind w:left="3600" w:hanging="360"/>
+      </w:pPr>
+    </w:lvl>
+    <w:lvl w:ilvl="5" w:tentative="1">
+      <w:start w:val="1"/>
+      <w:numFmt w:val="decimal"/>
+      <w:lvlText w:val="%6."/>
+      <w:lvlJc w:val="left"/>
+      <w:pPr>
+        <w:tabs>
+          <w:tab w:val="num" w:pos="4320"/>
+        </w:tabs>
+        <w:ind w:left="4320" w:hanging="360"/>
+      </w:pPr>
+    </w:lvl>
+    <w:lvl w:ilvl="6" w:tentative="1">
+      <w:start w:val="1"/>
+      <w:numFmt w:val="decimal"/>
+      <w:lvlText w:val="%7."/>
+      <w:lvlJc w:val="left"/>
+      <w:pPr>
+        <w:tabs>
+          <w:tab w:val="num" w:pos="5040"/>
+        </w:tabs>
+        <w:ind w:left="5040" w:hanging="360"/>
+      </w:pPr>
+    </w:lvl>
+    <w:lvl w:ilvl="7" w:tentative="1">
+      <w:start w:val="1"/>
+      <w:numFmt w:val="decimal"/>
+      <w:lvlText w:val="%8."/>
+      <w:lvlJc w:val="left"/>
+      <w:pPr>
+        <w:tabs>
+          <w:tab w:val="num" w:pos="5760"/>
+        </w:tabs>
+        <w:ind w:left="5760" w:hanging="360"/>
+      </w:pPr>
+    </w:lvl>
+    <w:lvl w:ilvl="8" w:tentative="1">
+      <w:start w:val="1"/>
+      <w:numFmt w:val="decimal"/>
+      <w:lvlText w:val="%9."/>
+      <w:lvlJc w:val="left"/>
+      <w:pPr>
+        <w:tabs>
+          <w:tab w:val="num" w:pos="6480"/>
+        </w:tabs>
+        <w:ind w:left="6480" w:hanging="360"/>
+      </w:pPr>
+    </w:lvl>
+  </w:abstractNum>
+  <w:abstractNum w:abstractNumId="14" w15:restartNumberingAfterBreak="0">
     <w:nsid w:val="7D0916E7"/>
     <w:multiLevelType w:val="hybridMultilevel"/>
     <w:tmpl w:val="1E32C622"/>
@@ -19802,43 +21677,49 @@
     </w:lvl>
   </w:abstractNum>
   <w:num w:numId="1" w16cid:durableId="828406102">
-    <w:abstractNumId w:val="6"/>
+    <w:abstractNumId w:val="7"/>
   </w:num>
   <w:num w:numId="2" w16cid:durableId="610432742">
     <w:abstractNumId w:val="0"/>
   </w:num>
   <w:num w:numId="3" w16cid:durableId="46995798">
+    <w:abstractNumId w:val="9"/>
+  </w:num>
+  <w:num w:numId="4" w16cid:durableId="441146671">
     <w:abstractNumId w:val="8"/>
   </w:num>
-  <w:num w:numId="4" w16cid:durableId="441146671">
-    <w:abstractNumId w:val="7"/>
+  <w:num w:numId="5" w16cid:durableId="1319653045">
+    <w:abstractNumId w:val="4"/>
   </w:num>
-  <w:num w:numId="5" w16cid:durableId="1319653045">
+  <w:num w:numId="6" w16cid:durableId="1397969353">
+    <w:abstractNumId w:val="10"/>
+  </w:num>
+  <w:num w:numId="7" w16cid:durableId="1369185629">
+    <w:abstractNumId w:val="5"/>
+  </w:num>
+  <w:num w:numId="8" w16cid:durableId="2143302530">
+    <w:abstractNumId w:val="11"/>
+  </w:num>
+  <w:num w:numId="9" w16cid:durableId="1578204493">
+    <w:abstractNumId w:val="6"/>
+  </w:num>
+  <w:num w:numId="10" w16cid:durableId="1175143874">
     <w:abstractNumId w:val="3"/>
   </w:num>
-  <w:num w:numId="6" w16cid:durableId="1397969353">
-    <w:abstractNumId w:val="9"/>
-  </w:num>
-  <w:num w:numId="7" w16cid:durableId="1369185629">
-    <w:abstractNumId w:val="4"/>
-  </w:num>
-  <w:num w:numId="8" w16cid:durableId="2143302530">
-    <w:abstractNumId w:val="10"/>
-  </w:num>
-  <w:num w:numId="9" w16cid:durableId="1578204493">
-    <w:abstractNumId w:val="5"/>
-  </w:num>
-  <w:num w:numId="10" w16cid:durableId="1175143874">
+  <w:num w:numId="11" w16cid:durableId="1097821905">
     <w:abstractNumId w:val="2"/>
   </w:num>
-  <w:num w:numId="11" w16cid:durableId="1097821905">
-    <w:abstractNumId w:val="1"/>
+  <w:num w:numId="12" w16cid:durableId="746222985">
+    <w:abstractNumId w:val="14"/>
   </w:num>
-  <w:num w:numId="12" w16cid:durableId="746222985">
+  <w:num w:numId="13" w16cid:durableId="1823037376">
     <w:abstractNumId w:val="12"/>
   </w:num>
-  <w:num w:numId="13" w16cid:durableId="1823037376">
-    <w:abstractNumId w:val="11"/>
+  <w:num w:numId="14" w16cid:durableId="351078934">
+    <w:abstractNumId w:val="13"/>
+  </w:num>
+  <w:num w:numId="15" w16cid:durableId="1713184952">
+    <w:abstractNumId w:val="1"/>
   </w:num>
 </w:numbering>
 </file>

</xml_diff>